<commit_message>
Régénérer le mémoire après correction des valeurs par catégorie et du nombre de tests
Co-Authored-By: Claude Opus 5.5 <noreply@anthropic.com>
Claude-Session: https://claude.ai/code/session_01NrE4ofTo5apA1G8EiH67WD
</commit_message>
<xml_diff>
--- a/RAG/RAPPORT ET PRESENTATION/Memoire_PFE_Knowledge_Graph_LLM.docx
+++ b/RAG/RAPPORT ET PRESENTATION/Memoire_PFE_Knowledge_Graph_LLM.docx
@@ -394,7 +394,7 @@
             </w:rPr>
             <w:fldChar w:fldCharType="separate"/>
           </w:r>
-          <w:hyperlink w:anchor="__RefHeading___Toc5146_2515352571">
+          <w:hyperlink w:anchor="__RefHeading___Toc5146_863242435">
             <w:r>
               <w:rPr>
                 <w:rStyle w:val="IndexLink"/>
@@ -414,7 +414,7 @@
             </w:tabs>
             <w:rPr/>
           </w:pPr>
-          <w:hyperlink w:anchor="__RefHeading___Toc5148_2515352571">
+          <w:hyperlink w:anchor="__RefHeading___Toc5148_863242435">
             <w:r>
               <w:rPr>
                 <w:rStyle w:val="IndexLink"/>
@@ -434,7 +434,7 @@
             </w:tabs>
             <w:rPr/>
           </w:pPr>
-          <w:hyperlink w:anchor="__RefHeading___Toc5150_2515352571">
+          <w:hyperlink w:anchor="__RefHeading___Toc5150_863242435">
             <w:r>
               <w:rPr>
                 <w:rStyle w:val="IndexLink"/>
@@ -454,7 +454,7 @@
             </w:tabs>
             <w:rPr/>
           </w:pPr>
-          <w:hyperlink w:anchor="__RefHeading___Toc5152_2515352571">
+          <w:hyperlink w:anchor="__RefHeading___Toc5152_863242435">
             <w:r>
               <w:rPr>
                 <w:rStyle w:val="IndexLink"/>
@@ -474,7 +474,7 @@
             </w:tabs>
             <w:rPr/>
           </w:pPr>
-          <w:hyperlink w:anchor="__RefHeading___Toc5154_2515352571">
+          <w:hyperlink w:anchor="__RefHeading___Toc5154_863242435">
             <w:r>
               <w:rPr>
                 <w:rStyle w:val="IndexLink"/>
@@ -494,7 +494,7 @@
             </w:tabs>
             <w:rPr/>
           </w:pPr>
-          <w:hyperlink w:anchor="__RefHeading___Toc5156_2515352571">
+          <w:hyperlink w:anchor="__RefHeading___Toc5156_863242435">
             <w:r>
               <w:rPr>
                 <w:rStyle w:val="IndexLink"/>
@@ -514,7 +514,7 @@
             </w:tabs>
             <w:rPr/>
           </w:pPr>
-          <w:hyperlink w:anchor="__RefHeading___Toc5158_2515352571">
+          <w:hyperlink w:anchor="__RefHeading___Toc5158_863242435">
             <w:r>
               <w:rPr>
                 <w:rStyle w:val="IndexLink"/>
@@ -534,7 +534,7 @@
             </w:tabs>
             <w:rPr/>
           </w:pPr>
-          <w:hyperlink w:anchor="__RefHeading___Toc5160_2515352571">
+          <w:hyperlink w:anchor="__RefHeading___Toc5160_863242435">
             <w:r>
               <w:rPr>
                 <w:rStyle w:val="IndexLink"/>
@@ -554,7 +554,7 @@
             </w:tabs>
             <w:rPr/>
           </w:pPr>
-          <w:hyperlink w:anchor="__RefHeading___Toc5162_2515352571">
+          <w:hyperlink w:anchor="__RefHeading___Toc5162_863242435">
             <w:r>
               <w:rPr>
                 <w:rStyle w:val="IndexLink"/>
@@ -574,7 +574,7 @@
             </w:tabs>
             <w:rPr/>
           </w:pPr>
-          <w:hyperlink w:anchor="__RefHeading___Toc5164_2515352571">
+          <w:hyperlink w:anchor="__RefHeading___Toc5164_863242435">
             <w:r>
               <w:rPr>
                 <w:rStyle w:val="IndexLink"/>
@@ -594,7 +594,7 @@
             </w:tabs>
             <w:rPr/>
           </w:pPr>
-          <w:hyperlink w:anchor="__RefHeading___Toc5166_2515352571">
+          <w:hyperlink w:anchor="__RefHeading___Toc5166_863242435">
             <w:r>
               <w:rPr>
                 <w:rStyle w:val="IndexLink"/>
@@ -614,7 +614,7 @@
             </w:tabs>
             <w:rPr/>
           </w:pPr>
-          <w:hyperlink w:anchor="__RefHeading___Toc5168_2515352571">
+          <w:hyperlink w:anchor="__RefHeading___Toc5168_863242435">
             <w:r>
               <w:rPr>
                 <w:rStyle w:val="IndexLink"/>
@@ -634,7 +634,7 @@
             </w:tabs>
             <w:rPr/>
           </w:pPr>
-          <w:hyperlink w:anchor="__RefHeading___Toc5170_2515352571">
+          <w:hyperlink w:anchor="__RefHeading___Toc5170_863242435">
             <w:r>
               <w:rPr>
                 <w:rStyle w:val="IndexLink"/>
@@ -654,7 +654,7 @@
             </w:tabs>
             <w:rPr/>
           </w:pPr>
-          <w:hyperlink w:anchor="__RefHeading___Toc5172_2515352571">
+          <w:hyperlink w:anchor="__RefHeading___Toc5172_863242435">
             <w:r>
               <w:rPr>
                 <w:rStyle w:val="IndexLink"/>
@@ -674,7 +674,7 @@
             </w:tabs>
             <w:rPr/>
           </w:pPr>
-          <w:hyperlink w:anchor="__RefHeading___Toc5174_2515352571">
+          <w:hyperlink w:anchor="__RefHeading___Toc5174_863242435">
             <w:r>
               <w:rPr>
                 <w:rStyle w:val="IndexLink"/>
@@ -694,7 +694,7 @@
             </w:tabs>
             <w:rPr/>
           </w:pPr>
-          <w:hyperlink w:anchor="__RefHeading___Toc5176_2515352571">
+          <w:hyperlink w:anchor="__RefHeading___Toc5176_863242435">
             <w:r>
               <w:rPr>
                 <w:rStyle w:val="IndexLink"/>
@@ -714,7 +714,7 @@
             </w:tabs>
             <w:rPr/>
           </w:pPr>
-          <w:hyperlink w:anchor="__RefHeading___Toc5178_2515352571">
+          <w:hyperlink w:anchor="__RefHeading___Toc5178_863242435">
             <w:r>
               <w:rPr>
                 <w:rStyle w:val="IndexLink"/>
@@ -734,7 +734,7 @@
             </w:tabs>
             <w:rPr/>
           </w:pPr>
-          <w:hyperlink w:anchor="__RefHeading___Toc5180_2515352571">
+          <w:hyperlink w:anchor="__RefHeading___Toc5180_863242435">
             <w:r>
               <w:rPr>
                 <w:rStyle w:val="IndexLink"/>
@@ -754,7 +754,7 @@
             </w:tabs>
             <w:rPr/>
           </w:pPr>
-          <w:hyperlink w:anchor="__RefHeading___Toc5182_2515352571">
+          <w:hyperlink w:anchor="__RefHeading___Toc5182_863242435">
             <w:r>
               <w:rPr>
                 <w:rStyle w:val="IndexLink"/>
@@ -774,7 +774,7 @@
             </w:tabs>
             <w:rPr/>
           </w:pPr>
-          <w:hyperlink w:anchor="__RefHeading___Toc5184_2515352571">
+          <w:hyperlink w:anchor="__RefHeading___Toc5184_863242435">
             <w:r>
               <w:rPr>
                 <w:rStyle w:val="IndexLink"/>
@@ -794,7 +794,7 @@
             </w:tabs>
             <w:rPr/>
           </w:pPr>
-          <w:hyperlink w:anchor="__RefHeading___Toc5186_2515352571">
+          <w:hyperlink w:anchor="__RefHeading___Toc5186_863242435">
             <w:r>
               <w:rPr>
                 <w:rStyle w:val="IndexLink"/>
@@ -814,7 +814,7 @@
             </w:tabs>
             <w:rPr/>
           </w:pPr>
-          <w:hyperlink w:anchor="__RefHeading___Toc5188_2515352571">
+          <w:hyperlink w:anchor="__RefHeading___Toc5188_863242435">
             <w:r>
               <w:rPr>
                 <w:rStyle w:val="IndexLink"/>
@@ -834,7 +834,7 @@
             </w:tabs>
             <w:rPr/>
           </w:pPr>
-          <w:hyperlink w:anchor="__RefHeading___Toc5190_2515352571">
+          <w:hyperlink w:anchor="__RefHeading___Toc5190_863242435">
             <w:r>
               <w:rPr>
                 <w:rStyle w:val="IndexLink"/>
@@ -854,7 +854,7 @@
             </w:tabs>
             <w:rPr/>
           </w:pPr>
-          <w:hyperlink w:anchor="__RefHeading___Toc5192_2515352571">
+          <w:hyperlink w:anchor="__RefHeading___Toc5192_863242435">
             <w:r>
               <w:rPr>
                 <w:rStyle w:val="IndexLink"/>
@@ -874,7 +874,7 @@
             </w:tabs>
             <w:rPr/>
           </w:pPr>
-          <w:hyperlink w:anchor="__RefHeading___Toc5194_2515352571">
+          <w:hyperlink w:anchor="__RefHeading___Toc5194_863242435">
             <w:r>
               <w:rPr>
                 <w:rStyle w:val="IndexLink"/>
@@ -894,7 +894,7 @@
             </w:tabs>
             <w:rPr/>
           </w:pPr>
-          <w:hyperlink w:anchor="__RefHeading___Toc5196_2515352571">
+          <w:hyperlink w:anchor="__RefHeading___Toc5196_863242435">
             <w:r>
               <w:rPr>
                 <w:rStyle w:val="IndexLink"/>
@@ -914,7 +914,7 @@
             </w:tabs>
             <w:rPr/>
           </w:pPr>
-          <w:hyperlink w:anchor="__RefHeading___Toc5198_2515352571">
+          <w:hyperlink w:anchor="__RefHeading___Toc5198_863242435">
             <w:r>
               <w:rPr>
                 <w:rStyle w:val="IndexLink"/>
@@ -934,7 +934,7 @@
             </w:tabs>
             <w:rPr/>
           </w:pPr>
-          <w:hyperlink w:anchor="__RefHeading___Toc5200_2515352571">
+          <w:hyperlink w:anchor="__RefHeading___Toc5200_863242435">
             <w:r>
               <w:rPr>
                 <w:rStyle w:val="IndexLink"/>
@@ -954,7 +954,7 @@
             </w:tabs>
             <w:rPr/>
           </w:pPr>
-          <w:hyperlink w:anchor="__RefHeading___Toc5202_2515352571">
+          <w:hyperlink w:anchor="__RefHeading___Toc5202_863242435">
             <w:r>
               <w:rPr>
                 <w:rStyle w:val="IndexLink"/>
@@ -974,7 +974,7 @@
             </w:tabs>
             <w:rPr/>
           </w:pPr>
-          <w:hyperlink w:anchor="__RefHeading___Toc5204_2515352571">
+          <w:hyperlink w:anchor="__RefHeading___Toc5204_863242435">
             <w:r>
               <w:rPr>
                 <w:rStyle w:val="IndexLink"/>
@@ -994,7 +994,7 @@
             </w:tabs>
             <w:rPr/>
           </w:pPr>
-          <w:hyperlink w:anchor="__RefHeading___Toc5206_2515352571">
+          <w:hyperlink w:anchor="__RefHeading___Toc5206_863242435">
             <w:r>
               <w:rPr>
                 <w:rStyle w:val="IndexLink"/>
@@ -1014,7 +1014,7 @@
             </w:tabs>
             <w:rPr/>
           </w:pPr>
-          <w:hyperlink w:anchor="__RefHeading___Toc5208_2515352571">
+          <w:hyperlink w:anchor="__RefHeading___Toc5208_863242435">
             <w:r>
               <w:rPr>
                 <w:rStyle w:val="IndexLink"/>
@@ -1034,7 +1034,7 @@
             </w:tabs>
             <w:rPr/>
           </w:pPr>
-          <w:hyperlink w:anchor="__RefHeading___Toc5210_2515352571">
+          <w:hyperlink w:anchor="__RefHeading___Toc5210_863242435">
             <w:r>
               <w:rPr>
                 <w:rStyle w:val="IndexLink"/>
@@ -1054,7 +1054,7 @@
             </w:tabs>
             <w:rPr/>
           </w:pPr>
-          <w:hyperlink w:anchor="__RefHeading___Toc5212_2515352571">
+          <w:hyperlink w:anchor="__RefHeading___Toc5212_863242435">
             <w:r>
               <w:rPr>
                 <w:rStyle w:val="IndexLink"/>
@@ -1074,7 +1074,7 @@
             </w:tabs>
             <w:rPr/>
           </w:pPr>
-          <w:hyperlink w:anchor="__RefHeading___Toc5214_2515352571">
+          <w:hyperlink w:anchor="__RefHeading___Toc5214_863242435">
             <w:r>
               <w:rPr>
                 <w:rStyle w:val="IndexLink"/>
@@ -1094,7 +1094,7 @@
             </w:tabs>
             <w:rPr/>
           </w:pPr>
-          <w:hyperlink w:anchor="__RefHeading___Toc5216_2515352571">
+          <w:hyperlink w:anchor="__RefHeading___Toc5216_863242435">
             <w:r>
               <w:rPr>
                 <w:rStyle w:val="IndexLink"/>
@@ -1114,7 +1114,7 @@
             </w:tabs>
             <w:rPr/>
           </w:pPr>
-          <w:hyperlink w:anchor="__RefHeading___Toc5218_2515352571">
+          <w:hyperlink w:anchor="__RefHeading___Toc5218_863242435">
             <w:r>
               <w:rPr>
                 <w:rStyle w:val="IndexLink"/>
@@ -1134,7 +1134,7 @@
             </w:tabs>
             <w:rPr/>
           </w:pPr>
-          <w:hyperlink w:anchor="__RefHeading___Toc5220_2515352571">
+          <w:hyperlink w:anchor="__RefHeading___Toc5220_863242435">
             <w:r>
               <w:rPr>
                 <w:rStyle w:val="IndexLink"/>
@@ -1154,7 +1154,7 @@
             </w:tabs>
             <w:rPr/>
           </w:pPr>
-          <w:hyperlink w:anchor="__RefHeading___Toc5222_2515352571">
+          <w:hyperlink w:anchor="__RefHeading___Toc5222_863242435">
             <w:r>
               <w:rPr>
                 <w:rStyle w:val="IndexLink"/>
@@ -1174,7 +1174,7 @@
             </w:tabs>
             <w:rPr/>
           </w:pPr>
-          <w:hyperlink w:anchor="__RefHeading___Toc5224_2515352571">
+          <w:hyperlink w:anchor="__RefHeading___Toc5224_863242435">
             <w:r>
               <w:rPr>
                 <w:rStyle w:val="IndexLink"/>
@@ -1194,7 +1194,7 @@
             </w:tabs>
             <w:rPr/>
           </w:pPr>
-          <w:hyperlink w:anchor="__RefHeading___Toc5226_2515352571">
+          <w:hyperlink w:anchor="__RefHeading___Toc5226_863242435">
             <w:r>
               <w:rPr>
                 <w:rStyle w:val="IndexLink"/>
@@ -1214,7 +1214,7 @@
             </w:tabs>
             <w:rPr/>
           </w:pPr>
-          <w:hyperlink w:anchor="__RefHeading___Toc5228_2515352571">
+          <w:hyperlink w:anchor="__RefHeading___Toc5228_863242435">
             <w:r>
               <w:rPr>
                 <w:rStyle w:val="IndexLink"/>
@@ -1234,7 +1234,7 @@
             </w:tabs>
             <w:rPr/>
           </w:pPr>
-          <w:hyperlink w:anchor="__RefHeading___Toc5230_2515352571">
+          <w:hyperlink w:anchor="__RefHeading___Toc5230_863242435">
             <w:r>
               <w:rPr>
                 <w:rStyle w:val="IndexLink"/>
@@ -1254,7 +1254,7 @@
             </w:tabs>
             <w:rPr/>
           </w:pPr>
-          <w:hyperlink w:anchor="__RefHeading___Toc5232_2515352571">
+          <w:hyperlink w:anchor="__RefHeading___Toc5232_863242435">
             <w:r>
               <w:rPr>
                 <w:rStyle w:val="IndexLink"/>
@@ -1274,7 +1274,7 @@
             </w:tabs>
             <w:rPr/>
           </w:pPr>
-          <w:hyperlink w:anchor="__RefHeading___Toc5234_2515352571">
+          <w:hyperlink w:anchor="__RefHeading___Toc5234_863242435">
             <w:r>
               <w:rPr>
                 <w:rStyle w:val="IndexLink"/>
@@ -1294,7 +1294,7 @@
             </w:tabs>
             <w:rPr/>
           </w:pPr>
-          <w:hyperlink w:anchor="__RefHeading___Toc5236_2515352571">
+          <w:hyperlink w:anchor="__RefHeading___Toc5236_863242435">
             <w:r>
               <w:rPr>
                 <w:rStyle w:val="IndexLink"/>
@@ -1314,7 +1314,7 @@
             </w:tabs>
             <w:rPr/>
           </w:pPr>
-          <w:hyperlink w:anchor="__RefHeading___Toc5238_2515352571">
+          <w:hyperlink w:anchor="__RefHeading___Toc5238_863242435">
             <w:r>
               <w:rPr>
                 <w:rStyle w:val="IndexLink"/>
@@ -1334,7 +1334,7 @@
             </w:tabs>
             <w:rPr/>
           </w:pPr>
-          <w:hyperlink w:anchor="__RefHeading___Toc5240_2515352571">
+          <w:hyperlink w:anchor="__RefHeading___Toc5240_863242435">
             <w:r>
               <w:rPr>
                 <w:rStyle w:val="IndexLink"/>
@@ -1354,7 +1354,7 @@
             </w:tabs>
             <w:rPr/>
           </w:pPr>
-          <w:hyperlink w:anchor="__RefHeading___Toc5242_2515352571">
+          <w:hyperlink w:anchor="__RefHeading___Toc5242_863242435">
             <w:r>
               <w:rPr>
                 <w:rStyle w:val="IndexLink"/>
@@ -1374,7 +1374,7 @@
             </w:tabs>
             <w:rPr/>
           </w:pPr>
-          <w:hyperlink w:anchor="__RefHeading___Toc5244_2515352571">
+          <w:hyperlink w:anchor="__RefHeading___Toc5244_863242435">
             <w:r>
               <w:rPr>
                 <w:rStyle w:val="IndexLink"/>
@@ -1394,7 +1394,7 @@
             </w:tabs>
             <w:rPr/>
           </w:pPr>
-          <w:hyperlink w:anchor="__RefHeading___Toc5246_2515352571">
+          <w:hyperlink w:anchor="__RefHeading___Toc5246_863242435">
             <w:r>
               <w:rPr>
                 <w:rStyle w:val="IndexLink"/>
@@ -1414,7 +1414,7 @@
             </w:tabs>
             <w:rPr/>
           </w:pPr>
-          <w:hyperlink w:anchor="__RefHeading___Toc5248_2515352571">
+          <w:hyperlink w:anchor="__RefHeading___Toc5248_863242435">
             <w:r>
               <w:rPr>
                 <w:rStyle w:val="IndexLink"/>
@@ -1434,7 +1434,7 @@
             </w:tabs>
             <w:rPr/>
           </w:pPr>
-          <w:hyperlink w:anchor="__RefHeading___Toc5250_2515352571">
+          <w:hyperlink w:anchor="__RefHeading___Toc5250_863242435">
             <w:r>
               <w:rPr>
                 <w:rStyle w:val="IndexLink"/>
@@ -1454,7 +1454,7 @@
             </w:tabs>
             <w:rPr/>
           </w:pPr>
-          <w:hyperlink w:anchor="__RefHeading___Toc5252_2515352571">
+          <w:hyperlink w:anchor="__RefHeading___Toc5252_863242435">
             <w:r>
               <w:rPr>
                 <w:rStyle w:val="IndexLink"/>
@@ -1474,7 +1474,7 @@
             </w:tabs>
             <w:rPr/>
           </w:pPr>
-          <w:hyperlink w:anchor="__RefHeading___Toc5254_2515352571">
+          <w:hyperlink w:anchor="__RefHeading___Toc5254_863242435">
             <w:r>
               <w:rPr>
                 <w:rStyle w:val="IndexLink"/>
@@ -1494,7 +1494,7 @@
             </w:tabs>
             <w:rPr/>
           </w:pPr>
-          <w:hyperlink w:anchor="__RefHeading___Toc5256_2515352571">
+          <w:hyperlink w:anchor="__RefHeading___Toc5256_863242435">
             <w:r>
               <w:rPr>
                 <w:rStyle w:val="IndexLink"/>
@@ -1514,7 +1514,7 @@
             </w:tabs>
             <w:rPr/>
           </w:pPr>
-          <w:hyperlink w:anchor="__RefHeading___Toc5258_2515352571">
+          <w:hyperlink w:anchor="__RefHeading___Toc5258_863242435">
             <w:r>
               <w:rPr>
                 <w:rStyle w:val="IndexLink"/>
@@ -1534,7 +1534,7 @@
             </w:tabs>
             <w:rPr/>
           </w:pPr>
-          <w:hyperlink w:anchor="__RefHeading___Toc5260_2515352571">
+          <w:hyperlink w:anchor="__RefHeading___Toc5260_863242435">
             <w:r>
               <w:rPr>
                 <w:rStyle w:val="IndexLink"/>
@@ -1554,7 +1554,7 @@
             </w:tabs>
             <w:rPr/>
           </w:pPr>
-          <w:hyperlink w:anchor="__RefHeading___Toc5262_2515352571">
+          <w:hyperlink w:anchor="__RefHeading___Toc5262_863242435">
             <w:r>
               <w:rPr>
                 <w:rStyle w:val="IndexLink"/>
@@ -1574,7 +1574,7 @@
             </w:tabs>
             <w:rPr/>
           </w:pPr>
-          <w:hyperlink w:anchor="__RefHeading___Toc5264_2515352571">
+          <w:hyperlink w:anchor="__RefHeading___Toc5264_863242435">
             <w:r>
               <w:rPr>
                 <w:rStyle w:val="IndexLink"/>
@@ -1594,7 +1594,7 @@
             </w:tabs>
             <w:rPr/>
           </w:pPr>
-          <w:hyperlink w:anchor="__RefHeading___Toc5266_2515352571">
+          <w:hyperlink w:anchor="__RefHeading___Toc5266_863242435">
             <w:r>
               <w:rPr>
                 <w:rStyle w:val="IndexLink"/>
@@ -1614,7 +1614,7 @@
             </w:tabs>
             <w:rPr/>
           </w:pPr>
-          <w:hyperlink w:anchor="__RefHeading___Toc5268_2515352571">
+          <w:hyperlink w:anchor="__RefHeading___Toc5268_863242435">
             <w:r>
               <w:rPr>
                 <w:rStyle w:val="IndexLink"/>
@@ -1634,7 +1634,7 @@
             </w:tabs>
             <w:rPr/>
           </w:pPr>
-          <w:hyperlink w:anchor="__RefHeading___Toc5270_2515352571">
+          <w:hyperlink w:anchor="__RefHeading___Toc5270_863242435">
             <w:r>
               <w:rPr>
                 <w:rStyle w:val="IndexLink"/>
@@ -1654,7 +1654,7 @@
             </w:tabs>
             <w:rPr/>
           </w:pPr>
-          <w:hyperlink w:anchor="__RefHeading___Toc5272_2515352571">
+          <w:hyperlink w:anchor="__RefHeading___Toc5272_863242435">
             <w:r>
               <w:rPr>
                 <w:rStyle w:val="IndexLink"/>
@@ -1674,7 +1674,7 @@
             </w:tabs>
             <w:rPr/>
           </w:pPr>
-          <w:hyperlink w:anchor="__RefHeading___Toc5274_2515352571">
+          <w:hyperlink w:anchor="__RefHeading___Toc5274_863242435">
             <w:r>
               <w:rPr>
                 <w:rStyle w:val="IndexLink"/>
@@ -1694,7 +1694,7 @@
             </w:tabs>
             <w:rPr/>
           </w:pPr>
-          <w:hyperlink w:anchor="__RefHeading___Toc5276_2515352571">
+          <w:hyperlink w:anchor="__RefHeading___Toc5276_863242435">
             <w:r>
               <w:rPr>
                 <w:rStyle w:val="IndexLink"/>
@@ -1714,7 +1714,7 @@
             </w:tabs>
             <w:rPr/>
           </w:pPr>
-          <w:hyperlink w:anchor="__RefHeading___Toc5278_2515352571">
+          <w:hyperlink w:anchor="__RefHeading___Toc5278_863242435">
             <w:r>
               <w:rPr>
                 <w:rStyle w:val="IndexLink"/>
@@ -1734,7 +1734,7 @@
             </w:tabs>
             <w:rPr/>
           </w:pPr>
-          <w:hyperlink w:anchor="__RefHeading___Toc5280_2515352571">
+          <w:hyperlink w:anchor="__RefHeading___Toc5280_863242435">
             <w:r>
               <w:rPr>
                 <w:rStyle w:val="IndexLink"/>
@@ -1754,7 +1754,7 @@
             </w:tabs>
             <w:rPr/>
           </w:pPr>
-          <w:hyperlink w:anchor="__RefHeading___Toc5282_2515352571">
+          <w:hyperlink w:anchor="__RefHeading___Toc5282_863242435">
             <w:r>
               <w:rPr>
                 <w:rStyle w:val="IndexLink"/>
@@ -1774,7 +1774,7 @@
             </w:tabs>
             <w:rPr/>
           </w:pPr>
-          <w:hyperlink w:anchor="__RefHeading___Toc5284_2515352571">
+          <w:hyperlink w:anchor="__RefHeading___Toc5284_863242435">
             <w:r>
               <w:rPr>
                 <w:rStyle w:val="IndexLink"/>
@@ -1794,7 +1794,7 @@
             </w:tabs>
             <w:rPr/>
           </w:pPr>
-          <w:hyperlink w:anchor="__RefHeading___Toc5286_2515352571">
+          <w:hyperlink w:anchor="__RefHeading___Toc5286_863242435">
             <w:r>
               <w:rPr>
                 <w:rStyle w:val="IndexLink"/>
@@ -1814,7 +1814,7 @@
             </w:tabs>
             <w:rPr/>
           </w:pPr>
-          <w:hyperlink w:anchor="__RefHeading___Toc5288_2515352571">
+          <w:hyperlink w:anchor="__RefHeading___Toc5288_863242435">
             <w:r>
               <w:rPr>
                 <w:rStyle w:val="IndexLink"/>
@@ -1834,7 +1834,7 @@
             </w:tabs>
             <w:rPr/>
           </w:pPr>
-          <w:hyperlink w:anchor="__RefHeading___Toc5290_2515352571">
+          <w:hyperlink w:anchor="__RefHeading___Toc5290_863242435">
             <w:r>
               <w:rPr>
                 <w:rStyle w:val="IndexLink"/>
@@ -1854,7 +1854,7 @@
             </w:tabs>
             <w:rPr/>
           </w:pPr>
-          <w:hyperlink w:anchor="__RefHeading___Toc5292_2515352571">
+          <w:hyperlink w:anchor="__RefHeading___Toc5292_863242435">
             <w:r>
               <w:rPr>
                 <w:rStyle w:val="IndexLink"/>
@@ -1874,7 +1874,7 @@
             </w:tabs>
             <w:rPr/>
           </w:pPr>
-          <w:hyperlink w:anchor="__RefHeading___Toc5294_2515352571">
+          <w:hyperlink w:anchor="__RefHeading___Toc5294_863242435">
             <w:r>
               <w:rPr>
                 <w:rStyle w:val="IndexLink"/>
@@ -1894,7 +1894,7 @@
             </w:tabs>
             <w:rPr/>
           </w:pPr>
-          <w:hyperlink w:anchor="__RefHeading___Toc5296_2515352571">
+          <w:hyperlink w:anchor="__RefHeading___Toc5296_863242435">
             <w:r>
               <w:rPr>
                 <w:rStyle w:val="IndexLink"/>
@@ -1914,7 +1914,7 @@
             </w:tabs>
             <w:rPr/>
           </w:pPr>
-          <w:hyperlink w:anchor="__RefHeading___Toc5298_2515352571">
+          <w:hyperlink w:anchor="__RefHeading___Toc5298_863242435">
             <w:r>
               <w:rPr>
                 <w:rStyle w:val="IndexLink"/>
@@ -1934,7 +1934,7 @@
             </w:tabs>
             <w:rPr/>
           </w:pPr>
-          <w:hyperlink w:anchor="__RefHeading___Toc5300_2515352571">
+          <w:hyperlink w:anchor="__RefHeading___Toc5300_863242435">
             <w:r>
               <w:rPr>
                 <w:rStyle w:val="IndexLink"/>
@@ -1954,7 +1954,7 @@
             </w:tabs>
             <w:rPr/>
           </w:pPr>
-          <w:hyperlink w:anchor="__RefHeading___Toc5302_2515352571">
+          <w:hyperlink w:anchor="__RefHeading___Toc5302_863242435">
             <w:r>
               <w:rPr>
                 <w:rStyle w:val="IndexLink"/>
@@ -1974,7 +1974,7 @@
             </w:tabs>
             <w:rPr/>
           </w:pPr>
-          <w:hyperlink w:anchor="__RefHeading___Toc5304_2515352571">
+          <w:hyperlink w:anchor="__RefHeading___Toc5304_863242435">
             <w:r>
               <w:rPr>
                 <w:rStyle w:val="IndexLink"/>
@@ -1994,7 +1994,7 @@
             </w:tabs>
             <w:rPr/>
           </w:pPr>
-          <w:hyperlink w:anchor="__RefHeading___Toc5306_2515352571">
+          <w:hyperlink w:anchor="__RefHeading___Toc5306_863242435">
             <w:r>
               <w:rPr>
                 <w:rStyle w:val="IndexLink"/>
@@ -2014,7 +2014,7 @@
             </w:tabs>
             <w:rPr/>
           </w:pPr>
-          <w:hyperlink w:anchor="__RefHeading___Toc5308_2515352571">
+          <w:hyperlink w:anchor="__RefHeading___Toc5308_863242435">
             <w:r>
               <w:rPr>
                 <w:rStyle w:val="IndexLink"/>
@@ -2034,7 +2034,7 @@
             </w:tabs>
             <w:rPr/>
           </w:pPr>
-          <w:hyperlink w:anchor="__RefHeading___Toc5310_2515352571">
+          <w:hyperlink w:anchor="__RefHeading___Toc5310_863242435">
             <w:r>
               <w:rPr>
                 <w:rStyle w:val="IndexLink"/>
@@ -2054,7 +2054,7 @@
             </w:tabs>
             <w:rPr/>
           </w:pPr>
-          <w:hyperlink w:anchor="__RefHeading___Toc5312_2515352571">
+          <w:hyperlink w:anchor="__RefHeading___Toc5312_863242435">
             <w:r>
               <w:rPr>
                 <w:rStyle w:val="IndexLink"/>
@@ -2074,7 +2074,7 @@
             </w:tabs>
             <w:rPr/>
           </w:pPr>
-          <w:hyperlink w:anchor="__RefHeading___Toc5314_2515352571">
+          <w:hyperlink w:anchor="__RefHeading___Toc5314_863242435">
             <w:r>
               <w:rPr>
                 <w:rStyle w:val="IndexLink"/>
@@ -2094,7 +2094,7 @@
             </w:tabs>
             <w:rPr/>
           </w:pPr>
-          <w:hyperlink w:anchor="__RefHeading___Toc5316_2515352571">
+          <w:hyperlink w:anchor="__RefHeading___Toc5316_863242435">
             <w:r>
               <w:rPr>
                 <w:rStyle w:val="IndexLink"/>
@@ -2114,7 +2114,7 @@
             </w:tabs>
             <w:rPr/>
           </w:pPr>
-          <w:hyperlink w:anchor="__RefHeading___Toc5318_2515352571">
+          <w:hyperlink w:anchor="__RefHeading___Toc5318_863242435">
             <w:r>
               <w:rPr>
                 <w:rStyle w:val="IndexLink"/>
@@ -2134,7 +2134,7 @@
             </w:tabs>
             <w:rPr/>
           </w:pPr>
-          <w:hyperlink w:anchor="__RefHeading___Toc5320_2515352571">
+          <w:hyperlink w:anchor="__RefHeading___Toc5320_863242435">
             <w:r>
               <w:rPr>
                 <w:rStyle w:val="IndexLink"/>
@@ -2154,7 +2154,7 @@
             </w:tabs>
             <w:rPr/>
           </w:pPr>
-          <w:hyperlink w:anchor="__RefHeading___Toc5322_2515352571">
+          <w:hyperlink w:anchor="__RefHeading___Toc5322_863242435">
             <w:r>
               <w:rPr>
                 <w:rStyle w:val="IndexLink"/>
@@ -2174,7 +2174,7 @@
             </w:tabs>
             <w:rPr/>
           </w:pPr>
-          <w:hyperlink w:anchor="__RefHeading___Toc5324_2515352571">
+          <w:hyperlink w:anchor="__RefHeading___Toc5324_863242435">
             <w:r>
               <w:rPr>
                 <w:rStyle w:val="IndexLink"/>
@@ -2194,7 +2194,7 @@
             </w:tabs>
             <w:rPr/>
           </w:pPr>
-          <w:hyperlink w:anchor="__RefHeading___Toc5326_2515352571">
+          <w:hyperlink w:anchor="__RefHeading___Toc5326_863242435">
             <w:r>
               <w:rPr>
                 <w:rStyle w:val="IndexLink"/>
@@ -2214,7 +2214,7 @@
             </w:tabs>
             <w:rPr/>
           </w:pPr>
-          <w:hyperlink w:anchor="__RefHeading___Toc5328_2515352571">
+          <w:hyperlink w:anchor="__RefHeading___Toc5328_863242435">
             <w:r>
               <w:rPr>
                 <w:rStyle w:val="IndexLink"/>
@@ -2234,7 +2234,7 @@
             </w:tabs>
             <w:rPr/>
           </w:pPr>
-          <w:hyperlink w:anchor="__RefHeading___Toc5330_2515352571">
+          <w:hyperlink w:anchor="__RefHeading___Toc5330_863242435">
             <w:r>
               <w:rPr>
                 <w:rStyle w:val="IndexLink"/>
@@ -2254,7 +2254,7 @@
             </w:tabs>
             <w:rPr/>
           </w:pPr>
-          <w:hyperlink w:anchor="__RefHeading___Toc5332_2515352571">
+          <w:hyperlink w:anchor="__RefHeading___Toc5332_863242435">
             <w:r>
               <w:rPr>
                 <w:rStyle w:val="IndexLink"/>
@@ -2274,7 +2274,7 @@
             </w:tabs>
             <w:rPr/>
           </w:pPr>
-          <w:hyperlink w:anchor="__RefHeading___Toc5334_2515352571">
+          <w:hyperlink w:anchor="__RefHeading___Toc5334_863242435">
             <w:r>
               <w:rPr>
                 <w:rStyle w:val="IndexLink"/>
@@ -2294,7 +2294,7 @@
             </w:tabs>
             <w:rPr/>
           </w:pPr>
-          <w:hyperlink w:anchor="__RefHeading___Toc5336_2515352571">
+          <w:hyperlink w:anchor="__RefHeading___Toc5336_863242435">
             <w:r>
               <w:rPr>
                 <w:rStyle w:val="IndexLink"/>
@@ -2314,7 +2314,7 @@
             </w:tabs>
             <w:rPr/>
           </w:pPr>
-          <w:hyperlink w:anchor="__RefHeading___Toc5338_2515352571">
+          <w:hyperlink w:anchor="__RefHeading___Toc5338_863242435">
             <w:r>
               <w:rPr>
                 <w:rStyle w:val="IndexLink"/>
@@ -2334,7 +2334,7 @@
             </w:tabs>
             <w:rPr/>
           </w:pPr>
-          <w:hyperlink w:anchor="__RefHeading___Toc5340_2515352571">
+          <w:hyperlink w:anchor="__RefHeading___Toc5340_863242435">
             <w:r>
               <w:rPr>
                 <w:rStyle w:val="IndexLink"/>
@@ -2354,7 +2354,7 @@
             </w:tabs>
             <w:rPr/>
           </w:pPr>
-          <w:hyperlink w:anchor="__RefHeading___Toc5342_2515352571">
+          <w:hyperlink w:anchor="__RefHeading___Toc5342_863242435">
             <w:r>
               <w:rPr>
                 <w:rStyle w:val="IndexLink"/>
@@ -2374,7 +2374,7 @@
             </w:tabs>
             <w:rPr/>
           </w:pPr>
-          <w:hyperlink w:anchor="__RefHeading___Toc5344_2515352571">
+          <w:hyperlink w:anchor="__RefHeading___Toc5344_863242435">
             <w:r>
               <w:rPr>
                 <w:rStyle w:val="IndexLink"/>
@@ -2394,7 +2394,7 @@
             </w:tabs>
             <w:rPr/>
           </w:pPr>
-          <w:hyperlink w:anchor="__RefHeading___Toc5346_2515352571">
+          <w:hyperlink w:anchor="__RefHeading___Toc5346_863242435">
             <w:r>
               <w:rPr>
                 <w:rStyle w:val="IndexLink"/>
@@ -2414,7 +2414,7 @@
             </w:tabs>
             <w:rPr/>
           </w:pPr>
-          <w:hyperlink w:anchor="__RefHeading___Toc5348_2515352571">
+          <w:hyperlink w:anchor="__RefHeading___Toc5348_863242435">
             <w:r>
               <w:rPr>
                 <w:rStyle w:val="IndexLink"/>
@@ -2434,7 +2434,7 @@
             </w:tabs>
             <w:rPr/>
           </w:pPr>
-          <w:hyperlink w:anchor="__RefHeading___Toc5350_2515352571">
+          <w:hyperlink w:anchor="__RefHeading___Toc5350_863242435">
             <w:r>
               <w:rPr>
                 <w:rStyle w:val="IndexLink"/>
@@ -2454,7 +2454,7 @@
             </w:tabs>
             <w:rPr/>
           </w:pPr>
-          <w:hyperlink w:anchor="__RefHeading___Toc5352_2515352571">
+          <w:hyperlink w:anchor="__RefHeading___Toc5352_863242435">
             <w:r>
               <w:rPr>
                 <w:rStyle w:val="IndexLink"/>
@@ -2474,7 +2474,7 @@
             </w:tabs>
             <w:rPr/>
           </w:pPr>
-          <w:hyperlink w:anchor="__RefHeading___Toc5354_2515352571">
+          <w:hyperlink w:anchor="__RefHeading___Toc5354_863242435">
             <w:r>
               <w:rPr>
                 <w:rStyle w:val="IndexLink"/>
@@ -2494,7 +2494,7 @@
             </w:tabs>
             <w:rPr/>
           </w:pPr>
-          <w:hyperlink w:anchor="__RefHeading___Toc5356_2515352571">
+          <w:hyperlink w:anchor="__RefHeading___Toc5356_863242435">
             <w:r>
               <w:rPr>
                 <w:rStyle w:val="IndexLink"/>
@@ -2514,7 +2514,7 @@
             </w:tabs>
             <w:rPr/>
           </w:pPr>
-          <w:hyperlink w:anchor="__RefHeading___Toc5358_2515352571">
+          <w:hyperlink w:anchor="__RefHeading___Toc5358_863242435">
             <w:r>
               <w:rPr>
                 <w:rStyle w:val="IndexLink"/>
@@ -2534,7 +2534,7 @@
             </w:tabs>
             <w:rPr/>
           </w:pPr>
-          <w:hyperlink w:anchor="__RefHeading___Toc5360_2515352571">
+          <w:hyperlink w:anchor="__RefHeading___Toc5360_863242435">
             <w:r>
               <w:rPr>
                 <w:rStyle w:val="IndexLink"/>
@@ -2554,7 +2554,7 @@
             </w:tabs>
             <w:rPr/>
           </w:pPr>
-          <w:hyperlink w:anchor="__RefHeading___Toc5362_2515352571">
+          <w:hyperlink w:anchor="__RefHeading___Toc5362_863242435">
             <w:r>
               <w:rPr>
                 <w:rStyle w:val="IndexLink"/>
@@ -2574,7 +2574,7 @@
             </w:tabs>
             <w:rPr/>
           </w:pPr>
-          <w:hyperlink w:anchor="__RefHeading___Toc5364_2515352571">
+          <w:hyperlink w:anchor="__RefHeading___Toc5364_863242435">
             <w:r>
               <w:rPr>
                 <w:rStyle w:val="IndexLink"/>
@@ -2594,7 +2594,7 @@
             </w:tabs>
             <w:rPr/>
           </w:pPr>
-          <w:hyperlink w:anchor="__RefHeading___Toc5366_2515352571">
+          <w:hyperlink w:anchor="__RefHeading___Toc5366_863242435">
             <w:r>
               <w:rPr>
                 <w:rStyle w:val="IndexLink"/>
@@ -2614,7 +2614,7 @@
             </w:tabs>
             <w:rPr/>
           </w:pPr>
-          <w:hyperlink w:anchor="__RefHeading___Toc5368_2515352571">
+          <w:hyperlink w:anchor="__RefHeading___Toc5368_863242435">
             <w:r>
               <w:rPr>
                 <w:rStyle w:val="IndexLink"/>
@@ -2634,7 +2634,7 @@
             </w:tabs>
             <w:rPr/>
           </w:pPr>
-          <w:hyperlink w:anchor="__RefHeading___Toc5370_2515352571">
+          <w:hyperlink w:anchor="__RefHeading___Toc5370_863242435">
             <w:r>
               <w:rPr>
                 <w:rStyle w:val="IndexLink"/>
@@ -2654,7 +2654,7 @@
             </w:tabs>
             <w:rPr/>
           </w:pPr>
-          <w:hyperlink w:anchor="__RefHeading___Toc5372_2515352571">
+          <w:hyperlink w:anchor="__RefHeading___Toc5372_863242435">
             <w:r>
               <w:rPr>
                 <w:rStyle w:val="IndexLink"/>
@@ -2674,7 +2674,7 @@
             </w:tabs>
             <w:rPr/>
           </w:pPr>
-          <w:hyperlink w:anchor="__RefHeading___Toc5374_2515352571">
+          <w:hyperlink w:anchor="__RefHeading___Toc5374_863242435">
             <w:r>
               <w:rPr>
                 <w:rStyle w:val="IndexLink"/>
@@ -2694,7 +2694,7 @@
             </w:tabs>
             <w:rPr/>
           </w:pPr>
-          <w:hyperlink w:anchor="__RefHeading___Toc5376_2515352571">
+          <w:hyperlink w:anchor="__RefHeading___Toc5376_863242435">
             <w:r>
               <w:rPr>
                 <w:rStyle w:val="IndexLink"/>
@@ -2714,7 +2714,7 @@
             </w:tabs>
             <w:rPr/>
           </w:pPr>
-          <w:hyperlink w:anchor="__RefHeading___Toc5378_2515352571">
+          <w:hyperlink w:anchor="__RefHeading___Toc5378_863242435">
             <w:r>
               <w:rPr>
                 <w:rStyle w:val="IndexLink"/>
@@ -2734,7 +2734,7 @@
             </w:tabs>
             <w:rPr/>
           </w:pPr>
-          <w:hyperlink w:anchor="__RefHeading___Toc5380_2515352571">
+          <w:hyperlink w:anchor="__RefHeading___Toc5380_863242435">
             <w:r>
               <w:rPr>
                 <w:rStyle w:val="IndexLink"/>
@@ -2754,7 +2754,7 @@
             </w:tabs>
             <w:rPr/>
           </w:pPr>
-          <w:hyperlink w:anchor="__RefHeading___Toc5382_2515352571">
+          <w:hyperlink w:anchor="__RefHeading___Toc5382_863242435">
             <w:r>
               <w:rPr>
                 <w:rStyle w:val="IndexLink"/>
@@ -2774,7 +2774,7 @@
             </w:tabs>
             <w:rPr/>
           </w:pPr>
-          <w:hyperlink w:anchor="__RefHeading___Toc5384_2515352571">
+          <w:hyperlink w:anchor="__RefHeading___Toc5384_863242435">
             <w:r>
               <w:rPr>
                 <w:rStyle w:val="IndexLink"/>
@@ -2794,7 +2794,7 @@
             </w:tabs>
             <w:rPr/>
           </w:pPr>
-          <w:hyperlink w:anchor="__RefHeading___Toc5386_2515352571">
+          <w:hyperlink w:anchor="__RefHeading___Toc5386_863242435">
             <w:r>
               <w:rPr>
                 <w:rStyle w:val="IndexLink"/>
@@ -2814,7 +2814,7 @@
             </w:tabs>
             <w:rPr/>
           </w:pPr>
-          <w:hyperlink w:anchor="__RefHeading___Toc5388_2515352571">
+          <w:hyperlink w:anchor="__RefHeading___Toc5388_863242435">
             <w:r>
               <w:rPr>
                 <w:rStyle w:val="IndexLink"/>
@@ -2834,7 +2834,7 @@
             </w:tabs>
             <w:rPr/>
           </w:pPr>
-          <w:hyperlink w:anchor="__RefHeading___Toc5390_2515352571">
+          <w:hyperlink w:anchor="__RefHeading___Toc5390_863242435">
             <w:r>
               <w:rPr>
                 <w:rStyle w:val="IndexLink"/>
@@ -2854,7 +2854,7 @@
             </w:tabs>
             <w:rPr/>
           </w:pPr>
-          <w:hyperlink w:anchor="__RefHeading___Toc5392_2515352571">
+          <w:hyperlink w:anchor="__RefHeading___Toc5392_863242435">
             <w:r>
               <w:rPr>
                 <w:rStyle w:val="IndexLink"/>
@@ -2874,7 +2874,7 @@
             </w:tabs>
             <w:rPr/>
           </w:pPr>
-          <w:hyperlink w:anchor="__RefHeading___Toc5394_2515352571">
+          <w:hyperlink w:anchor="__RefHeading___Toc5394_863242435">
             <w:r>
               <w:rPr>
                 <w:rStyle w:val="IndexLink"/>
@@ -2894,7 +2894,7 @@
             </w:tabs>
             <w:rPr/>
           </w:pPr>
-          <w:hyperlink w:anchor="__RefHeading___Toc5396_2515352571">
+          <w:hyperlink w:anchor="__RefHeading___Toc5396_863242435">
             <w:r>
               <w:rPr>
                 <w:rStyle w:val="IndexLink"/>
@@ -2914,7 +2914,7 @@
             </w:tabs>
             <w:rPr/>
           </w:pPr>
-          <w:hyperlink w:anchor="__RefHeading___Toc5398_2515352571">
+          <w:hyperlink w:anchor="__RefHeading___Toc5398_863242435">
             <w:r>
               <w:rPr>
                 <w:rStyle w:val="IndexLink"/>
@@ -2934,7 +2934,7 @@
             </w:tabs>
             <w:rPr/>
           </w:pPr>
-          <w:hyperlink w:anchor="__RefHeading___Toc5400_2515352571">
+          <w:hyperlink w:anchor="__RefHeading___Toc5400_863242435">
             <w:r>
               <w:rPr>
                 <w:rStyle w:val="IndexLink"/>
@@ -2954,7 +2954,7 @@
             </w:tabs>
             <w:rPr/>
           </w:pPr>
-          <w:hyperlink w:anchor="__RefHeading___Toc5402_2515352571">
+          <w:hyperlink w:anchor="__RefHeading___Toc5402_863242435">
             <w:r>
               <w:rPr>
                 <w:rStyle w:val="IndexLink"/>
@@ -2974,7 +2974,7 @@
             </w:tabs>
             <w:rPr/>
           </w:pPr>
-          <w:hyperlink w:anchor="__RefHeading___Toc5404_2515352571">
+          <w:hyperlink w:anchor="__RefHeading___Toc5404_863242435">
             <w:r>
               <w:rPr>
                 <w:rStyle w:val="IndexLink"/>
@@ -2994,7 +2994,7 @@
             </w:tabs>
             <w:rPr/>
           </w:pPr>
-          <w:hyperlink w:anchor="__RefHeading___Toc5406_2515352571">
+          <w:hyperlink w:anchor="__RefHeading___Toc5406_863242435">
             <w:r>
               <w:rPr>
                 <w:rStyle w:val="IndexLink"/>
@@ -3014,7 +3014,7 @@
             </w:tabs>
             <w:rPr/>
           </w:pPr>
-          <w:hyperlink w:anchor="__RefHeading___Toc5408_2515352571">
+          <w:hyperlink w:anchor="__RefHeading___Toc5408_863242435">
             <w:r>
               <w:rPr>
                 <w:rStyle w:val="IndexLink"/>
@@ -3034,7 +3034,7 @@
             </w:tabs>
             <w:rPr/>
           </w:pPr>
-          <w:hyperlink w:anchor="__RefHeading___Toc5410_2515352571">
+          <w:hyperlink w:anchor="__RefHeading___Toc5410_863242435">
             <w:r>
               <w:rPr>
                 <w:rStyle w:val="IndexLink"/>
@@ -3054,7 +3054,7 @@
             </w:tabs>
             <w:rPr/>
           </w:pPr>
-          <w:hyperlink w:anchor="__RefHeading___Toc5412_2515352571">
+          <w:hyperlink w:anchor="__RefHeading___Toc5412_863242435">
             <w:r>
               <w:rPr>
                 <w:rStyle w:val="IndexLink"/>
@@ -3074,7 +3074,7 @@
             </w:tabs>
             <w:rPr/>
           </w:pPr>
-          <w:hyperlink w:anchor="__RefHeading___Toc5414_2515352571">
+          <w:hyperlink w:anchor="__RefHeading___Toc5414_863242435">
             <w:r>
               <w:rPr>
                 <w:rStyle w:val="IndexLink"/>
@@ -3094,7 +3094,7 @@
             </w:tabs>
             <w:rPr/>
           </w:pPr>
-          <w:hyperlink w:anchor="__RefHeading___Toc5416_2515352571">
+          <w:hyperlink w:anchor="__RefHeading___Toc5416_863242435">
             <w:r>
               <w:rPr>
                 <w:rStyle w:val="IndexLink"/>
@@ -3114,7 +3114,7 @@
             </w:tabs>
             <w:rPr/>
           </w:pPr>
-          <w:hyperlink w:anchor="__RefHeading___Toc5418_2515352571">
+          <w:hyperlink w:anchor="__RefHeading___Toc5418_863242435">
             <w:r>
               <w:rPr>
                 <w:rStyle w:val="IndexLink"/>
@@ -3134,7 +3134,7 @@
             </w:tabs>
             <w:rPr/>
           </w:pPr>
-          <w:hyperlink w:anchor="__RefHeading___Toc5420_2515352571">
+          <w:hyperlink w:anchor="__RefHeading___Toc5420_863242435">
             <w:r>
               <w:rPr>
                 <w:rStyle w:val="IndexLink"/>
@@ -3154,7 +3154,7 @@
             </w:tabs>
             <w:rPr/>
           </w:pPr>
-          <w:hyperlink w:anchor="__RefHeading___Toc5422_2515352571">
+          <w:hyperlink w:anchor="__RefHeading___Toc5422_863242435">
             <w:r>
               <w:rPr>
                 <w:rStyle w:val="IndexLink"/>
@@ -3174,7 +3174,7 @@
             </w:tabs>
             <w:rPr/>
           </w:pPr>
-          <w:hyperlink w:anchor="__RefHeading___Toc5424_2515352571">
+          <w:hyperlink w:anchor="__RefHeading___Toc5424_863242435">
             <w:r>
               <w:rPr>
                 <w:rStyle w:val="IndexLink"/>
@@ -3194,7 +3194,7 @@
             </w:tabs>
             <w:rPr/>
           </w:pPr>
-          <w:hyperlink w:anchor="__RefHeading___Toc5426_2515352571">
+          <w:hyperlink w:anchor="__RefHeading___Toc5426_863242435">
             <w:r>
               <w:rPr>
                 <w:rStyle w:val="IndexLink"/>
@@ -3214,7 +3214,7 @@
             </w:tabs>
             <w:rPr/>
           </w:pPr>
-          <w:hyperlink w:anchor="__RefHeading___Toc5428_2515352571">
+          <w:hyperlink w:anchor="__RefHeading___Toc5428_863242435">
             <w:r>
               <w:rPr>
                 <w:rStyle w:val="IndexLink"/>
@@ -3234,7 +3234,7 @@
             </w:tabs>
             <w:rPr/>
           </w:pPr>
-          <w:hyperlink w:anchor="__RefHeading___Toc5430_2515352571">
+          <w:hyperlink w:anchor="__RefHeading___Toc5430_863242435">
             <w:r>
               <w:rPr>
                 <w:rStyle w:val="IndexLink"/>
@@ -3254,7 +3254,7 @@
             </w:tabs>
             <w:rPr/>
           </w:pPr>
-          <w:hyperlink w:anchor="__RefHeading___Toc5432_2515352571">
+          <w:hyperlink w:anchor="__RefHeading___Toc5432_863242435">
             <w:r>
               <w:rPr>
                 <w:rStyle w:val="IndexLink"/>
@@ -3274,7 +3274,7 @@
             </w:tabs>
             <w:rPr/>
           </w:pPr>
-          <w:hyperlink w:anchor="__RefHeading___Toc5434_2515352571">
+          <w:hyperlink w:anchor="__RefHeading___Toc5434_863242435">
             <w:r>
               <w:rPr>
                 <w:rStyle w:val="IndexLink"/>
@@ -3294,7 +3294,7 @@
             </w:tabs>
             <w:rPr/>
           </w:pPr>
-          <w:hyperlink w:anchor="__RefHeading___Toc5436_2515352571">
+          <w:hyperlink w:anchor="__RefHeading___Toc5436_863242435">
             <w:r>
               <w:rPr>
                 <w:rStyle w:val="IndexLink"/>
@@ -3314,7 +3314,7 @@
             </w:tabs>
             <w:rPr/>
           </w:pPr>
-          <w:hyperlink w:anchor="__RefHeading___Toc5438_2515352571">
+          <w:hyperlink w:anchor="__RefHeading___Toc5438_863242435">
             <w:r>
               <w:rPr>
                 <w:rStyle w:val="IndexLink"/>
@@ -3334,7 +3334,7 @@
             </w:tabs>
             <w:rPr/>
           </w:pPr>
-          <w:hyperlink w:anchor="__RefHeading___Toc5440_2515352571">
+          <w:hyperlink w:anchor="__RefHeading___Toc5440_863242435">
             <w:r>
               <w:rPr>
                 <w:rStyle w:val="IndexLink"/>
@@ -3354,7 +3354,7 @@
             </w:tabs>
             <w:rPr/>
           </w:pPr>
-          <w:hyperlink w:anchor="__RefHeading___Toc5442_2515352571">
+          <w:hyperlink w:anchor="__RefHeading___Toc5442_863242435">
             <w:r>
               <w:rPr>
                 <w:rStyle w:val="IndexLink"/>
@@ -3374,7 +3374,7 @@
             </w:tabs>
             <w:rPr/>
           </w:pPr>
-          <w:hyperlink w:anchor="__RefHeading___Toc5444_2515352571">
+          <w:hyperlink w:anchor="__RefHeading___Toc5444_863242435">
             <w:r>
               <w:rPr>
                 <w:rStyle w:val="IndexLink"/>
@@ -3394,7 +3394,7 @@
             </w:tabs>
             <w:rPr/>
           </w:pPr>
-          <w:hyperlink w:anchor="__RefHeading___Toc5446_2515352571">
+          <w:hyperlink w:anchor="__RefHeading___Toc5446_863242435">
             <w:r>
               <w:rPr>
                 <w:rStyle w:val="IndexLink"/>
@@ -3414,7 +3414,7 @@
             </w:tabs>
             <w:rPr/>
           </w:pPr>
-          <w:hyperlink w:anchor="__RefHeading___Toc5448_2515352571">
+          <w:hyperlink w:anchor="__RefHeading___Toc5448_863242435">
             <w:r>
               <w:rPr>
                 <w:rStyle w:val="IndexLink"/>
@@ -3434,7 +3434,7 @@
             </w:tabs>
             <w:rPr/>
           </w:pPr>
-          <w:hyperlink w:anchor="__RefHeading___Toc5450_2515352571">
+          <w:hyperlink w:anchor="__RefHeading___Toc5450_863242435">
             <w:r>
               <w:rPr>
                 <w:rStyle w:val="IndexLink"/>
@@ -3454,7 +3454,7 @@
             </w:tabs>
             <w:rPr/>
           </w:pPr>
-          <w:hyperlink w:anchor="__RefHeading___Toc5452_2515352571">
+          <w:hyperlink w:anchor="__RefHeading___Toc5452_863242435">
             <w:r>
               <w:rPr>
                 <w:rStyle w:val="IndexLink"/>
@@ -3474,7 +3474,7 @@
             </w:tabs>
             <w:rPr/>
           </w:pPr>
-          <w:hyperlink w:anchor="__RefHeading___Toc5454_2515352571">
+          <w:hyperlink w:anchor="__RefHeading___Toc5454_863242435">
             <w:r>
               <w:rPr>
                 <w:rStyle w:val="IndexLink"/>
@@ -6918,7 +6918,7 @@
         <w:pStyle w:val="Heading1"/>
         <w:rPr/>
       </w:pPr>
-      <w:bookmarkStart w:id="0" w:name="__RefHeading___Toc5146_2515352571"/>
+      <w:bookmarkStart w:id="0" w:name="__RefHeading___Toc5146_863242435"/>
       <w:bookmarkEnd w:id="0"/>
       <w:r>
         <w:rPr/>
@@ -6930,7 +6930,7 @@
         <w:pStyle w:val="Heading2"/>
         <w:rPr/>
       </w:pPr>
-      <w:bookmarkStart w:id="1" w:name="__RefHeading___Toc5148_2515352571"/>
+      <w:bookmarkStart w:id="1" w:name="__RefHeading___Toc5148_863242435"/>
       <w:bookmarkEnd w:id="1"/>
       <w:r>
         <w:rPr/>
@@ -6983,7 +6983,7 @@
         <w:pStyle w:val="Heading2"/>
         <w:rPr/>
       </w:pPr>
-      <w:bookmarkStart w:id="2" w:name="__RefHeading___Toc5150_2515352571"/>
+      <w:bookmarkStart w:id="2" w:name="__RefHeading___Toc5150_863242435"/>
       <w:bookmarkEnd w:id="2"/>
       <w:r>
         <w:rPr/>
@@ -7022,7 +7022,7 @@
         <w:pStyle w:val="Heading2"/>
         <w:rPr/>
       </w:pPr>
-      <w:bookmarkStart w:id="3" w:name="__RefHeading___Toc5152_2515352571"/>
+      <w:bookmarkStart w:id="3" w:name="__RefHeading___Toc5152_863242435"/>
       <w:bookmarkEnd w:id="3"/>
       <w:r>
         <w:rPr/>
@@ -7128,7 +7128,7 @@
         <w:pStyle w:val="Heading2"/>
         <w:rPr/>
       </w:pPr>
-      <w:bookmarkStart w:id="4" w:name="__RefHeading___Toc5154_2515352571"/>
+      <w:bookmarkStart w:id="4" w:name="__RefHeading___Toc5154_863242435"/>
       <w:bookmarkEnd w:id="4"/>
       <w:r>
         <w:rPr/>
@@ -7586,7 +7586,7 @@
         <w:pStyle w:val="Heading2"/>
         <w:rPr/>
       </w:pPr>
-      <w:bookmarkStart w:id="5" w:name="__RefHeading___Toc5156_2515352571"/>
+      <w:bookmarkStart w:id="5" w:name="__RefHeading___Toc5156_863242435"/>
       <w:bookmarkEnd w:id="5"/>
       <w:r>
         <w:rPr/>
@@ -7624,7 +7624,7 @@
       </w:pPr>
       <w:r>
         <w:rPr/>
-        <w:t>une plateforme fonctionnelle, conteneurisée et testée (98 fonctions de test, intégration continue), dont l'architecture place le contrôle d'accès et la provenance au cœur du modèle de données ;</w:t>
+        <w:t>une plateforme fonctionnelle, conteneurisée et testée (99 fonctions de test, intégration continue), dont l'architecture place le contrôle d'accès et la provenance au cœur du modèle de données ;</w:t>
       </w:r>
     </w:p>
     <w:p>
@@ -7684,7 +7684,7 @@
         <w:pStyle w:val="Heading2"/>
         <w:rPr/>
       </w:pPr>
-      <w:bookmarkStart w:id="6" w:name="__RefHeading___Toc5158_2515352571"/>
+      <w:bookmarkStart w:id="6" w:name="__RefHeading___Toc5158_863242435"/>
       <w:bookmarkEnd w:id="6"/>
       <w:r>
         <w:rPr/>
@@ -7709,7 +7709,7 @@
         <w:pStyle w:val="Heading1"/>
         <w:rPr/>
       </w:pPr>
-      <w:bookmarkStart w:id="7" w:name="__RefHeading___Toc5160_2515352571"/>
+      <w:bookmarkStart w:id="7" w:name="__RefHeading___Toc5160_863242435"/>
       <w:bookmarkEnd w:id="7"/>
       <w:r>
         <w:rPr/>
@@ -7731,7 +7731,7 @@
         <w:pStyle w:val="Heading2"/>
         <w:rPr/>
       </w:pPr>
-      <w:bookmarkStart w:id="8" w:name="__RefHeading___Toc5162_2515352571"/>
+      <w:bookmarkStart w:id="8" w:name="__RefHeading___Toc5162_863242435"/>
       <w:bookmarkEnd w:id="8"/>
       <w:r>
         <w:rPr/>
@@ -7743,7 +7743,7 @@
         <w:pStyle w:val="Heading3"/>
         <w:rPr/>
       </w:pPr>
-      <w:bookmarkStart w:id="9" w:name="__RefHeading___Toc5164_2515352571"/>
+      <w:bookmarkStart w:id="9" w:name="__RefHeading___Toc5164_863242435"/>
       <w:bookmarkEnd w:id="9"/>
       <w:r>
         <w:rPr/>
@@ -7775,7 +7775,7 @@
         <w:pStyle w:val="Heading3"/>
         <w:rPr/>
       </w:pPr>
-      <w:bookmarkStart w:id="10" w:name="__RefHeading___Toc5166_2515352571"/>
+      <w:bookmarkStart w:id="10" w:name="__RefHeading___Toc5166_863242435"/>
       <w:bookmarkEnd w:id="10"/>
       <w:r>
         <w:rPr/>
@@ -7860,7 +7860,7 @@
         <w:pStyle w:val="Heading2"/>
         <w:rPr/>
       </w:pPr>
-      <w:bookmarkStart w:id="11" w:name="__RefHeading___Toc5168_2515352571"/>
+      <w:bookmarkStart w:id="11" w:name="__RefHeading___Toc5168_863242435"/>
       <w:bookmarkEnd w:id="11"/>
       <w:r>
         <w:rPr/>
@@ -7984,7 +7984,7 @@
         <w:pStyle w:val="Heading2"/>
         <w:rPr/>
       </w:pPr>
-      <w:bookmarkStart w:id="12" w:name="__RefHeading___Toc5170_2515352571"/>
+      <w:bookmarkStart w:id="12" w:name="__RefHeading___Toc5170_863242435"/>
       <w:bookmarkEnd w:id="12"/>
       <w:r>
         <w:rPr/>
@@ -8624,7 +8624,7 @@
         <w:pStyle w:val="Heading2"/>
         <w:rPr/>
       </w:pPr>
-      <w:bookmarkStart w:id="13" w:name="__RefHeading___Toc5172_2515352571"/>
+      <w:bookmarkStart w:id="13" w:name="__RefHeading___Toc5172_863242435"/>
       <w:bookmarkEnd w:id="13"/>
       <w:r>
         <w:rPr/>
@@ -8636,7 +8636,7 @@
         <w:pStyle w:val="Heading3"/>
         <w:rPr/>
       </w:pPr>
-      <w:bookmarkStart w:id="14" w:name="__RefHeading___Toc5174_2515352571"/>
+      <w:bookmarkStart w:id="14" w:name="__RefHeading___Toc5174_863242435"/>
       <w:bookmarkEnd w:id="14"/>
       <w:r>
         <w:rPr/>
@@ -8658,7 +8658,7 @@
         <w:pStyle w:val="Heading3"/>
         <w:rPr/>
       </w:pPr>
-      <w:bookmarkStart w:id="15" w:name="__RefHeading___Toc5176_2515352571"/>
+      <w:bookmarkStart w:id="15" w:name="__RefHeading___Toc5176_863242435"/>
       <w:bookmarkEnd w:id="15"/>
       <w:r>
         <w:rPr/>
@@ -9238,7 +9238,7 @@
         <w:pStyle w:val="Heading2"/>
         <w:rPr/>
       </w:pPr>
-      <w:bookmarkStart w:id="16" w:name="__RefHeading___Toc5178_2515352571"/>
+      <w:bookmarkStart w:id="16" w:name="__RefHeading___Toc5178_863242435"/>
       <w:bookmarkEnd w:id="16"/>
       <w:r>
         <w:rPr/>
@@ -9250,7 +9250,7 @@
         <w:pStyle w:val="Heading3"/>
         <w:rPr/>
       </w:pPr>
-      <w:bookmarkStart w:id="17" w:name="__RefHeading___Toc5180_2515352571"/>
+      <w:bookmarkStart w:id="17" w:name="__RefHeading___Toc5180_863242435"/>
       <w:bookmarkEnd w:id="17"/>
       <w:r>
         <w:rPr/>
@@ -10064,7 +10064,7 @@
         <w:pStyle w:val="Heading3"/>
         <w:rPr/>
       </w:pPr>
-      <w:bookmarkStart w:id="18" w:name="__RefHeading___Toc5182_2515352571"/>
+      <w:bookmarkStart w:id="18" w:name="__RefHeading___Toc5182_863242435"/>
       <w:bookmarkEnd w:id="18"/>
       <w:r>
         <w:rPr/>
@@ -10756,7 +10756,7 @@
         <w:pStyle w:val="Heading2"/>
         <w:rPr/>
       </w:pPr>
-      <w:bookmarkStart w:id="19" w:name="__RefHeading___Toc5184_2515352571"/>
+      <w:bookmarkStart w:id="19" w:name="__RefHeading___Toc5184_863242435"/>
       <w:bookmarkEnd w:id="19"/>
       <w:r>
         <w:rPr/>
@@ -10829,7 +10829,7 @@
         <w:pStyle w:val="Heading2"/>
         <w:rPr/>
       </w:pPr>
-      <w:bookmarkStart w:id="20" w:name="__RefHeading___Toc5186_2515352571"/>
+      <w:bookmarkStart w:id="20" w:name="__RefHeading___Toc5186_863242435"/>
       <w:bookmarkEnd w:id="20"/>
       <w:r>
         <w:rPr/>
@@ -11637,7 +11637,7 @@
         <w:pStyle w:val="Heading2"/>
         <w:rPr/>
       </w:pPr>
-      <w:bookmarkStart w:id="21" w:name="__RefHeading___Toc5188_2515352571"/>
+      <w:bookmarkStart w:id="21" w:name="__RefHeading___Toc5188_863242435"/>
       <w:bookmarkEnd w:id="21"/>
       <w:r>
         <w:rPr/>
@@ -11672,7 +11672,7 @@
         <w:pStyle w:val="Heading1"/>
         <w:rPr/>
       </w:pPr>
-      <w:bookmarkStart w:id="22" w:name="__RefHeading___Toc5190_2515352571"/>
+      <w:bookmarkStart w:id="22" w:name="__RefHeading___Toc5190_863242435"/>
       <w:bookmarkEnd w:id="22"/>
       <w:r>
         <w:rPr/>
@@ -11694,7 +11694,7 @@
         <w:pStyle w:val="Heading2"/>
         <w:rPr/>
       </w:pPr>
-      <w:bookmarkStart w:id="23" w:name="__RefHeading___Toc5192_2515352571"/>
+      <w:bookmarkStart w:id="23" w:name="__RefHeading___Toc5192_863242435"/>
       <w:bookmarkEnd w:id="23"/>
       <w:r>
         <w:rPr/>
@@ -11801,7 +11801,7 @@
         <w:pStyle w:val="Heading2"/>
         <w:rPr/>
       </w:pPr>
-      <w:bookmarkStart w:id="24" w:name="__RefHeading___Toc5194_2515352571"/>
+      <w:bookmarkStart w:id="24" w:name="__RefHeading___Toc5194_863242435"/>
       <w:bookmarkEnd w:id="24"/>
       <w:r>
         <w:rPr/>
@@ -11833,7 +11833,7 @@
         <w:pStyle w:val="Heading2"/>
         <w:rPr/>
       </w:pPr>
-      <w:bookmarkStart w:id="25" w:name="__RefHeading___Toc5196_2515352571"/>
+      <w:bookmarkStart w:id="25" w:name="__RefHeading___Toc5196_863242435"/>
       <w:bookmarkEnd w:id="25"/>
       <w:r>
         <w:rPr/>
@@ -11876,7 +11876,7 @@
         <w:pStyle w:val="Heading2"/>
         <w:rPr/>
       </w:pPr>
-      <w:bookmarkStart w:id="26" w:name="__RefHeading___Toc5198_2515352571"/>
+      <w:bookmarkStart w:id="26" w:name="__RefHeading___Toc5198_863242435"/>
       <w:bookmarkEnd w:id="26"/>
       <w:r>
         <w:rPr/>
@@ -11888,7 +11888,7 @@
         <w:pStyle w:val="Heading3"/>
         <w:rPr/>
       </w:pPr>
-      <w:bookmarkStart w:id="27" w:name="__RefHeading___Toc5200_2515352571"/>
+      <w:bookmarkStart w:id="27" w:name="__RefHeading___Toc5200_863242435"/>
       <w:bookmarkEnd w:id="27"/>
       <w:r>
         <w:rPr/>
@@ -11930,7 +11930,7 @@
         <w:pStyle w:val="Heading3"/>
         <w:rPr/>
       </w:pPr>
-      <w:bookmarkStart w:id="28" w:name="__RefHeading___Toc5202_2515352571"/>
+      <w:bookmarkStart w:id="28" w:name="__RefHeading___Toc5202_863242435"/>
       <w:bookmarkEnd w:id="28"/>
       <w:r>
         <w:rPr/>
@@ -11973,7 +11973,7 @@
         <w:pStyle w:val="Heading3"/>
         <w:rPr/>
       </w:pPr>
-      <w:bookmarkStart w:id="29" w:name="__RefHeading___Toc5204_2515352571"/>
+      <w:bookmarkStart w:id="29" w:name="__RefHeading___Toc5204_863242435"/>
       <w:bookmarkEnd w:id="29"/>
       <w:r>
         <w:rPr/>
@@ -11995,7 +11995,7 @@
         <w:pStyle w:val="Heading2"/>
         <w:rPr/>
       </w:pPr>
-      <w:bookmarkStart w:id="30" w:name="__RefHeading___Toc5206_2515352571"/>
+      <w:bookmarkStart w:id="30" w:name="__RefHeading___Toc5206_863242435"/>
       <w:bookmarkEnd w:id="30"/>
       <w:r>
         <w:rPr/>
@@ -12099,7 +12099,7 @@
         <w:pStyle w:val="Heading2"/>
         <w:rPr/>
       </w:pPr>
-      <w:bookmarkStart w:id="31" w:name="__RefHeading___Toc5208_2515352571"/>
+      <w:bookmarkStart w:id="31" w:name="__RefHeading___Toc5208_863242435"/>
       <w:bookmarkEnd w:id="31"/>
       <w:r>
         <w:rPr/>
@@ -12131,7 +12131,7 @@
         <w:pStyle w:val="Heading2"/>
         <w:rPr/>
       </w:pPr>
-      <w:bookmarkStart w:id="32" w:name="__RefHeading___Toc5210_2515352571"/>
+      <w:bookmarkStart w:id="32" w:name="__RefHeading___Toc5210_863242435"/>
       <w:bookmarkEnd w:id="32"/>
       <w:r>
         <w:rPr/>
@@ -12173,7 +12173,7 @@
         <w:pStyle w:val="Heading2"/>
         <w:rPr/>
       </w:pPr>
-      <w:bookmarkStart w:id="33" w:name="__RefHeading___Toc5212_2515352571"/>
+      <w:bookmarkStart w:id="33" w:name="__RefHeading___Toc5212_863242435"/>
       <w:bookmarkEnd w:id="33"/>
       <w:r>
         <w:rPr/>
@@ -12205,7 +12205,7 @@
         <w:pStyle w:val="Heading2"/>
         <w:rPr/>
       </w:pPr>
-      <w:bookmarkStart w:id="34" w:name="__RefHeading___Toc5214_2515352571"/>
+      <w:bookmarkStart w:id="34" w:name="__RefHeading___Toc5214_863242435"/>
       <w:bookmarkEnd w:id="34"/>
       <w:r>
         <w:rPr/>
@@ -12237,7 +12237,7 @@
         <w:pStyle w:val="Heading2"/>
         <w:rPr/>
       </w:pPr>
-      <w:bookmarkStart w:id="35" w:name="__RefHeading___Toc5216_2515352571"/>
+      <w:bookmarkStart w:id="35" w:name="__RefHeading___Toc5216_863242435"/>
       <w:bookmarkEnd w:id="35"/>
       <w:r>
         <w:rPr/>
@@ -13414,7 +13414,7 @@
         <w:pStyle w:val="Heading1"/>
         <w:rPr/>
       </w:pPr>
-      <w:bookmarkStart w:id="36" w:name="__RefHeading___Toc5218_2515352571"/>
+      <w:bookmarkStart w:id="36" w:name="__RefHeading___Toc5218_863242435"/>
       <w:bookmarkEnd w:id="36"/>
       <w:r>
         <w:rPr/>
@@ -13436,7 +13436,7 @@
         <w:pStyle w:val="Heading2"/>
         <w:rPr/>
       </w:pPr>
-      <w:bookmarkStart w:id="37" w:name="__RefHeading___Toc5220_2515352571"/>
+      <w:bookmarkStart w:id="37" w:name="__RefHeading___Toc5220_863242435"/>
       <w:bookmarkEnd w:id="37"/>
       <w:r>
         <w:rPr/>
@@ -13531,7 +13531,7 @@
         <w:pStyle w:val="Heading2"/>
         <w:rPr/>
       </w:pPr>
-      <w:bookmarkStart w:id="38" w:name="__RefHeading___Toc5222_2515352571"/>
+      <w:bookmarkStart w:id="38" w:name="__RefHeading___Toc5222_863242435"/>
       <w:bookmarkEnd w:id="38"/>
       <w:r>
         <w:rPr/>
@@ -13543,7 +13543,7 @@
         <w:pStyle w:val="Heading3"/>
         <w:rPr/>
       </w:pPr>
-      <w:bookmarkStart w:id="39" w:name="__RefHeading___Toc5224_2515352571"/>
+      <w:bookmarkStart w:id="39" w:name="__RefHeading___Toc5224_863242435"/>
       <w:bookmarkEnd w:id="39"/>
       <w:r>
         <w:rPr/>
@@ -13586,7 +13586,7 @@
         <w:pStyle w:val="Heading3"/>
         <w:rPr/>
       </w:pPr>
-      <w:bookmarkStart w:id="40" w:name="__RefHeading___Toc5226_2515352571"/>
+      <w:bookmarkStart w:id="40" w:name="__RefHeading___Toc5226_863242435"/>
       <w:bookmarkEnd w:id="40"/>
       <w:r>
         <w:rPr/>
@@ -13618,7 +13618,7 @@
         <w:pStyle w:val="Heading3"/>
         <w:rPr/>
       </w:pPr>
-      <w:bookmarkStart w:id="41" w:name="__RefHeading___Toc5228_2515352571"/>
+      <w:bookmarkStart w:id="41" w:name="__RefHeading___Toc5228_863242435"/>
       <w:bookmarkEnd w:id="41"/>
       <w:r>
         <w:rPr/>
@@ -14604,7 +14604,7 @@
         <w:pStyle w:val="Heading2"/>
         <w:rPr/>
       </w:pPr>
-      <w:bookmarkStart w:id="42" w:name="__RefHeading___Toc5230_2515352571"/>
+      <w:bookmarkStart w:id="42" w:name="__RefHeading___Toc5230_863242435"/>
       <w:bookmarkEnd w:id="42"/>
       <w:r>
         <w:rPr/>
@@ -14616,7 +14616,7 @@
         <w:pStyle w:val="Heading3"/>
         <w:rPr/>
       </w:pPr>
-      <w:bookmarkStart w:id="43" w:name="__RefHeading___Toc5232_2515352571"/>
+      <w:bookmarkStart w:id="43" w:name="__RefHeading___Toc5232_863242435"/>
       <w:bookmarkEnd w:id="43"/>
       <w:r>
         <w:rPr/>
@@ -14638,7 +14638,7 @@
         <w:pStyle w:val="Heading3"/>
         <w:rPr/>
       </w:pPr>
-      <w:bookmarkStart w:id="44" w:name="__RefHeading___Toc5234_2515352571"/>
+      <w:bookmarkStart w:id="44" w:name="__RefHeading___Toc5234_863242435"/>
       <w:bookmarkEnd w:id="44"/>
       <w:r>
         <w:rPr/>
@@ -15713,7 +15713,7 @@
         <w:pStyle w:val="Heading3"/>
         <w:rPr/>
       </w:pPr>
-      <w:bookmarkStart w:id="45" w:name="__RefHeading___Toc5236_2515352571"/>
+      <w:bookmarkStart w:id="45" w:name="__RefHeading___Toc5236_863242435"/>
       <w:bookmarkEnd w:id="45"/>
       <w:r>
         <w:rPr/>
@@ -15735,7 +15735,7 @@
         <w:pStyle w:val="Heading2"/>
         <w:rPr/>
       </w:pPr>
-      <w:bookmarkStart w:id="46" w:name="__RefHeading___Toc5238_2515352571"/>
+      <w:bookmarkStart w:id="46" w:name="__RefHeading___Toc5238_863242435"/>
       <w:bookmarkEnd w:id="46"/>
       <w:r>
         <w:rPr/>
@@ -15747,7 +15747,7 @@
         <w:pStyle w:val="Heading3"/>
         <w:rPr/>
       </w:pPr>
-      <w:bookmarkStart w:id="47" w:name="__RefHeading___Toc5240_2515352571"/>
+      <w:bookmarkStart w:id="47" w:name="__RefHeading___Toc5240_863242435"/>
       <w:bookmarkEnd w:id="47"/>
       <w:r>
         <w:rPr/>
@@ -16215,7 +16215,7 @@
         <w:pStyle w:val="Heading3"/>
         <w:rPr/>
       </w:pPr>
-      <w:bookmarkStart w:id="48" w:name="__RefHeading___Toc5242_2515352571"/>
+      <w:bookmarkStart w:id="48" w:name="__RefHeading___Toc5242_863242435"/>
       <w:bookmarkEnd w:id="48"/>
       <w:r>
         <w:rPr/>
@@ -16247,7 +16247,7 @@
         <w:pStyle w:val="Heading3"/>
         <w:rPr/>
       </w:pPr>
-      <w:bookmarkStart w:id="49" w:name="__RefHeading___Toc5244_2515352571"/>
+      <w:bookmarkStart w:id="49" w:name="__RefHeading___Toc5244_863242435"/>
       <w:bookmarkEnd w:id="49"/>
       <w:r>
         <w:rPr/>
@@ -16280,7 +16280,7 @@
         <w:pStyle w:val="Heading2"/>
         <w:rPr/>
       </w:pPr>
-      <w:bookmarkStart w:id="50" w:name="__RefHeading___Toc5246_2515352571"/>
+      <w:bookmarkStart w:id="50" w:name="__RefHeading___Toc5246_863242435"/>
       <w:bookmarkEnd w:id="50"/>
       <w:r>
         <w:rPr/>
@@ -16292,7 +16292,7 @@
         <w:pStyle w:val="Heading3"/>
         <w:rPr/>
       </w:pPr>
-      <w:bookmarkStart w:id="51" w:name="__RefHeading___Toc5248_2515352571"/>
+      <w:bookmarkStart w:id="51" w:name="__RefHeading___Toc5248_863242435"/>
       <w:bookmarkEnd w:id="51"/>
       <w:r>
         <w:rPr/>
@@ -16419,7 +16419,7 @@
         <w:pStyle w:val="Heading3"/>
         <w:rPr/>
       </w:pPr>
-      <w:bookmarkStart w:id="52" w:name="__RefHeading___Toc5250_2515352571"/>
+      <w:bookmarkStart w:id="52" w:name="__RefHeading___Toc5250_863242435"/>
       <w:bookmarkEnd w:id="52"/>
       <w:r>
         <w:rPr/>
@@ -16606,7 +16606,7 @@
         <w:pStyle w:val="Heading3"/>
         <w:rPr/>
       </w:pPr>
-      <w:bookmarkStart w:id="53" w:name="__RefHeading___Toc5252_2515352571"/>
+      <w:bookmarkStart w:id="53" w:name="__RefHeading___Toc5252_863242435"/>
       <w:bookmarkEnd w:id="53"/>
       <w:r>
         <w:rPr/>
@@ -16628,7 +16628,7 @@
         <w:pStyle w:val="Heading3"/>
         <w:rPr/>
       </w:pPr>
-      <w:bookmarkStart w:id="54" w:name="__RefHeading___Toc5254_2515352571"/>
+      <w:bookmarkStart w:id="54" w:name="__RefHeading___Toc5254_863242435"/>
       <w:bookmarkEnd w:id="54"/>
       <w:r>
         <w:rPr/>
@@ -16650,7 +16650,7 @@
         <w:pStyle w:val="Heading2"/>
         <w:rPr/>
       </w:pPr>
-      <w:bookmarkStart w:id="55" w:name="__RefHeading___Toc5256_2515352571"/>
+      <w:bookmarkStart w:id="55" w:name="__RefHeading___Toc5256_863242435"/>
       <w:bookmarkEnd w:id="55"/>
       <w:r>
         <w:rPr/>
@@ -16682,7 +16682,7 @@
         <w:pStyle w:val="Heading2"/>
         <w:rPr/>
       </w:pPr>
-      <w:bookmarkStart w:id="56" w:name="__RefHeading___Toc5258_2515352571"/>
+      <w:bookmarkStart w:id="56" w:name="__RefHeading___Toc5258_863242435"/>
       <w:bookmarkEnd w:id="56"/>
       <w:r>
         <w:rPr/>
@@ -16714,7 +16714,7 @@
         <w:pStyle w:val="Heading2"/>
         <w:rPr/>
       </w:pPr>
-      <w:bookmarkStart w:id="57" w:name="__RefHeading___Toc5260_2515352571"/>
+      <w:bookmarkStart w:id="57" w:name="__RefHeading___Toc5260_863242435"/>
       <w:bookmarkEnd w:id="57"/>
       <w:r>
         <w:rPr/>
@@ -16749,7 +16749,7 @@
         <w:pStyle w:val="Heading1"/>
         <w:rPr/>
       </w:pPr>
-      <w:bookmarkStart w:id="58" w:name="__RefHeading___Toc5262_2515352571"/>
+      <w:bookmarkStart w:id="58" w:name="__RefHeading___Toc5262_863242435"/>
       <w:bookmarkEnd w:id="58"/>
       <w:r>
         <w:rPr/>
@@ -16771,7 +16771,7 @@
         <w:pStyle w:val="Heading2"/>
         <w:rPr/>
       </w:pPr>
-      <w:bookmarkStart w:id="59" w:name="__RefHeading___Toc5264_2515352571"/>
+      <w:bookmarkStart w:id="59" w:name="__RefHeading___Toc5264_863242435"/>
       <w:bookmarkEnd w:id="59"/>
       <w:r>
         <w:rPr/>
@@ -16938,7 +16938,7 @@
         <w:pStyle w:val="Heading2"/>
         <w:rPr/>
       </w:pPr>
-      <w:bookmarkStart w:id="60" w:name="__RefHeading___Toc5266_2515352571"/>
+      <w:bookmarkStart w:id="60" w:name="__RefHeading___Toc5266_863242435"/>
       <w:bookmarkEnd w:id="60"/>
       <w:r>
         <w:rPr/>
@@ -16950,7 +16950,7 @@
         <w:pStyle w:val="Heading3"/>
         <w:rPr/>
       </w:pPr>
-      <w:bookmarkStart w:id="61" w:name="__RefHeading___Toc5268_2515352571"/>
+      <w:bookmarkStart w:id="61" w:name="__RefHeading___Toc5268_863242435"/>
       <w:bookmarkEnd w:id="61"/>
       <w:r>
         <w:rPr/>
@@ -18698,7 +18698,7 @@
         <w:pStyle w:val="Heading3"/>
         <w:rPr/>
       </w:pPr>
-      <w:bookmarkStart w:id="62" w:name="__RefHeading___Toc5270_2515352571"/>
+      <w:bookmarkStart w:id="62" w:name="__RefHeading___Toc5270_863242435"/>
       <w:bookmarkEnd w:id="62"/>
       <w:r>
         <w:rPr/>
@@ -18837,7 +18837,7 @@
         <w:pStyle w:val="Heading3"/>
         <w:rPr/>
       </w:pPr>
-      <w:bookmarkStart w:id="63" w:name="__RefHeading___Toc5272_2515352571"/>
+      <w:bookmarkStart w:id="63" w:name="__RefHeading___Toc5272_863242435"/>
       <w:bookmarkEnd w:id="63"/>
       <w:r>
         <w:rPr/>
@@ -18869,7 +18869,7 @@
         <w:pStyle w:val="Heading2"/>
         <w:rPr/>
       </w:pPr>
-      <w:bookmarkStart w:id="64" w:name="__RefHeading___Toc5274_2515352571"/>
+      <w:bookmarkStart w:id="64" w:name="__RefHeading___Toc5274_863242435"/>
       <w:bookmarkEnd w:id="64"/>
       <w:r>
         <w:rPr/>
@@ -19153,7 +19153,7 @@
         <w:pStyle w:val="Heading2"/>
         <w:rPr/>
       </w:pPr>
-      <w:bookmarkStart w:id="65" w:name="__RefHeading___Toc5276_2515352571"/>
+      <w:bookmarkStart w:id="65" w:name="__RefHeading___Toc5276_863242435"/>
       <w:bookmarkEnd w:id="65"/>
       <w:r>
         <w:rPr/>
@@ -19165,7 +19165,7 @@
         <w:pStyle w:val="Heading3"/>
         <w:rPr/>
       </w:pPr>
-      <w:bookmarkStart w:id="66" w:name="__RefHeading___Toc5278_2515352571"/>
+      <w:bookmarkStart w:id="66" w:name="__RefHeading___Toc5278_863242435"/>
       <w:bookmarkEnd w:id="66"/>
       <w:r>
         <w:rPr/>
@@ -19197,7 +19197,7 @@
         <w:pStyle w:val="Heading3"/>
         <w:rPr/>
       </w:pPr>
-      <w:bookmarkStart w:id="67" w:name="__RefHeading___Toc5280_2515352571"/>
+      <w:bookmarkStart w:id="67" w:name="__RefHeading___Toc5280_863242435"/>
       <w:bookmarkEnd w:id="67"/>
       <w:r>
         <w:rPr/>
@@ -19219,7 +19219,7 @@
         <w:pStyle w:val="Heading3"/>
         <w:rPr/>
       </w:pPr>
-      <w:bookmarkStart w:id="68" w:name="__RefHeading___Toc5282_2515352571"/>
+      <w:bookmarkStart w:id="68" w:name="__RefHeading___Toc5282_863242435"/>
       <w:bookmarkEnd w:id="68"/>
       <w:r>
         <w:rPr/>
@@ -19241,7 +19241,7 @@
         <w:pStyle w:val="Heading2"/>
         <w:rPr/>
       </w:pPr>
-      <w:bookmarkStart w:id="69" w:name="__RefHeading___Toc5284_2515352571"/>
+      <w:bookmarkStart w:id="69" w:name="__RefHeading___Toc5284_863242435"/>
       <w:bookmarkEnd w:id="69"/>
       <w:r>
         <w:rPr/>
@@ -19253,7 +19253,7 @@
         <w:pStyle w:val="Heading3"/>
         <w:rPr/>
       </w:pPr>
-      <w:bookmarkStart w:id="70" w:name="__RefHeading___Toc5286_2515352571"/>
+      <w:bookmarkStart w:id="70" w:name="__RefHeading___Toc5286_863242435"/>
       <w:bookmarkEnd w:id="70"/>
       <w:r>
         <w:rPr/>
@@ -19350,7 +19350,7 @@
         <w:pStyle w:val="Heading3"/>
         <w:rPr/>
       </w:pPr>
-      <w:bookmarkStart w:id="71" w:name="__RefHeading___Toc5288_2515352571"/>
+      <w:bookmarkStart w:id="71" w:name="__RefHeading___Toc5288_863242435"/>
       <w:bookmarkEnd w:id="71"/>
       <w:r>
         <w:rPr/>
@@ -20162,7 +20162,7 @@
         <w:pStyle w:val="Heading2"/>
         <w:rPr/>
       </w:pPr>
-      <w:bookmarkStart w:id="72" w:name="__RefHeading___Toc5290_2515352571"/>
+      <w:bookmarkStart w:id="72" w:name="__RefHeading___Toc5290_863242435"/>
       <w:bookmarkEnd w:id="72"/>
       <w:r>
         <w:rPr/>
@@ -20370,7 +20370,7 @@
         <w:pStyle w:val="Heading2"/>
         <w:rPr/>
       </w:pPr>
-      <w:bookmarkStart w:id="73" w:name="__RefHeading___Toc5292_2515352571"/>
+      <w:bookmarkStart w:id="73" w:name="__RefHeading___Toc5292_863242435"/>
       <w:bookmarkEnd w:id="73"/>
       <w:r>
         <w:rPr/>
@@ -20382,7 +20382,7 @@
         <w:pStyle w:val="Heading3"/>
         <w:rPr/>
       </w:pPr>
-      <w:bookmarkStart w:id="74" w:name="__RefHeading___Toc5294_2515352571"/>
+      <w:bookmarkStart w:id="74" w:name="__RefHeading___Toc5294_863242435"/>
       <w:bookmarkEnd w:id="74"/>
       <w:r>
         <w:rPr/>
@@ -20404,7 +20404,7 @@
         <w:pStyle w:val="Heading3"/>
         <w:rPr/>
       </w:pPr>
-      <w:bookmarkStart w:id="75" w:name="__RefHeading___Toc5296_2515352571"/>
+      <w:bookmarkStart w:id="75" w:name="__RefHeading___Toc5296_863242435"/>
       <w:bookmarkEnd w:id="75"/>
       <w:r>
         <w:rPr/>
@@ -20426,7 +20426,7 @@
         <w:pStyle w:val="Heading2"/>
         <w:rPr/>
       </w:pPr>
-      <w:bookmarkStart w:id="76" w:name="__RefHeading___Toc5298_2515352571"/>
+      <w:bookmarkStart w:id="76" w:name="__RefHeading___Toc5298_863242435"/>
       <w:bookmarkEnd w:id="76"/>
       <w:r>
         <w:rPr/>
@@ -21077,7 +21077,7 @@
         <w:pStyle w:val="Heading2"/>
         <w:rPr/>
       </w:pPr>
-      <w:bookmarkStart w:id="77" w:name="__RefHeading___Toc5300_2515352571"/>
+      <w:bookmarkStart w:id="77" w:name="__RefHeading___Toc5300_863242435"/>
       <w:bookmarkEnd w:id="77"/>
       <w:r>
         <w:rPr/>
@@ -22243,7 +22243,7 @@
         <w:pStyle w:val="Heading1"/>
         <w:rPr/>
       </w:pPr>
-      <w:bookmarkStart w:id="78" w:name="__RefHeading___Toc5302_2515352571"/>
+      <w:bookmarkStart w:id="78" w:name="__RefHeading___Toc5302_863242435"/>
       <w:bookmarkEnd w:id="78"/>
       <w:r>
         <w:rPr/>
@@ -22265,7 +22265,7 @@
         <w:pStyle w:val="Heading2"/>
         <w:rPr/>
       </w:pPr>
-      <w:bookmarkStart w:id="79" w:name="__RefHeading___Toc5304_2515352571"/>
+      <w:bookmarkStart w:id="79" w:name="__RefHeading___Toc5304_863242435"/>
       <w:bookmarkEnd w:id="79"/>
       <w:r>
         <w:rPr/>
@@ -22987,7 +22987,7 @@
         <w:pStyle w:val="Heading2"/>
         <w:rPr/>
       </w:pPr>
-      <w:bookmarkStart w:id="80" w:name="__RefHeading___Toc5306_2515352571"/>
+      <w:bookmarkStart w:id="80" w:name="__RefHeading___Toc5306_863242435"/>
       <w:bookmarkEnd w:id="80"/>
       <w:r>
         <w:rPr/>
@@ -22999,7 +22999,7 @@
         <w:pStyle w:val="Heading3"/>
         <w:rPr/>
       </w:pPr>
-      <w:bookmarkStart w:id="81" w:name="__RefHeading___Toc5308_2515352571"/>
+      <w:bookmarkStart w:id="81" w:name="__RefHeading___Toc5308_863242435"/>
       <w:bookmarkEnd w:id="81"/>
       <w:r>
         <w:rPr/>
@@ -23021,7 +23021,7 @@
         <w:pStyle w:val="Heading3"/>
         <w:rPr/>
       </w:pPr>
-      <w:bookmarkStart w:id="82" w:name="__RefHeading___Toc5310_2515352571"/>
+      <w:bookmarkStart w:id="82" w:name="__RefHeading___Toc5310_863242435"/>
       <w:bookmarkEnd w:id="82"/>
       <w:r>
         <w:rPr/>
@@ -23063,7 +23063,7 @@
         <w:pStyle w:val="Heading3"/>
         <w:rPr/>
       </w:pPr>
-      <w:bookmarkStart w:id="83" w:name="__RefHeading___Toc5312_2515352571"/>
+      <w:bookmarkStart w:id="83" w:name="__RefHeading___Toc5312_863242435"/>
       <w:bookmarkEnd w:id="83"/>
       <w:r>
         <w:rPr/>
@@ -23085,7 +23085,7 @@
         <w:pStyle w:val="Heading2"/>
         <w:rPr/>
       </w:pPr>
-      <w:bookmarkStart w:id="84" w:name="__RefHeading___Toc5314_2515352571"/>
+      <w:bookmarkStart w:id="84" w:name="__RefHeading___Toc5314_863242435"/>
       <w:bookmarkEnd w:id="84"/>
       <w:r>
         <w:rPr/>
@@ -23097,7 +23097,7 @@
         <w:pStyle w:val="Heading3"/>
         <w:rPr/>
       </w:pPr>
-      <w:bookmarkStart w:id="85" w:name="__RefHeading___Toc5316_2515352571"/>
+      <w:bookmarkStart w:id="85" w:name="__RefHeading___Toc5316_863242435"/>
       <w:bookmarkEnd w:id="85"/>
       <w:r>
         <w:rPr/>
@@ -23131,7 +23131,7 @@
         <w:pStyle w:val="Heading3"/>
         <w:rPr/>
       </w:pPr>
-      <w:bookmarkStart w:id="86" w:name="__RefHeading___Toc5318_2515352571"/>
+      <w:bookmarkStart w:id="86" w:name="__RefHeading___Toc5318_863242435"/>
       <w:bookmarkEnd w:id="86"/>
       <w:r>
         <w:rPr/>
@@ -23153,7 +23153,7 @@
         <w:pStyle w:val="Heading3"/>
         <w:rPr/>
       </w:pPr>
-      <w:bookmarkStart w:id="87" w:name="__RefHeading___Toc5320_2515352571"/>
+      <w:bookmarkStart w:id="87" w:name="__RefHeading___Toc5320_863242435"/>
       <w:bookmarkEnd w:id="87"/>
       <w:r>
         <w:rPr/>
@@ -23185,7 +23185,7 @@
         <w:pStyle w:val="Heading2"/>
         <w:rPr/>
       </w:pPr>
-      <w:bookmarkStart w:id="88" w:name="__RefHeading___Toc5322_2515352571"/>
+      <w:bookmarkStart w:id="88" w:name="__RefHeading___Toc5322_863242435"/>
       <w:bookmarkEnd w:id="88"/>
       <w:r>
         <w:rPr/>
@@ -23197,7 +23197,7 @@
         <w:pStyle w:val="Heading3"/>
         <w:rPr/>
       </w:pPr>
-      <w:bookmarkStart w:id="89" w:name="__RefHeading___Toc5324_2515352571"/>
+      <w:bookmarkStart w:id="89" w:name="__RefHeading___Toc5324_863242435"/>
       <w:bookmarkEnd w:id="89"/>
       <w:r>
         <w:rPr/>
@@ -23229,7 +23229,7 @@
         <w:pStyle w:val="Heading3"/>
         <w:rPr/>
       </w:pPr>
-      <w:bookmarkStart w:id="90" w:name="__RefHeading___Toc5326_2515352571"/>
+      <w:bookmarkStart w:id="90" w:name="__RefHeading___Toc5326_863242435"/>
       <w:bookmarkEnd w:id="90"/>
       <w:r>
         <w:rPr/>
@@ -23251,7 +23251,7 @@
         <w:pStyle w:val="Heading2"/>
         <w:rPr/>
       </w:pPr>
-      <w:bookmarkStart w:id="91" w:name="__RefHeading___Toc5328_2515352571"/>
+      <w:bookmarkStart w:id="91" w:name="__RefHeading___Toc5328_863242435"/>
       <w:bookmarkEnd w:id="91"/>
       <w:r>
         <w:rPr/>
@@ -23283,7 +23283,7 @@
         <w:pStyle w:val="Heading2"/>
         <w:rPr/>
       </w:pPr>
-      <w:bookmarkStart w:id="92" w:name="__RefHeading___Toc5330_2515352571"/>
+      <w:bookmarkStart w:id="92" w:name="__RefHeading___Toc5330_863242435"/>
       <w:bookmarkEnd w:id="92"/>
       <w:r>
         <w:rPr/>
@@ -24101,7 +24101,7 @@
         <w:pStyle w:val="Heading2"/>
         <w:rPr/>
       </w:pPr>
-      <w:bookmarkStart w:id="93" w:name="__RefHeading___Toc5332_2515352571"/>
+      <w:bookmarkStart w:id="93" w:name="__RefHeading___Toc5332_863242435"/>
       <w:bookmarkEnd w:id="93"/>
       <w:r>
         <w:rPr/>
@@ -24227,7 +24227,7 @@
         <w:pStyle w:val="Heading2"/>
         <w:rPr/>
       </w:pPr>
-      <w:bookmarkStart w:id="94" w:name="__RefHeading___Toc5334_2515352571"/>
+      <w:bookmarkStart w:id="94" w:name="__RefHeading___Toc5334_863242435"/>
       <w:bookmarkEnd w:id="94"/>
       <w:r>
         <w:rPr/>
@@ -24241,7 +24241,7 @@
       </w:pPr>
       <w:r>
         <w:rPr/>
-        <w:t>La suite compte 102 cas de test. Les 66 tests unitaires n'ont besoin ni de base de données, ni de réseau, ni de clé d'API : ils couvrent le nettoyage, les métadonnées, le découpage, la validation des fichiers, la détection d'injection, MinHash, l'extraction, la résolution d'entités, la fusion, le PageRank personnalisé, la classification, la suffisance, les conflits, la génération, la vérification, la sécurité et les clients LLM, ces derniers à l'aide de réponses simulées. Les 36 tests d'intégration s'exécutent sur une base Neo4j dédiée, vidée à chaque exécution : ingestion réelle du corpus, idempotence, cycle de vie d'un document, versions, contrôle d'accès dans la recherche, le graphe et l'API, comportement du workflow (réponse, abstention, contradiction, LLM simulé qui invente une citation ou ne cite rien, panne du fournisseur), experts et recommandations.</w:t>
+        <w:t>La suite compte 103 cas de test. Les 67 tests unitaires n'ont besoin ni de base de données, ni de réseau, ni de clé d'API : ils couvrent le nettoyage, les métadonnées, le découpage, la validation des fichiers, la détection d'injection, MinHash, l'extraction, la résolution d'entités, la fusion, le PageRank personnalisé, la classification, la suffisance, les conflits, la génération, la vérification, la sécurité et les clients LLM, ces derniers à l'aide de réponses simulées. Les 36 tests d'intégration s'exécutent sur une base Neo4j dédiée, vidée à chaque exécution : ingestion réelle du corpus, idempotence, cycle de vie d'un document, versions, contrôle d'accès dans la recherche, le graphe et l'API, comportement du workflow (réponse, abstention, contradiction, LLM simulé qui invente une citation ou ne cite rien, panne du fournisseur), experts et recommandations.</w:t>
       </w:r>
     </w:p>
     <w:p>
@@ -24249,7 +24249,7 @@
         <w:pStyle w:val="Heading2"/>
         <w:rPr/>
       </w:pPr>
-      <w:bookmarkStart w:id="95" w:name="__RefHeading___Toc5336_2515352571"/>
+      <w:bookmarkStart w:id="95" w:name="__RefHeading___Toc5336_863242435"/>
       <w:bookmarkEnd w:id="95"/>
       <w:r>
         <w:rPr/>
@@ -25278,7 +25278,7 @@
         <w:pStyle w:val="Heading1"/>
         <w:rPr/>
       </w:pPr>
-      <w:bookmarkStart w:id="96" w:name="__RefHeading___Toc5338_2515352571"/>
+      <w:bookmarkStart w:id="96" w:name="__RefHeading___Toc5338_863242435"/>
       <w:bookmarkEnd w:id="96"/>
       <w:r>
         <w:rPr/>
@@ -25300,7 +25300,7 @@
         <w:pStyle w:val="Heading2"/>
         <w:rPr/>
       </w:pPr>
-      <w:bookmarkStart w:id="97" w:name="__RefHeading___Toc5340_2515352571"/>
+      <w:bookmarkStart w:id="97" w:name="__RefHeading___Toc5340_863242435"/>
       <w:bookmarkEnd w:id="97"/>
       <w:r>
         <w:rPr/>
@@ -25416,7 +25416,7 @@
         <w:pStyle w:val="Heading2"/>
         <w:rPr/>
       </w:pPr>
-      <w:bookmarkStart w:id="98" w:name="__RefHeading___Toc5342_2515352571"/>
+      <w:bookmarkStart w:id="98" w:name="__RefHeading___Toc5342_863242435"/>
       <w:bookmarkEnd w:id="98"/>
       <w:r>
         <w:rPr/>
@@ -25799,7 +25799,7 @@
         <w:pStyle w:val="Heading2"/>
         <w:rPr/>
       </w:pPr>
-      <w:bookmarkStart w:id="99" w:name="__RefHeading___Toc5344_2515352571"/>
+      <w:bookmarkStart w:id="99" w:name="__RefHeading___Toc5344_863242435"/>
       <w:bookmarkEnd w:id="99"/>
       <w:r>
         <w:rPr/>
@@ -25811,7 +25811,7 @@
         <w:pStyle w:val="Heading3"/>
         <w:rPr/>
       </w:pPr>
-      <w:bookmarkStart w:id="100" w:name="__RefHeading___Toc5346_2515352571"/>
+      <w:bookmarkStart w:id="100" w:name="__RefHeading___Toc5346_863242435"/>
       <w:bookmarkEnd w:id="100"/>
       <w:r>
         <w:rPr/>
@@ -27150,7 +27150,7 @@
         <w:pStyle w:val="Heading3"/>
         <w:rPr/>
       </w:pPr>
-      <w:bookmarkStart w:id="101" w:name="__RefHeading___Toc5348_2515352571"/>
+      <w:bookmarkStart w:id="101" w:name="__RefHeading___Toc5348_863242435"/>
       <w:bookmarkEnd w:id="101"/>
       <w:r>
         <w:rPr/>
@@ -27266,7 +27266,7 @@
         <w:pStyle w:val="Heading3"/>
         <w:rPr/>
       </w:pPr>
-      <w:bookmarkStart w:id="102" w:name="__RefHeading___Toc5350_2515352571"/>
+      <w:bookmarkStart w:id="102" w:name="__RefHeading___Toc5350_863242435"/>
       <w:bookmarkEnd w:id="102"/>
       <w:r>
         <w:rPr/>
@@ -27374,7 +27374,7 @@
       </w:pPr>
       <w:r>
         <w:rPr/>
-        <w:t>Le graphe seul est la meilleure stratégie sur les questions relationnelles (0,96) et d'expertise (0,98), mais la moins bonne sur les questions factuelles (0,53) et ambiguës (0,37). BM25 domine sur les questions factuelles (0,99) et sur les contradictions. L'architecture finale ne domine nulle part de façon spectaculaire, mais elle n'est mauvaise nulle part : elle atteint 0,99 sur le factuel, 0,87 sur le relationnel, 0,97 sur l'expertise et 0,71 sur le multi-sauts. C'est précisément le rôle attendu du routage : éviter que le graphe ne dégrade les questions simples tout en le mobilisant pour les questions relationnelles. Ces chiffres par catégorie reposent toutefois sur de petits effectifs (de 4 à 13 questions) et doivent être lus comme des tendances.</w:t>
+        <w:t>Le graphe seul est la meilleure stratégie sur les questions relationnelles (0,96) et l'une des meilleures sur l'expertise (0,97), mais la moins bonne sur les questions factuelles (0,52) et ambiguës (0,37). BM25 domine sur les questions factuelles (0,99) et, à égalité avec le RAG hybride, sur les contradictions (0,92). L'architecture finale ne domine nulle part de façon spectaculaire, mais elle n'est mauvaise nulle part : elle atteint 0,99 sur le factuel, 0,86 sur le relationnel, 0,97 sur l'expertise et 0,71 sur le multi-sauts. C'est précisément le rôle attendu du routage : éviter que le graphe ne dégrade les questions simples tout en le mobilisant pour les questions relationnelles. Ces chiffres par catégorie reposent toutefois sur de petits effectifs (de 4 à 13 questions) et doivent être lus comme des tendances.</w:t>
       </w:r>
     </w:p>
     <w:p>
@@ -27382,7 +27382,7 @@
         <w:pStyle w:val="Heading2"/>
         <w:rPr/>
       </w:pPr>
-      <w:bookmarkStart w:id="103" w:name="__RefHeading___Toc5352_2515352571"/>
+      <w:bookmarkStart w:id="103" w:name="__RefHeading___Toc5352_863242435"/>
       <w:bookmarkEnd w:id="103"/>
       <w:r>
         <w:rPr/>
@@ -27394,7 +27394,7 @@
         <w:pStyle w:val="Heading3"/>
         <w:rPr/>
       </w:pPr>
-      <w:bookmarkStart w:id="104" w:name="__RefHeading___Toc5354_2515352571"/>
+      <w:bookmarkStart w:id="104" w:name="__RefHeading___Toc5354_863242435"/>
       <w:bookmarkEnd w:id="104"/>
       <w:r>
         <w:rPr/>
@@ -28504,7 +28504,7 @@
         <w:pStyle w:val="Heading3"/>
         <w:rPr/>
       </w:pPr>
-      <w:bookmarkStart w:id="105" w:name="__RefHeading___Toc5356_2515352571"/>
+      <w:bookmarkStart w:id="105" w:name="__RefHeading___Toc5356_863242435"/>
       <w:bookmarkEnd w:id="105"/>
       <w:r>
         <w:rPr/>
@@ -28536,7 +28536,7 @@
         <w:pStyle w:val="Heading3"/>
         <w:rPr/>
       </w:pPr>
-      <w:bookmarkStart w:id="106" w:name="__RefHeading___Toc5358_2515352571"/>
+      <w:bookmarkStart w:id="106" w:name="__RefHeading___Toc5358_863242435"/>
       <w:bookmarkEnd w:id="106"/>
       <w:r>
         <w:rPr/>
@@ -28568,7 +28568,7 @@
         <w:pStyle w:val="Heading2"/>
         <w:rPr/>
       </w:pPr>
-      <w:bookmarkStart w:id="107" w:name="__RefHeading___Toc5360_2515352571"/>
+      <w:bookmarkStart w:id="107" w:name="__RefHeading___Toc5360_863242435"/>
       <w:bookmarkEnd w:id="107"/>
       <w:r>
         <w:rPr/>
@@ -28580,7 +28580,7 @@
         <w:pStyle w:val="Heading3"/>
         <w:rPr/>
       </w:pPr>
-      <w:bookmarkStart w:id="108" w:name="__RefHeading___Toc5362_2515352571"/>
+      <w:bookmarkStart w:id="108" w:name="__RefHeading___Toc5362_863242435"/>
       <w:bookmarkEnd w:id="108"/>
       <w:r>
         <w:rPr/>
@@ -28696,7 +28696,7 @@
         <w:pStyle w:val="Heading3"/>
         <w:rPr/>
       </w:pPr>
-      <w:bookmarkStart w:id="109" w:name="__RefHeading___Toc5364_2515352571"/>
+      <w:bookmarkStart w:id="109" w:name="__RefHeading___Toc5364_863242435"/>
       <w:bookmarkEnd w:id="109"/>
       <w:r>
         <w:rPr/>
@@ -28718,7 +28718,7 @@
         <w:pStyle w:val="Heading2"/>
         <w:rPr/>
       </w:pPr>
-      <w:bookmarkStart w:id="110" w:name="__RefHeading___Toc5366_2515352571"/>
+      <w:bookmarkStart w:id="110" w:name="__RefHeading___Toc5366_863242435"/>
       <w:bookmarkEnd w:id="110"/>
       <w:r>
         <w:rPr/>
@@ -29341,7 +29341,7 @@
         <w:pStyle w:val="Heading2"/>
         <w:rPr/>
       </w:pPr>
-      <w:bookmarkStart w:id="111" w:name="__RefHeading___Toc5368_2515352571"/>
+      <w:bookmarkStart w:id="111" w:name="__RefHeading___Toc5368_863242435"/>
       <w:bookmarkEnd w:id="111"/>
       <w:r>
         <w:rPr/>
@@ -30109,7 +30109,7 @@
         <w:pStyle w:val="Heading2"/>
         <w:rPr/>
       </w:pPr>
-      <w:bookmarkStart w:id="112" w:name="__RefHeading___Toc5370_2515352571"/>
+      <w:bookmarkStart w:id="112" w:name="__RefHeading___Toc5370_863242435"/>
       <w:bookmarkEnd w:id="112"/>
       <w:r>
         <w:rPr/>
@@ -30199,7 +30199,7 @@
         <w:pStyle w:val="Heading2"/>
         <w:rPr/>
       </w:pPr>
-      <w:bookmarkStart w:id="113" w:name="__RefHeading___Toc5372_2515352571"/>
+      <w:bookmarkStart w:id="113" w:name="__RefHeading___Toc5372_863242435"/>
       <w:bookmarkEnd w:id="113"/>
       <w:r>
         <w:rPr/>
@@ -30928,7 +30928,7 @@
         <w:pStyle w:val="Heading2"/>
         <w:rPr/>
       </w:pPr>
-      <w:bookmarkStart w:id="114" w:name="__RefHeading___Toc5374_2515352571"/>
+      <w:bookmarkStart w:id="114" w:name="__RefHeading___Toc5374_863242435"/>
       <w:bookmarkEnd w:id="114"/>
       <w:r>
         <w:rPr/>
@@ -30949,7 +30949,7 @@
       </w:r>
       <w:r>
         <w:rPr/>
-        <w:t xml:space="preserve"> Sur les questions relationnelles, l'architecture finale obtient un nDCG@5 de 0,87 contre 0,81 pour le RAG vectoriel et 0,86 pour le RAG hybride ; sur les questions multi-sauts, 0,71 contre 0,55 et 0,63. Le sens est celui attendu, mais les écarts avec le RAG hybride sont faibles et portent sur 8 et 10 questions. Le graphe seul fait mieux encore sur le relationnel (0,96), ce qui suggère que la fusion dilue en partie son apport.</w:t>
+        <w:t xml:space="preserve"> Sur les questions relationnelles, l'architecture finale obtient un nDCG@5 de 0,86, contre 0,81 pour le RAG vectoriel, mais au même niveau que le RAG hybride (0,86) ; sur les questions multi-sauts, elle atteint 0,71 contre 0,55 et 0,63. Le gain sur le RAG vectoriel est net, mais l'écart avec le RAG hybride est nul sur le relationnel et modéré sur le multi-sauts, sur 8 et 10 questions seulement. Le graphe seul fait mieux encore sur le relationnel (0,96), ce qui suggère que la fusion dilue en partie son apport.</w:t>
       </w:r>
     </w:p>
     <w:p>
@@ -30966,7 +30966,7 @@
       </w:r>
       <w:r>
         <w:rPr/>
-        <w:t xml:space="preserve"> Sur les 13 questions factuelles, l'architecture finale atteint un nDCG@5 de 0,99, au niveau de BM25 et au-dessus du RAG hybride (0,93), et une exactitude de 0,92, identique à celle des RAG vectoriel et hybride. Le graphe seul, sans routage, tombe à 0,53 : c'est bien le routage qui protège les questions simples.</w:t>
+        <w:t xml:space="preserve"> Sur les 13 questions factuelles, l'architecture finale atteint un nDCG@5 de 0,99, au niveau de BM25 et au-dessus du RAG hybride (0,93), et une exactitude de 0,92, identique à celle des RAG vectoriel et hybride. Le graphe seul, sans routage, tombe à 0,52 : c'est bien le routage qui protège les questions simples.</w:t>
       </w:r>
     </w:p>
     <w:p>
@@ -31025,7 +31025,7 @@
         <w:pStyle w:val="Heading2"/>
         <w:rPr/>
       </w:pPr>
-      <w:bookmarkStart w:id="115" w:name="__RefHeading___Toc5376_2515352571"/>
+      <w:bookmarkStart w:id="115" w:name="__RefHeading___Toc5376_863242435"/>
       <w:bookmarkEnd w:id="115"/>
       <w:r>
         <w:rPr/>
@@ -31108,7 +31108,7 @@
         <w:pStyle w:val="Heading1"/>
         <w:rPr/>
       </w:pPr>
-      <w:bookmarkStart w:id="116" w:name="__RefHeading___Toc5378_2515352571"/>
+      <w:bookmarkStart w:id="116" w:name="__RefHeading___Toc5378_863242435"/>
       <w:bookmarkEnd w:id="116"/>
       <w:r>
         <w:rPr/>
@@ -31141,7 +31141,7 @@
         <w:pStyle w:val="Heading2"/>
         <w:rPr/>
       </w:pPr>
-      <w:bookmarkStart w:id="117" w:name="__RefHeading___Toc5380_2515352571"/>
+      <w:bookmarkStart w:id="117" w:name="__RefHeading___Toc5380_863242435"/>
       <w:bookmarkEnd w:id="117"/>
       <w:r>
         <w:rPr/>
@@ -31153,7 +31153,7 @@
         <w:pStyle w:val="Heading3"/>
         <w:rPr/>
       </w:pPr>
-      <w:bookmarkStart w:id="118" w:name="__RefHeading___Toc5382_2515352571"/>
+      <w:bookmarkStart w:id="118" w:name="__RefHeading___Toc5382_863242435"/>
       <w:bookmarkEnd w:id="118"/>
       <w:r>
         <w:rPr/>
@@ -31259,7 +31259,7 @@
         <w:pStyle w:val="Heading3"/>
         <w:rPr/>
       </w:pPr>
-      <w:bookmarkStart w:id="119" w:name="__RefHeading___Toc5384_2515352571"/>
+      <w:bookmarkStart w:id="119" w:name="__RefHeading___Toc5384_863242435"/>
       <w:bookmarkEnd w:id="119"/>
       <w:r>
         <w:rPr/>
@@ -31999,7 +31999,7 @@
         <w:pStyle w:val="Heading3"/>
         <w:rPr/>
       </w:pPr>
-      <w:bookmarkStart w:id="120" w:name="__RefHeading___Toc5386_2515352571"/>
+      <w:bookmarkStart w:id="120" w:name="__RefHeading___Toc5386_863242435"/>
       <w:bookmarkEnd w:id="120"/>
       <w:r>
         <w:rPr/>
@@ -33674,7 +33674,7 @@
         <w:pStyle w:val="Heading2"/>
         <w:rPr/>
       </w:pPr>
-      <w:bookmarkStart w:id="121" w:name="__RefHeading___Toc5388_2515352571"/>
+      <w:bookmarkStart w:id="121" w:name="__RefHeading___Toc5388_863242435"/>
       <w:bookmarkEnd w:id="121"/>
       <w:r>
         <w:rPr/>
@@ -34440,7 +34440,7 @@
         <w:pStyle w:val="Heading2"/>
         <w:rPr/>
       </w:pPr>
-      <w:bookmarkStart w:id="122" w:name="__RefHeading___Toc5390_2515352571"/>
+      <w:bookmarkStart w:id="122" w:name="__RefHeading___Toc5390_863242435"/>
       <w:bookmarkEnd w:id="122"/>
       <w:r>
         <w:rPr/>
@@ -35664,7 +35664,7 @@
         <w:pStyle w:val="Heading2"/>
         <w:rPr/>
       </w:pPr>
-      <w:bookmarkStart w:id="123" w:name="__RefHeading___Toc5392_2515352571"/>
+      <w:bookmarkStart w:id="123" w:name="__RefHeading___Toc5392_863242435"/>
       <w:bookmarkEnd w:id="123"/>
       <w:r>
         <w:rPr/>
@@ -35676,7 +35676,7 @@
         <w:pStyle w:val="Heading3"/>
         <w:rPr/>
       </w:pPr>
-      <w:bookmarkStart w:id="124" w:name="__RefHeading___Toc5394_2515352571"/>
+      <w:bookmarkStart w:id="124" w:name="__RefHeading___Toc5394_863242435"/>
       <w:bookmarkEnd w:id="124"/>
       <w:r>
         <w:rPr/>
@@ -36371,7 +36371,7 @@
         <w:pStyle w:val="Heading3"/>
         <w:rPr/>
       </w:pPr>
-      <w:bookmarkStart w:id="125" w:name="__RefHeading___Toc5396_2515352571"/>
+      <w:bookmarkStart w:id="125" w:name="__RefHeading___Toc5396_863242435"/>
       <w:bookmarkEnd w:id="125"/>
       <w:r>
         <w:rPr/>
@@ -36519,7 +36519,7 @@
         <w:pStyle w:val="Heading3"/>
         <w:rPr/>
       </w:pPr>
-      <w:bookmarkStart w:id="126" w:name="__RefHeading___Toc5398_2515352571"/>
+      <w:bookmarkStart w:id="126" w:name="__RefHeading___Toc5398_863242435"/>
       <w:bookmarkEnd w:id="126"/>
       <w:r>
         <w:rPr/>
@@ -37214,7 +37214,7 @@
         <w:pStyle w:val="Heading3"/>
         <w:rPr/>
       </w:pPr>
-      <w:bookmarkStart w:id="127" w:name="__RefHeading___Toc5400_2515352571"/>
+      <w:bookmarkStart w:id="127" w:name="__RefHeading___Toc5400_863242435"/>
       <w:bookmarkEnd w:id="127"/>
       <w:r>
         <w:rPr/>
@@ -37341,7 +37341,7 @@
         <w:pStyle w:val="Heading2"/>
         <w:rPr/>
       </w:pPr>
-      <w:bookmarkStart w:id="128" w:name="__RefHeading___Toc5402_2515352571"/>
+      <w:bookmarkStart w:id="128" w:name="__RefHeading___Toc5402_863242435"/>
       <w:bookmarkEnd w:id="128"/>
       <w:r>
         <w:rPr/>
@@ -38621,7 +38621,7 @@
         <w:pStyle w:val="Heading2"/>
         <w:rPr/>
       </w:pPr>
-      <w:bookmarkStart w:id="129" w:name="__RefHeading___Toc5404_2515352571"/>
+      <w:bookmarkStart w:id="129" w:name="__RefHeading___Toc5404_863242435"/>
       <w:bookmarkEnd w:id="129"/>
       <w:r>
         <w:rPr/>
@@ -39271,7 +39271,7 @@
         <w:pStyle w:val="Heading2"/>
         <w:rPr/>
       </w:pPr>
-      <w:bookmarkStart w:id="130" w:name="__RefHeading___Toc5406_2515352571"/>
+      <w:bookmarkStart w:id="130" w:name="__RefHeading___Toc5406_863242435"/>
       <w:bookmarkEnd w:id="130"/>
       <w:r>
         <w:rPr/>
@@ -39296,7 +39296,7 @@
         <w:pStyle w:val="Heading1"/>
         <w:rPr/>
       </w:pPr>
-      <w:bookmarkStart w:id="131" w:name="__RefHeading___Toc5408_2515352571"/>
+      <w:bookmarkStart w:id="131" w:name="__RefHeading___Toc5408_863242435"/>
       <w:bookmarkEnd w:id="131"/>
       <w:r>
         <w:rPr/>
@@ -39308,7 +39308,7 @@
         <w:pStyle w:val="Heading2"/>
         <w:rPr/>
       </w:pPr>
-      <w:bookmarkStart w:id="132" w:name="__RefHeading___Toc5410_2515352571"/>
+      <w:bookmarkStart w:id="132" w:name="__RefHeading___Toc5410_863242435"/>
       <w:bookmarkEnd w:id="132"/>
       <w:r>
         <w:rPr/>
@@ -39350,7 +39350,7 @@
         <w:pStyle w:val="Heading2"/>
         <w:rPr/>
       </w:pPr>
-      <w:bookmarkStart w:id="133" w:name="__RefHeading___Toc5412_2515352571"/>
+      <w:bookmarkStart w:id="133" w:name="__RefHeading___Toc5412_863242435"/>
       <w:bookmarkEnd w:id="133"/>
       <w:r>
         <w:rPr/>
@@ -39371,7 +39371,7 @@
       </w:r>
       <w:r>
         <w:rPr/>
-        <w:t xml:space="preserve"> La réponse est positive mais nuancée. En recherche documentaire, l'architecture finale fait mieux que le RAG vectoriel sur ces catégories, mais ne se distingue que faiblement du RAG hybride. L'effet est plus net sur les réponses : l'exactitude passe de 0,12 à 0,62 sur les questions relationnelles et de 0,30 à 0,60 sur les questions multi-sauts entre le RAG vectoriel et l'architecture finale. L'hypothèse H1 n'est donc que partiellement validée : le graphe aide surtout à rassembler les faits nécessaires à la réponse, davantage qu'à classer les documents.</w:t>
+        <w:t xml:space="preserve"> La réponse est positive mais nuancée. En recherche documentaire, l'architecture finale fait mieux que le RAG vectoriel sur ces catégories, mais ne se distingue que peu ou pas du RAG hybride. L'effet est plus net sur les réponses : l'exactitude passe de 0,12 à 0,62 sur les questions relationnelles et de 0,30 à 0,60 sur les questions multi-sauts entre le RAG vectoriel et l'architecture finale. L'hypothèse H1 n'est donc que partiellement validée : le graphe aide surtout à rassembler les faits nécessaires à la réponse, davantage qu'à classer les documents.</w:t>
       </w:r>
     </w:p>
     <w:p>
@@ -39457,7 +39457,7 @@
         <w:pStyle w:val="Heading2"/>
         <w:rPr/>
       </w:pPr>
-      <w:bookmarkStart w:id="134" w:name="__RefHeading___Toc5414_2515352571"/>
+      <w:bookmarkStart w:id="134" w:name="__RefHeading___Toc5414_863242435"/>
       <w:bookmarkEnd w:id="134"/>
       <w:r>
         <w:rPr/>
@@ -39479,7 +39479,7 @@
         <w:pStyle w:val="Heading2"/>
         <w:rPr/>
       </w:pPr>
-      <w:bookmarkStart w:id="135" w:name="__RefHeading___Toc5416_2515352571"/>
+      <w:bookmarkStart w:id="135" w:name="__RefHeading___Toc5416_863242435"/>
       <w:bookmarkEnd w:id="135"/>
       <w:r>
         <w:rPr/>
@@ -39501,7 +39501,7 @@
         <w:pStyle w:val="Heading2"/>
         <w:rPr/>
       </w:pPr>
-      <w:bookmarkStart w:id="136" w:name="__RefHeading___Toc5418_2515352571"/>
+      <w:bookmarkStart w:id="136" w:name="__RefHeading___Toc5418_863242435"/>
       <w:bookmarkEnd w:id="136"/>
       <w:r>
         <w:rPr/>
@@ -39662,7 +39662,7 @@
         <w:pStyle w:val="Heading1"/>
         <w:rPr/>
       </w:pPr>
-      <w:bookmarkStart w:id="137" w:name="__RefHeading___Toc5420_2515352571"/>
+      <w:bookmarkStart w:id="137" w:name="__RefHeading___Toc5420_863242435"/>
       <w:bookmarkEnd w:id="137"/>
       <w:r>
         <w:rPr/>
@@ -39684,7 +39684,7 @@
         <w:pStyle w:val="Heading2"/>
         <w:rPr/>
       </w:pPr>
-      <w:bookmarkStart w:id="138" w:name="__RefHeading___Toc5422_2515352571"/>
+      <w:bookmarkStart w:id="138" w:name="__RefHeading___Toc5422_863242435"/>
       <w:bookmarkEnd w:id="138"/>
       <w:r>
         <w:rPr/>
@@ -40700,7 +40700,7 @@
         <w:pStyle w:val="Heading2"/>
         <w:rPr/>
       </w:pPr>
-      <w:bookmarkStart w:id="139" w:name="__RefHeading___Toc5424_2515352571"/>
+      <w:bookmarkStart w:id="139" w:name="__RefHeading___Toc5424_863242435"/>
       <w:bookmarkEnd w:id="139"/>
       <w:r>
         <w:rPr/>
@@ -40851,7 +40851,7 @@
         <w:pStyle w:val="Heading1"/>
         <w:rPr/>
       </w:pPr>
-      <w:bookmarkStart w:id="140" w:name="__RefHeading___Toc5426_2515352571"/>
+      <w:bookmarkStart w:id="140" w:name="__RefHeading___Toc5426_863242435"/>
       <w:bookmarkEnd w:id="140"/>
       <w:r>
         <w:rPr/>
@@ -40885,7 +40885,7 @@
         <w:pStyle w:val="Heading2"/>
         <w:rPr/>
       </w:pPr>
-      <w:bookmarkStart w:id="141" w:name="__RefHeading___Toc5428_2515352571"/>
+      <w:bookmarkStart w:id="141" w:name="__RefHeading___Toc5428_863242435"/>
       <w:bookmarkEnd w:id="141"/>
       <w:r>
         <w:rPr/>
@@ -41683,7 +41683,7 @@
         <w:pStyle w:val="Heading2"/>
         <w:rPr/>
       </w:pPr>
-      <w:bookmarkStart w:id="142" w:name="__RefHeading___Toc5430_2515352571"/>
+      <w:bookmarkStart w:id="142" w:name="__RefHeading___Toc5430_863242435"/>
       <w:bookmarkEnd w:id="142"/>
       <w:r>
         <w:rPr/>
@@ -43829,7 +43829,7 @@
         <w:pStyle w:val="Heading2"/>
         <w:rPr/>
       </w:pPr>
-      <w:bookmarkStart w:id="143" w:name="__RefHeading___Toc5432_2515352571"/>
+      <w:bookmarkStart w:id="143" w:name="__RefHeading___Toc5432_863242435"/>
       <w:bookmarkEnd w:id="143"/>
       <w:r>
         <w:rPr/>
@@ -44032,7 +44032,7 @@
         <w:pStyle w:val="Heading1"/>
         <w:rPr/>
       </w:pPr>
-      <w:bookmarkStart w:id="144" w:name="__RefHeading___Toc5434_2515352571"/>
+      <w:bookmarkStart w:id="144" w:name="__RefHeading___Toc5434_863242435"/>
       <w:bookmarkEnd w:id="144"/>
       <w:r>
         <w:rPr/>
@@ -50383,7 +50383,7 @@
         <w:pStyle w:val="Heading1"/>
         <w:rPr/>
       </w:pPr>
-      <w:bookmarkStart w:id="145" w:name="__RefHeading___Toc5436_2515352571"/>
+      <w:bookmarkStart w:id="145" w:name="__RefHeading___Toc5436_863242435"/>
       <w:bookmarkEnd w:id="145"/>
       <w:r>
         <w:rPr/>
@@ -51795,7 +51795,7 @@
         <w:pStyle w:val="Heading1"/>
         <w:rPr/>
       </w:pPr>
-      <w:bookmarkStart w:id="146" w:name="__RefHeading___Toc5438_2515352571"/>
+      <w:bookmarkStart w:id="146" w:name="__RefHeading___Toc5438_863242435"/>
       <w:bookmarkEnd w:id="146"/>
       <w:r>
         <w:rPr/>
@@ -51817,7 +51817,7 @@
         <w:pStyle w:val="Heading2"/>
         <w:rPr/>
       </w:pPr>
-      <w:bookmarkStart w:id="147" w:name="__RefHeading___Toc5440_2515352571"/>
+      <w:bookmarkStart w:id="147" w:name="__RefHeading___Toc5440_863242435"/>
       <w:bookmarkEnd w:id="147"/>
       <w:r>
         <w:rPr/>
@@ -51866,7 +51866,7 @@
         <w:pStyle w:val="Heading2"/>
         <w:rPr/>
       </w:pPr>
-      <w:bookmarkStart w:id="148" w:name="__RefHeading___Toc5442_2515352571"/>
+      <w:bookmarkStart w:id="148" w:name="__RefHeading___Toc5442_863242435"/>
       <w:bookmarkEnd w:id="148"/>
       <w:r>
         <w:rPr/>
@@ -51915,7 +51915,7 @@
         <w:pStyle w:val="Heading2"/>
         <w:rPr/>
       </w:pPr>
-      <w:bookmarkStart w:id="149" w:name="__RefHeading___Toc5444_2515352571"/>
+      <w:bookmarkStart w:id="149" w:name="__RefHeading___Toc5444_863242435"/>
       <w:bookmarkEnd w:id="149"/>
       <w:r>
         <w:rPr/>
@@ -51964,7 +51964,7 @@
         <w:pStyle w:val="Heading2"/>
         <w:rPr/>
       </w:pPr>
-      <w:bookmarkStart w:id="150" w:name="__RefHeading___Toc5446_2515352571"/>
+      <w:bookmarkStart w:id="150" w:name="__RefHeading___Toc5446_863242435"/>
       <w:bookmarkEnd w:id="150"/>
       <w:r>
         <w:rPr/>
@@ -52037,7 +52037,7 @@
         <w:pStyle w:val="Heading2"/>
         <w:rPr/>
       </w:pPr>
-      <w:bookmarkStart w:id="151" w:name="__RefHeading___Toc5448_2515352571"/>
+      <w:bookmarkStart w:id="151" w:name="__RefHeading___Toc5448_863242435"/>
       <w:bookmarkEnd w:id="151"/>
       <w:r>
         <w:rPr/>
@@ -52086,7 +52086,7 @@
         <w:pStyle w:val="Heading2"/>
         <w:rPr/>
       </w:pPr>
-      <w:bookmarkStart w:id="152" w:name="__RefHeading___Toc5450_2515352571"/>
+      <w:bookmarkStart w:id="152" w:name="__RefHeading___Toc5450_863242435"/>
       <w:bookmarkEnd w:id="152"/>
       <w:r>
         <w:rPr/>
@@ -52138,7 +52138,7 @@
         <w:pStyle w:val="Heading1"/>
         <w:rPr/>
       </w:pPr>
-      <w:bookmarkStart w:id="153" w:name="__RefHeading___Toc5452_2515352571"/>
+      <w:bookmarkStart w:id="153" w:name="__RefHeading___Toc5452_863242435"/>
       <w:bookmarkEnd w:id="153"/>
       <w:r>
         <w:rPr/>
@@ -53630,7 +53630,7 @@
         <w:pStyle w:val="Heading1"/>
         <w:rPr/>
       </w:pPr>
-      <w:bookmarkStart w:id="154" w:name="__RefHeading___Toc5454_2515352571"/>
+      <w:bookmarkStart w:id="154" w:name="__RefHeading___Toc5454_863242435"/>
       <w:bookmarkEnd w:id="154"/>
       <w:r>
         <w:rPr/>

</xml_diff>

<commit_message>
Corriger trois défauts de sécurité relevés en revue et auditer les droits avec des comptes restreints
- Refus par défaut : un document sans diffusion déclarée est rejeté au lieu d'être diffusé à tous.
- L'assistant ne sert le classement d'experts qu'au rôle manager, comme la page Experts.
- LLM_EXTRACTION_ENABLED règle désormais l'extraction LLM par défaut à l'ingestion.
- Audit evaluation/access_audit.py : 66 questions, 5 architectures, 3 comptes restreints,
  990 réponses, 0 fuite. Rejeu de la campagne gelée : 0 différence sur 660 lignes.
- Tests ajoutés (106 cas) ; mémoire, présentation et fiches mis à jour.

Co-Authored-By: Claude Opus 5.5 <noreply@anthropic.com>
Claude-Session: https://claude.ai/code/session_01NrE4ofTo5apA1G8EiH67WD
</commit_message>
<xml_diff>
--- a/RAG/RAPPORT ET PRESENTATION/Memoire_PFE_Knowledge_Graph_LLM.docx
+++ b/RAG/RAPPORT ET PRESENTATION/Memoire_PFE_Knowledge_Graph_LLM.docx
@@ -394,7 +394,7 @@
             </w:rPr>
             <w:fldChar w:fldCharType="separate"/>
           </w:r>
-          <w:hyperlink w:anchor="__RefHeading___Toc5146_863242435">
+          <w:hyperlink w:anchor="__RefHeading___Toc5159_644927476">
             <w:r>
               <w:rPr>
                 <w:rStyle w:val="IndexLink"/>
@@ -414,7 +414,7 @@
             </w:tabs>
             <w:rPr/>
           </w:pPr>
-          <w:hyperlink w:anchor="__RefHeading___Toc5148_863242435">
+          <w:hyperlink w:anchor="__RefHeading___Toc5161_644927476">
             <w:r>
               <w:rPr>
                 <w:rStyle w:val="IndexLink"/>
@@ -434,7 +434,7 @@
             </w:tabs>
             <w:rPr/>
           </w:pPr>
-          <w:hyperlink w:anchor="__RefHeading___Toc5150_863242435">
+          <w:hyperlink w:anchor="__RefHeading___Toc5163_644927476">
             <w:r>
               <w:rPr>
                 <w:rStyle w:val="IndexLink"/>
@@ -454,7 +454,7 @@
             </w:tabs>
             <w:rPr/>
           </w:pPr>
-          <w:hyperlink w:anchor="__RefHeading___Toc5152_863242435">
+          <w:hyperlink w:anchor="__RefHeading___Toc5165_644927476">
             <w:r>
               <w:rPr>
                 <w:rStyle w:val="IndexLink"/>
@@ -474,7 +474,7 @@
             </w:tabs>
             <w:rPr/>
           </w:pPr>
-          <w:hyperlink w:anchor="__RefHeading___Toc5154_863242435">
+          <w:hyperlink w:anchor="__RefHeading___Toc5167_644927476">
             <w:r>
               <w:rPr>
                 <w:rStyle w:val="IndexLink"/>
@@ -494,7 +494,7 @@
             </w:tabs>
             <w:rPr/>
           </w:pPr>
-          <w:hyperlink w:anchor="__RefHeading___Toc5156_863242435">
+          <w:hyperlink w:anchor="__RefHeading___Toc5169_644927476">
             <w:r>
               <w:rPr>
                 <w:rStyle w:val="IndexLink"/>
@@ -514,7 +514,7 @@
             </w:tabs>
             <w:rPr/>
           </w:pPr>
-          <w:hyperlink w:anchor="__RefHeading___Toc5158_863242435">
+          <w:hyperlink w:anchor="__RefHeading___Toc5171_644927476">
             <w:r>
               <w:rPr>
                 <w:rStyle w:val="IndexLink"/>
@@ -534,7 +534,7 @@
             </w:tabs>
             <w:rPr/>
           </w:pPr>
-          <w:hyperlink w:anchor="__RefHeading___Toc5160_863242435">
+          <w:hyperlink w:anchor="__RefHeading___Toc5173_644927476">
             <w:r>
               <w:rPr>
                 <w:rStyle w:val="IndexLink"/>
@@ -554,7 +554,7 @@
             </w:tabs>
             <w:rPr/>
           </w:pPr>
-          <w:hyperlink w:anchor="__RefHeading___Toc5162_863242435">
+          <w:hyperlink w:anchor="__RefHeading___Toc5175_644927476">
             <w:r>
               <w:rPr>
                 <w:rStyle w:val="IndexLink"/>
@@ -574,7 +574,7 @@
             </w:tabs>
             <w:rPr/>
           </w:pPr>
-          <w:hyperlink w:anchor="__RefHeading___Toc5164_863242435">
+          <w:hyperlink w:anchor="__RefHeading___Toc5177_644927476">
             <w:r>
               <w:rPr>
                 <w:rStyle w:val="IndexLink"/>
@@ -594,7 +594,7 @@
             </w:tabs>
             <w:rPr/>
           </w:pPr>
-          <w:hyperlink w:anchor="__RefHeading___Toc5166_863242435">
+          <w:hyperlink w:anchor="__RefHeading___Toc5179_644927476">
             <w:r>
               <w:rPr>
                 <w:rStyle w:val="IndexLink"/>
@@ -614,7 +614,7 @@
             </w:tabs>
             <w:rPr/>
           </w:pPr>
-          <w:hyperlink w:anchor="__RefHeading___Toc5168_863242435">
+          <w:hyperlink w:anchor="__RefHeading___Toc5181_644927476">
             <w:r>
               <w:rPr>
                 <w:rStyle w:val="IndexLink"/>
@@ -634,7 +634,7 @@
             </w:tabs>
             <w:rPr/>
           </w:pPr>
-          <w:hyperlink w:anchor="__RefHeading___Toc5170_863242435">
+          <w:hyperlink w:anchor="__RefHeading___Toc5183_644927476">
             <w:r>
               <w:rPr>
                 <w:rStyle w:val="IndexLink"/>
@@ -654,7 +654,7 @@
             </w:tabs>
             <w:rPr/>
           </w:pPr>
-          <w:hyperlink w:anchor="__RefHeading___Toc5172_863242435">
+          <w:hyperlink w:anchor="__RefHeading___Toc5185_644927476">
             <w:r>
               <w:rPr>
                 <w:rStyle w:val="IndexLink"/>
@@ -674,7 +674,7 @@
             </w:tabs>
             <w:rPr/>
           </w:pPr>
-          <w:hyperlink w:anchor="__RefHeading___Toc5174_863242435">
+          <w:hyperlink w:anchor="__RefHeading___Toc5187_644927476">
             <w:r>
               <w:rPr>
                 <w:rStyle w:val="IndexLink"/>
@@ -694,7 +694,7 @@
             </w:tabs>
             <w:rPr/>
           </w:pPr>
-          <w:hyperlink w:anchor="__RefHeading___Toc5176_863242435">
+          <w:hyperlink w:anchor="__RefHeading___Toc5189_644927476">
             <w:r>
               <w:rPr>
                 <w:rStyle w:val="IndexLink"/>
@@ -714,7 +714,7 @@
             </w:tabs>
             <w:rPr/>
           </w:pPr>
-          <w:hyperlink w:anchor="__RefHeading___Toc5178_863242435">
+          <w:hyperlink w:anchor="__RefHeading___Toc5191_644927476">
             <w:r>
               <w:rPr>
                 <w:rStyle w:val="IndexLink"/>
@@ -734,7 +734,7 @@
             </w:tabs>
             <w:rPr/>
           </w:pPr>
-          <w:hyperlink w:anchor="__RefHeading___Toc5180_863242435">
+          <w:hyperlink w:anchor="__RefHeading___Toc5193_644927476">
             <w:r>
               <w:rPr>
                 <w:rStyle w:val="IndexLink"/>
@@ -754,7 +754,7 @@
             </w:tabs>
             <w:rPr/>
           </w:pPr>
-          <w:hyperlink w:anchor="__RefHeading___Toc5182_863242435">
+          <w:hyperlink w:anchor="__RefHeading___Toc5195_644927476">
             <w:r>
               <w:rPr>
                 <w:rStyle w:val="IndexLink"/>
@@ -774,7 +774,7 @@
             </w:tabs>
             <w:rPr/>
           </w:pPr>
-          <w:hyperlink w:anchor="__RefHeading___Toc5184_863242435">
+          <w:hyperlink w:anchor="__RefHeading___Toc5197_644927476">
             <w:r>
               <w:rPr>
                 <w:rStyle w:val="IndexLink"/>
@@ -794,7 +794,7 @@
             </w:tabs>
             <w:rPr/>
           </w:pPr>
-          <w:hyperlink w:anchor="__RefHeading___Toc5186_863242435">
+          <w:hyperlink w:anchor="__RefHeading___Toc5199_644927476">
             <w:r>
               <w:rPr>
                 <w:rStyle w:val="IndexLink"/>
@@ -814,7 +814,7 @@
             </w:tabs>
             <w:rPr/>
           </w:pPr>
-          <w:hyperlink w:anchor="__RefHeading___Toc5188_863242435">
+          <w:hyperlink w:anchor="__RefHeading___Toc5201_644927476">
             <w:r>
               <w:rPr>
                 <w:rStyle w:val="IndexLink"/>
@@ -834,7 +834,7 @@
             </w:tabs>
             <w:rPr/>
           </w:pPr>
-          <w:hyperlink w:anchor="__RefHeading___Toc5190_863242435">
+          <w:hyperlink w:anchor="__RefHeading___Toc5203_644927476">
             <w:r>
               <w:rPr>
                 <w:rStyle w:val="IndexLink"/>
@@ -854,7 +854,7 @@
             </w:tabs>
             <w:rPr/>
           </w:pPr>
-          <w:hyperlink w:anchor="__RefHeading___Toc5192_863242435">
+          <w:hyperlink w:anchor="__RefHeading___Toc5205_644927476">
             <w:r>
               <w:rPr>
                 <w:rStyle w:val="IndexLink"/>
@@ -874,7 +874,7 @@
             </w:tabs>
             <w:rPr/>
           </w:pPr>
-          <w:hyperlink w:anchor="__RefHeading___Toc5194_863242435">
+          <w:hyperlink w:anchor="__RefHeading___Toc5207_644927476">
             <w:r>
               <w:rPr>
                 <w:rStyle w:val="IndexLink"/>
@@ -894,7 +894,7 @@
             </w:tabs>
             <w:rPr/>
           </w:pPr>
-          <w:hyperlink w:anchor="__RefHeading___Toc5196_863242435">
+          <w:hyperlink w:anchor="__RefHeading___Toc5209_644927476">
             <w:r>
               <w:rPr>
                 <w:rStyle w:val="IndexLink"/>
@@ -914,7 +914,7 @@
             </w:tabs>
             <w:rPr/>
           </w:pPr>
-          <w:hyperlink w:anchor="__RefHeading___Toc5198_863242435">
+          <w:hyperlink w:anchor="__RefHeading___Toc5211_644927476">
             <w:r>
               <w:rPr>
                 <w:rStyle w:val="IndexLink"/>
@@ -934,7 +934,7 @@
             </w:tabs>
             <w:rPr/>
           </w:pPr>
-          <w:hyperlink w:anchor="__RefHeading___Toc5200_863242435">
+          <w:hyperlink w:anchor="__RefHeading___Toc5213_644927476">
             <w:r>
               <w:rPr>
                 <w:rStyle w:val="IndexLink"/>
@@ -954,7 +954,7 @@
             </w:tabs>
             <w:rPr/>
           </w:pPr>
-          <w:hyperlink w:anchor="__RefHeading___Toc5202_863242435">
+          <w:hyperlink w:anchor="__RefHeading___Toc5215_644927476">
             <w:r>
               <w:rPr>
                 <w:rStyle w:val="IndexLink"/>
@@ -974,7 +974,7 @@
             </w:tabs>
             <w:rPr/>
           </w:pPr>
-          <w:hyperlink w:anchor="__RefHeading___Toc5204_863242435">
+          <w:hyperlink w:anchor="__RefHeading___Toc5217_644927476">
             <w:r>
               <w:rPr>
                 <w:rStyle w:val="IndexLink"/>
@@ -994,7 +994,7 @@
             </w:tabs>
             <w:rPr/>
           </w:pPr>
-          <w:hyperlink w:anchor="__RefHeading___Toc5206_863242435">
+          <w:hyperlink w:anchor="__RefHeading___Toc5219_644927476">
             <w:r>
               <w:rPr>
                 <w:rStyle w:val="IndexLink"/>
@@ -1014,7 +1014,7 @@
             </w:tabs>
             <w:rPr/>
           </w:pPr>
-          <w:hyperlink w:anchor="__RefHeading___Toc5208_863242435">
+          <w:hyperlink w:anchor="__RefHeading___Toc5221_644927476">
             <w:r>
               <w:rPr>
                 <w:rStyle w:val="IndexLink"/>
@@ -1034,7 +1034,7 @@
             </w:tabs>
             <w:rPr/>
           </w:pPr>
-          <w:hyperlink w:anchor="__RefHeading___Toc5210_863242435">
+          <w:hyperlink w:anchor="__RefHeading___Toc5223_644927476">
             <w:r>
               <w:rPr>
                 <w:rStyle w:val="IndexLink"/>
@@ -1054,7 +1054,7 @@
             </w:tabs>
             <w:rPr/>
           </w:pPr>
-          <w:hyperlink w:anchor="__RefHeading___Toc5212_863242435">
+          <w:hyperlink w:anchor="__RefHeading___Toc5225_644927476">
             <w:r>
               <w:rPr>
                 <w:rStyle w:val="IndexLink"/>
@@ -1074,7 +1074,7 @@
             </w:tabs>
             <w:rPr/>
           </w:pPr>
-          <w:hyperlink w:anchor="__RefHeading___Toc5214_863242435">
+          <w:hyperlink w:anchor="__RefHeading___Toc5227_644927476">
             <w:r>
               <w:rPr>
                 <w:rStyle w:val="IndexLink"/>
@@ -1094,7 +1094,7 @@
             </w:tabs>
             <w:rPr/>
           </w:pPr>
-          <w:hyperlink w:anchor="__RefHeading___Toc5216_863242435">
+          <w:hyperlink w:anchor="__RefHeading___Toc5229_644927476">
             <w:r>
               <w:rPr>
                 <w:rStyle w:val="IndexLink"/>
@@ -1114,7 +1114,7 @@
             </w:tabs>
             <w:rPr/>
           </w:pPr>
-          <w:hyperlink w:anchor="__RefHeading___Toc5218_863242435">
+          <w:hyperlink w:anchor="__RefHeading___Toc5231_644927476">
             <w:r>
               <w:rPr>
                 <w:rStyle w:val="IndexLink"/>
@@ -1134,7 +1134,7 @@
             </w:tabs>
             <w:rPr/>
           </w:pPr>
-          <w:hyperlink w:anchor="__RefHeading___Toc5220_863242435">
+          <w:hyperlink w:anchor="__RefHeading___Toc5233_644927476">
             <w:r>
               <w:rPr>
                 <w:rStyle w:val="IndexLink"/>
@@ -1154,7 +1154,7 @@
             </w:tabs>
             <w:rPr/>
           </w:pPr>
-          <w:hyperlink w:anchor="__RefHeading___Toc5222_863242435">
+          <w:hyperlink w:anchor="__RefHeading___Toc5235_644927476">
             <w:r>
               <w:rPr>
                 <w:rStyle w:val="IndexLink"/>
@@ -1174,7 +1174,7 @@
             </w:tabs>
             <w:rPr/>
           </w:pPr>
-          <w:hyperlink w:anchor="__RefHeading___Toc5224_863242435">
+          <w:hyperlink w:anchor="__RefHeading___Toc5237_644927476">
             <w:r>
               <w:rPr>
                 <w:rStyle w:val="IndexLink"/>
@@ -1194,7 +1194,7 @@
             </w:tabs>
             <w:rPr/>
           </w:pPr>
-          <w:hyperlink w:anchor="__RefHeading___Toc5226_863242435">
+          <w:hyperlink w:anchor="__RefHeading___Toc5239_644927476">
             <w:r>
               <w:rPr>
                 <w:rStyle w:val="IndexLink"/>
@@ -1214,7 +1214,7 @@
             </w:tabs>
             <w:rPr/>
           </w:pPr>
-          <w:hyperlink w:anchor="__RefHeading___Toc5228_863242435">
+          <w:hyperlink w:anchor="__RefHeading___Toc5241_644927476">
             <w:r>
               <w:rPr>
                 <w:rStyle w:val="IndexLink"/>
@@ -1234,7 +1234,7 @@
             </w:tabs>
             <w:rPr/>
           </w:pPr>
-          <w:hyperlink w:anchor="__RefHeading___Toc5230_863242435">
+          <w:hyperlink w:anchor="__RefHeading___Toc5243_644927476">
             <w:r>
               <w:rPr>
                 <w:rStyle w:val="IndexLink"/>
@@ -1254,7 +1254,7 @@
             </w:tabs>
             <w:rPr/>
           </w:pPr>
-          <w:hyperlink w:anchor="__RefHeading___Toc5232_863242435">
+          <w:hyperlink w:anchor="__RefHeading___Toc5245_644927476">
             <w:r>
               <w:rPr>
                 <w:rStyle w:val="IndexLink"/>
@@ -1274,7 +1274,7 @@
             </w:tabs>
             <w:rPr/>
           </w:pPr>
-          <w:hyperlink w:anchor="__RefHeading___Toc5234_863242435">
+          <w:hyperlink w:anchor="__RefHeading___Toc5247_644927476">
             <w:r>
               <w:rPr>
                 <w:rStyle w:val="IndexLink"/>
@@ -1294,7 +1294,7 @@
             </w:tabs>
             <w:rPr/>
           </w:pPr>
-          <w:hyperlink w:anchor="__RefHeading___Toc5236_863242435">
+          <w:hyperlink w:anchor="__RefHeading___Toc5249_644927476">
             <w:r>
               <w:rPr>
                 <w:rStyle w:val="IndexLink"/>
@@ -1314,7 +1314,7 @@
             </w:tabs>
             <w:rPr/>
           </w:pPr>
-          <w:hyperlink w:anchor="__RefHeading___Toc5238_863242435">
+          <w:hyperlink w:anchor="__RefHeading___Toc5251_644927476">
             <w:r>
               <w:rPr>
                 <w:rStyle w:val="IndexLink"/>
@@ -1334,7 +1334,7 @@
             </w:tabs>
             <w:rPr/>
           </w:pPr>
-          <w:hyperlink w:anchor="__RefHeading___Toc5240_863242435">
+          <w:hyperlink w:anchor="__RefHeading___Toc5253_644927476">
             <w:r>
               <w:rPr>
                 <w:rStyle w:val="IndexLink"/>
@@ -1354,7 +1354,7 @@
             </w:tabs>
             <w:rPr/>
           </w:pPr>
-          <w:hyperlink w:anchor="__RefHeading___Toc5242_863242435">
+          <w:hyperlink w:anchor="__RefHeading___Toc5255_644927476">
             <w:r>
               <w:rPr>
                 <w:rStyle w:val="IndexLink"/>
@@ -1374,7 +1374,7 @@
             </w:tabs>
             <w:rPr/>
           </w:pPr>
-          <w:hyperlink w:anchor="__RefHeading___Toc5244_863242435">
+          <w:hyperlink w:anchor="__RefHeading___Toc5257_644927476">
             <w:r>
               <w:rPr>
                 <w:rStyle w:val="IndexLink"/>
@@ -1394,7 +1394,7 @@
             </w:tabs>
             <w:rPr/>
           </w:pPr>
-          <w:hyperlink w:anchor="__RefHeading___Toc5246_863242435">
+          <w:hyperlink w:anchor="__RefHeading___Toc5259_644927476">
             <w:r>
               <w:rPr>
                 <w:rStyle w:val="IndexLink"/>
@@ -1414,7 +1414,7 @@
             </w:tabs>
             <w:rPr/>
           </w:pPr>
-          <w:hyperlink w:anchor="__RefHeading___Toc5248_863242435">
+          <w:hyperlink w:anchor="__RefHeading___Toc5261_644927476">
             <w:r>
               <w:rPr>
                 <w:rStyle w:val="IndexLink"/>
@@ -1434,7 +1434,7 @@
             </w:tabs>
             <w:rPr/>
           </w:pPr>
-          <w:hyperlink w:anchor="__RefHeading___Toc5250_863242435">
+          <w:hyperlink w:anchor="__RefHeading___Toc5263_644927476">
             <w:r>
               <w:rPr>
                 <w:rStyle w:val="IndexLink"/>
@@ -1454,7 +1454,7 @@
             </w:tabs>
             <w:rPr/>
           </w:pPr>
-          <w:hyperlink w:anchor="__RefHeading___Toc5252_863242435">
+          <w:hyperlink w:anchor="__RefHeading___Toc5265_644927476">
             <w:r>
               <w:rPr>
                 <w:rStyle w:val="IndexLink"/>
@@ -1474,7 +1474,7 @@
             </w:tabs>
             <w:rPr/>
           </w:pPr>
-          <w:hyperlink w:anchor="__RefHeading___Toc5254_863242435">
+          <w:hyperlink w:anchor="__RefHeading___Toc5267_644927476">
             <w:r>
               <w:rPr>
                 <w:rStyle w:val="IndexLink"/>
@@ -1494,7 +1494,7 @@
             </w:tabs>
             <w:rPr/>
           </w:pPr>
-          <w:hyperlink w:anchor="__RefHeading___Toc5256_863242435">
+          <w:hyperlink w:anchor="__RefHeading___Toc5269_644927476">
             <w:r>
               <w:rPr>
                 <w:rStyle w:val="IndexLink"/>
@@ -1514,7 +1514,7 @@
             </w:tabs>
             <w:rPr/>
           </w:pPr>
-          <w:hyperlink w:anchor="__RefHeading___Toc5258_863242435">
+          <w:hyperlink w:anchor="__RefHeading___Toc5271_644927476">
             <w:r>
               <w:rPr>
                 <w:rStyle w:val="IndexLink"/>
@@ -1534,7 +1534,7 @@
             </w:tabs>
             <w:rPr/>
           </w:pPr>
-          <w:hyperlink w:anchor="__RefHeading___Toc5260_863242435">
+          <w:hyperlink w:anchor="__RefHeading___Toc5273_644927476">
             <w:r>
               <w:rPr>
                 <w:rStyle w:val="IndexLink"/>
@@ -1554,7 +1554,7 @@
             </w:tabs>
             <w:rPr/>
           </w:pPr>
-          <w:hyperlink w:anchor="__RefHeading___Toc5262_863242435">
+          <w:hyperlink w:anchor="__RefHeading___Toc5275_644927476">
             <w:r>
               <w:rPr>
                 <w:rStyle w:val="IndexLink"/>
@@ -1574,7 +1574,7 @@
             </w:tabs>
             <w:rPr/>
           </w:pPr>
-          <w:hyperlink w:anchor="__RefHeading___Toc5264_863242435">
+          <w:hyperlink w:anchor="__RefHeading___Toc5277_644927476">
             <w:r>
               <w:rPr>
                 <w:rStyle w:val="IndexLink"/>
@@ -1594,7 +1594,7 @@
             </w:tabs>
             <w:rPr/>
           </w:pPr>
-          <w:hyperlink w:anchor="__RefHeading___Toc5266_863242435">
+          <w:hyperlink w:anchor="__RefHeading___Toc5279_644927476">
             <w:r>
               <w:rPr>
                 <w:rStyle w:val="IndexLink"/>
@@ -1614,7 +1614,7 @@
             </w:tabs>
             <w:rPr/>
           </w:pPr>
-          <w:hyperlink w:anchor="__RefHeading___Toc5268_863242435">
+          <w:hyperlink w:anchor="__RefHeading___Toc5281_644927476">
             <w:r>
               <w:rPr>
                 <w:rStyle w:val="IndexLink"/>
@@ -1634,7 +1634,7 @@
             </w:tabs>
             <w:rPr/>
           </w:pPr>
-          <w:hyperlink w:anchor="__RefHeading___Toc5270_863242435">
+          <w:hyperlink w:anchor="__RefHeading___Toc5283_644927476">
             <w:r>
               <w:rPr>
                 <w:rStyle w:val="IndexLink"/>
@@ -1654,7 +1654,7 @@
             </w:tabs>
             <w:rPr/>
           </w:pPr>
-          <w:hyperlink w:anchor="__RefHeading___Toc5272_863242435">
+          <w:hyperlink w:anchor="__RefHeading___Toc5285_644927476">
             <w:r>
               <w:rPr>
                 <w:rStyle w:val="IndexLink"/>
@@ -1674,7 +1674,7 @@
             </w:tabs>
             <w:rPr/>
           </w:pPr>
-          <w:hyperlink w:anchor="__RefHeading___Toc5274_863242435">
+          <w:hyperlink w:anchor="__RefHeading___Toc5287_644927476">
             <w:r>
               <w:rPr>
                 <w:rStyle w:val="IndexLink"/>
@@ -1694,7 +1694,7 @@
             </w:tabs>
             <w:rPr/>
           </w:pPr>
-          <w:hyperlink w:anchor="__RefHeading___Toc5276_863242435">
+          <w:hyperlink w:anchor="__RefHeading___Toc5289_644927476">
             <w:r>
               <w:rPr>
                 <w:rStyle w:val="IndexLink"/>
@@ -1714,7 +1714,7 @@
             </w:tabs>
             <w:rPr/>
           </w:pPr>
-          <w:hyperlink w:anchor="__RefHeading___Toc5278_863242435">
+          <w:hyperlink w:anchor="__RefHeading___Toc5291_644927476">
             <w:r>
               <w:rPr>
                 <w:rStyle w:val="IndexLink"/>
@@ -1734,7 +1734,7 @@
             </w:tabs>
             <w:rPr/>
           </w:pPr>
-          <w:hyperlink w:anchor="__RefHeading___Toc5280_863242435">
+          <w:hyperlink w:anchor="__RefHeading___Toc5293_644927476">
             <w:r>
               <w:rPr>
                 <w:rStyle w:val="IndexLink"/>
@@ -1754,7 +1754,7 @@
             </w:tabs>
             <w:rPr/>
           </w:pPr>
-          <w:hyperlink w:anchor="__RefHeading___Toc5282_863242435">
+          <w:hyperlink w:anchor="__RefHeading___Toc5295_644927476">
             <w:r>
               <w:rPr>
                 <w:rStyle w:val="IndexLink"/>
@@ -1774,7 +1774,7 @@
             </w:tabs>
             <w:rPr/>
           </w:pPr>
-          <w:hyperlink w:anchor="__RefHeading___Toc5284_863242435">
+          <w:hyperlink w:anchor="__RefHeading___Toc5297_644927476">
             <w:r>
               <w:rPr>
                 <w:rStyle w:val="IndexLink"/>
@@ -1794,7 +1794,7 @@
             </w:tabs>
             <w:rPr/>
           </w:pPr>
-          <w:hyperlink w:anchor="__RefHeading___Toc5286_863242435">
+          <w:hyperlink w:anchor="__RefHeading___Toc5299_644927476">
             <w:r>
               <w:rPr>
                 <w:rStyle w:val="IndexLink"/>
@@ -1814,7 +1814,7 @@
             </w:tabs>
             <w:rPr/>
           </w:pPr>
-          <w:hyperlink w:anchor="__RefHeading___Toc5288_863242435">
+          <w:hyperlink w:anchor="__RefHeading___Toc5301_644927476">
             <w:r>
               <w:rPr>
                 <w:rStyle w:val="IndexLink"/>
@@ -1834,7 +1834,7 @@
             </w:tabs>
             <w:rPr/>
           </w:pPr>
-          <w:hyperlink w:anchor="__RefHeading___Toc5290_863242435">
+          <w:hyperlink w:anchor="__RefHeading___Toc5303_644927476">
             <w:r>
               <w:rPr>
                 <w:rStyle w:val="IndexLink"/>
@@ -1854,7 +1854,7 @@
             </w:tabs>
             <w:rPr/>
           </w:pPr>
-          <w:hyperlink w:anchor="__RefHeading___Toc5292_863242435">
+          <w:hyperlink w:anchor="__RefHeading___Toc5305_644927476">
             <w:r>
               <w:rPr>
                 <w:rStyle w:val="IndexLink"/>
@@ -1874,7 +1874,7 @@
             </w:tabs>
             <w:rPr/>
           </w:pPr>
-          <w:hyperlink w:anchor="__RefHeading___Toc5294_863242435">
+          <w:hyperlink w:anchor="__RefHeading___Toc5307_644927476">
             <w:r>
               <w:rPr>
                 <w:rStyle w:val="IndexLink"/>
@@ -1894,7 +1894,7 @@
             </w:tabs>
             <w:rPr/>
           </w:pPr>
-          <w:hyperlink w:anchor="__RefHeading___Toc5296_863242435">
+          <w:hyperlink w:anchor="__RefHeading___Toc5309_644927476">
             <w:r>
               <w:rPr>
                 <w:rStyle w:val="IndexLink"/>
@@ -1914,7 +1914,7 @@
             </w:tabs>
             <w:rPr/>
           </w:pPr>
-          <w:hyperlink w:anchor="__RefHeading___Toc5298_863242435">
+          <w:hyperlink w:anchor="__RefHeading___Toc5311_644927476">
             <w:r>
               <w:rPr>
                 <w:rStyle w:val="IndexLink"/>
@@ -1934,7 +1934,7 @@
             </w:tabs>
             <w:rPr/>
           </w:pPr>
-          <w:hyperlink w:anchor="__RefHeading___Toc5300_863242435">
+          <w:hyperlink w:anchor="__RefHeading___Toc5313_644927476">
             <w:r>
               <w:rPr>
                 <w:rStyle w:val="IndexLink"/>
@@ -1954,7 +1954,7 @@
             </w:tabs>
             <w:rPr/>
           </w:pPr>
-          <w:hyperlink w:anchor="__RefHeading___Toc5302_863242435">
+          <w:hyperlink w:anchor="__RefHeading___Toc5315_644927476">
             <w:r>
               <w:rPr>
                 <w:rStyle w:val="IndexLink"/>
@@ -1974,7 +1974,7 @@
             </w:tabs>
             <w:rPr/>
           </w:pPr>
-          <w:hyperlink w:anchor="__RefHeading___Toc5304_863242435">
+          <w:hyperlink w:anchor="__RefHeading___Toc5317_644927476">
             <w:r>
               <w:rPr>
                 <w:rStyle w:val="IndexLink"/>
@@ -1994,7 +1994,7 @@
             </w:tabs>
             <w:rPr/>
           </w:pPr>
-          <w:hyperlink w:anchor="__RefHeading___Toc5306_863242435">
+          <w:hyperlink w:anchor="__RefHeading___Toc5319_644927476">
             <w:r>
               <w:rPr>
                 <w:rStyle w:val="IndexLink"/>
@@ -2014,7 +2014,7 @@
             </w:tabs>
             <w:rPr/>
           </w:pPr>
-          <w:hyperlink w:anchor="__RefHeading___Toc5308_863242435">
+          <w:hyperlink w:anchor="__RefHeading___Toc5321_644927476">
             <w:r>
               <w:rPr>
                 <w:rStyle w:val="IndexLink"/>
@@ -2034,7 +2034,7 @@
             </w:tabs>
             <w:rPr/>
           </w:pPr>
-          <w:hyperlink w:anchor="__RefHeading___Toc5310_863242435">
+          <w:hyperlink w:anchor="__RefHeading___Toc5323_644927476">
             <w:r>
               <w:rPr>
                 <w:rStyle w:val="IndexLink"/>
@@ -2054,7 +2054,7 @@
             </w:tabs>
             <w:rPr/>
           </w:pPr>
-          <w:hyperlink w:anchor="__RefHeading___Toc5312_863242435">
+          <w:hyperlink w:anchor="__RefHeading___Toc5325_644927476">
             <w:r>
               <w:rPr>
                 <w:rStyle w:val="IndexLink"/>
@@ -2074,7 +2074,7 @@
             </w:tabs>
             <w:rPr/>
           </w:pPr>
-          <w:hyperlink w:anchor="__RefHeading___Toc5314_863242435">
+          <w:hyperlink w:anchor="__RefHeading___Toc5327_644927476">
             <w:r>
               <w:rPr>
                 <w:rStyle w:val="IndexLink"/>
@@ -2094,7 +2094,7 @@
             </w:tabs>
             <w:rPr/>
           </w:pPr>
-          <w:hyperlink w:anchor="__RefHeading___Toc5316_863242435">
+          <w:hyperlink w:anchor="__RefHeading___Toc5329_644927476">
             <w:r>
               <w:rPr>
                 <w:rStyle w:val="IndexLink"/>
@@ -2114,7 +2114,7 @@
             </w:tabs>
             <w:rPr/>
           </w:pPr>
-          <w:hyperlink w:anchor="__RefHeading___Toc5318_863242435">
+          <w:hyperlink w:anchor="__RefHeading___Toc5331_644927476">
             <w:r>
               <w:rPr>
                 <w:rStyle w:val="IndexLink"/>
@@ -2134,7 +2134,7 @@
             </w:tabs>
             <w:rPr/>
           </w:pPr>
-          <w:hyperlink w:anchor="__RefHeading___Toc5320_863242435">
+          <w:hyperlink w:anchor="__RefHeading___Toc5333_644927476">
             <w:r>
               <w:rPr>
                 <w:rStyle w:val="IndexLink"/>
@@ -2154,7 +2154,7 @@
             </w:tabs>
             <w:rPr/>
           </w:pPr>
-          <w:hyperlink w:anchor="__RefHeading___Toc5322_863242435">
+          <w:hyperlink w:anchor="__RefHeading___Toc5335_644927476">
             <w:r>
               <w:rPr>
                 <w:rStyle w:val="IndexLink"/>
@@ -2174,7 +2174,7 @@
             </w:tabs>
             <w:rPr/>
           </w:pPr>
-          <w:hyperlink w:anchor="__RefHeading___Toc5324_863242435">
+          <w:hyperlink w:anchor="__RefHeading___Toc5337_644927476">
             <w:r>
               <w:rPr>
                 <w:rStyle w:val="IndexLink"/>
@@ -2194,7 +2194,7 @@
             </w:tabs>
             <w:rPr/>
           </w:pPr>
-          <w:hyperlink w:anchor="__RefHeading___Toc5326_863242435">
+          <w:hyperlink w:anchor="__RefHeading___Toc5339_644927476">
             <w:r>
               <w:rPr>
                 <w:rStyle w:val="IndexLink"/>
@@ -2214,7 +2214,7 @@
             </w:tabs>
             <w:rPr/>
           </w:pPr>
-          <w:hyperlink w:anchor="__RefHeading___Toc5328_863242435">
+          <w:hyperlink w:anchor="__RefHeading___Toc5341_644927476">
             <w:r>
               <w:rPr>
                 <w:rStyle w:val="IndexLink"/>
@@ -2234,7 +2234,7 @@
             </w:tabs>
             <w:rPr/>
           </w:pPr>
-          <w:hyperlink w:anchor="__RefHeading___Toc5330_863242435">
+          <w:hyperlink w:anchor="__RefHeading___Toc5343_644927476">
             <w:r>
               <w:rPr>
                 <w:rStyle w:val="IndexLink"/>
@@ -2254,7 +2254,7 @@
             </w:tabs>
             <w:rPr/>
           </w:pPr>
-          <w:hyperlink w:anchor="__RefHeading___Toc5332_863242435">
+          <w:hyperlink w:anchor="__RefHeading___Toc5345_644927476">
             <w:r>
               <w:rPr>
                 <w:rStyle w:val="IndexLink"/>
@@ -2274,7 +2274,7 @@
             </w:tabs>
             <w:rPr/>
           </w:pPr>
-          <w:hyperlink w:anchor="__RefHeading___Toc5334_863242435">
+          <w:hyperlink w:anchor="__RefHeading___Toc5347_644927476">
             <w:r>
               <w:rPr>
                 <w:rStyle w:val="IndexLink"/>
@@ -2294,7 +2294,7 @@
             </w:tabs>
             <w:rPr/>
           </w:pPr>
-          <w:hyperlink w:anchor="__RefHeading___Toc5336_863242435">
+          <w:hyperlink w:anchor="__RefHeading___Toc5349_644927476">
             <w:r>
               <w:rPr>
                 <w:rStyle w:val="IndexLink"/>
@@ -2314,7 +2314,7 @@
             </w:tabs>
             <w:rPr/>
           </w:pPr>
-          <w:hyperlink w:anchor="__RefHeading___Toc5338_863242435">
+          <w:hyperlink w:anchor="__RefHeading___Toc5351_644927476">
             <w:r>
               <w:rPr>
                 <w:rStyle w:val="IndexLink"/>
@@ -2334,7 +2334,7 @@
             </w:tabs>
             <w:rPr/>
           </w:pPr>
-          <w:hyperlink w:anchor="__RefHeading___Toc5340_863242435">
+          <w:hyperlink w:anchor="__RefHeading___Toc5353_644927476">
             <w:r>
               <w:rPr>
                 <w:rStyle w:val="IndexLink"/>
@@ -2354,7 +2354,7 @@
             </w:tabs>
             <w:rPr/>
           </w:pPr>
-          <w:hyperlink w:anchor="__RefHeading___Toc5342_863242435">
+          <w:hyperlink w:anchor="__RefHeading___Toc5355_644927476">
             <w:r>
               <w:rPr>
                 <w:rStyle w:val="IndexLink"/>
@@ -2374,7 +2374,7 @@
             </w:tabs>
             <w:rPr/>
           </w:pPr>
-          <w:hyperlink w:anchor="__RefHeading___Toc5344_863242435">
+          <w:hyperlink w:anchor="__RefHeading___Toc5357_644927476">
             <w:r>
               <w:rPr>
                 <w:rStyle w:val="IndexLink"/>
@@ -2394,7 +2394,7 @@
             </w:tabs>
             <w:rPr/>
           </w:pPr>
-          <w:hyperlink w:anchor="__RefHeading___Toc5346_863242435">
+          <w:hyperlink w:anchor="__RefHeading___Toc5359_644927476">
             <w:r>
               <w:rPr>
                 <w:rStyle w:val="IndexLink"/>
@@ -2414,7 +2414,7 @@
             </w:tabs>
             <w:rPr/>
           </w:pPr>
-          <w:hyperlink w:anchor="__RefHeading___Toc5348_863242435">
+          <w:hyperlink w:anchor="__RefHeading___Toc5361_644927476">
             <w:r>
               <w:rPr>
                 <w:rStyle w:val="IndexLink"/>
@@ -2434,7 +2434,7 @@
             </w:tabs>
             <w:rPr/>
           </w:pPr>
-          <w:hyperlink w:anchor="__RefHeading___Toc5350_863242435">
+          <w:hyperlink w:anchor="__RefHeading___Toc5363_644927476">
             <w:r>
               <w:rPr>
                 <w:rStyle w:val="IndexLink"/>
@@ -2454,7 +2454,7 @@
             </w:tabs>
             <w:rPr/>
           </w:pPr>
-          <w:hyperlink w:anchor="__RefHeading___Toc5352_863242435">
+          <w:hyperlink w:anchor="__RefHeading___Toc5365_644927476">
             <w:r>
               <w:rPr>
                 <w:rStyle w:val="IndexLink"/>
@@ -2474,7 +2474,7 @@
             </w:tabs>
             <w:rPr/>
           </w:pPr>
-          <w:hyperlink w:anchor="__RefHeading___Toc5354_863242435">
+          <w:hyperlink w:anchor="__RefHeading___Toc5367_644927476">
             <w:r>
               <w:rPr>
                 <w:rStyle w:val="IndexLink"/>
@@ -2494,7 +2494,7 @@
             </w:tabs>
             <w:rPr/>
           </w:pPr>
-          <w:hyperlink w:anchor="__RefHeading___Toc5356_863242435">
+          <w:hyperlink w:anchor="__RefHeading___Toc5369_644927476">
             <w:r>
               <w:rPr>
                 <w:rStyle w:val="IndexLink"/>
@@ -2514,7 +2514,7 @@
             </w:tabs>
             <w:rPr/>
           </w:pPr>
-          <w:hyperlink w:anchor="__RefHeading___Toc5358_863242435">
+          <w:hyperlink w:anchor="__RefHeading___Toc5371_644927476">
             <w:r>
               <w:rPr>
                 <w:rStyle w:val="IndexLink"/>
@@ -2534,7 +2534,7 @@
             </w:tabs>
             <w:rPr/>
           </w:pPr>
-          <w:hyperlink w:anchor="__RefHeading___Toc5360_863242435">
+          <w:hyperlink w:anchor="__RefHeading___Toc5373_644927476">
             <w:r>
               <w:rPr>
                 <w:rStyle w:val="IndexLink"/>
@@ -2554,7 +2554,7 @@
             </w:tabs>
             <w:rPr/>
           </w:pPr>
-          <w:hyperlink w:anchor="__RefHeading___Toc5362_863242435">
+          <w:hyperlink w:anchor="__RefHeading___Toc5375_644927476">
             <w:r>
               <w:rPr>
                 <w:rStyle w:val="IndexLink"/>
@@ -2574,7 +2574,7 @@
             </w:tabs>
             <w:rPr/>
           </w:pPr>
-          <w:hyperlink w:anchor="__RefHeading___Toc5364_863242435">
+          <w:hyperlink w:anchor="__RefHeading___Toc5377_644927476">
             <w:r>
               <w:rPr>
                 <w:rStyle w:val="IndexLink"/>
@@ -2594,7 +2594,7 @@
             </w:tabs>
             <w:rPr/>
           </w:pPr>
-          <w:hyperlink w:anchor="__RefHeading___Toc5366_863242435">
+          <w:hyperlink w:anchor="__RefHeading___Toc5379_644927476">
             <w:r>
               <w:rPr>
                 <w:rStyle w:val="IndexLink"/>
@@ -2614,7 +2614,7 @@
             </w:tabs>
             <w:rPr/>
           </w:pPr>
-          <w:hyperlink w:anchor="__RefHeading___Toc5368_863242435">
+          <w:hyperlink w:anchor="__RefHeading___Toc5381_644927476">
             <w:r>
               <w:rPr>
                 <w:rStyle w:val="IndexLink"/>
@@ -2634,7 +2634,7 @@
             </w:tabs>
             <w:rPr/>
           </w:pPr>
-          <w:hyperlink w:anchor="__RefHeading___Toc5370_863242435">
+          <w:hyperlink w:anchor="__RefHeading___Toc5383_644927476">
             <w:r>
               <w:rPr>
                 <w:rStyle w:val="IndexLink"/>
@@ -2654,7 +2654,7 @@
             </w:tabs>
             <w:rPr/>
           </w:pPr>
-          <w:hyperlink w:anchor="__RefHeading___Toc5372_863242435">
+          <w:hyperlink w:anchor="__RefHeading___Toc5385_644927476">
             <w:r>
               <w:rPr>
                 <w:rStyle w:val="IndexLink"/>
@@ -2674,7 +2674,7 @@
             </w:tabs>
             <w:rPr/>
           </w:pPr>
-          <w:hyperlink w:anchor="__RefHeading___Toc5374_863242435">
+          <w:hyperlink w:anchor="__RefHeading___Toc5387_644927476">
             <w:r>
               <w:rPr>
                 <w:rStyle w:val="IndexLink"/>
@@ -2694,7 +2694,7 @@
             </w:tabs>
             <w:rPr/>
           </w:pPr>
-          <w:hyperlink w:anchor="__RefHeading___Toc5376_863242435">
+          <w:hyperlink w:anchor="__RefHeading___Toc5389_644927476">
             <w:r>
               <w:rPr>
                 <w:rStyle w:val="IndexLink"/>
@@ -2714,7 +2714,7 @@
             </w:tabs>
             <w:rPr/>
           </w:pPr>
-          <w:hyperlink w:anchor="__RefHeading___Toc5378_863242435">
+          <w:hyperlink w:anchor="__RefHeading___Toc5391_644927476">
             <w:r>
               <w:rPr>
                 <w:rStyle w:val="IndexLink"/>
@@ -2734,7 +2734,7 @@
             </w:tabs>
             <w:rPr/>
           </w:pPr>
-          <w:hyperlink w:anchor="__RefHeading___Toc5380_863242435">
+          <w:hyperlink w:anchor="__RefHeading___Toc5393_644927476">
             <w:r>
               <w:rPr>
                 <w:rStyle w:val="IndexLink"/>
@@ -2754,7 +2754,7 @@
             </w:tabs>
             <w:rPr/>
           </w:pPr>
-          <w:hyperlink w:anchor="__RefHeading___Toc5382_863242435">
+          <w:hyperlink w:anchor="__RefHeading___Toc5395_644927476">
             <w:r>
               <w:rPr>
                 <w:rStyle w:val="IndexLink"/>
@@ -2774,7 +2774,7 @@
             </w:tabs>
             <w:rPr/>
           </w:pPr>
-          <w:hyperlink w:anchor="__RefHeading___Toc5384_863242435">
+          <w:hyperlink w:anchor="__RefHeading___Toc5397_644927476">
             <w:r>
               <w:rPr>
                 <w:rStyle w:val="IndexLink"/>
@@ -2794,7 +2794,7 @@
             </w:tabs>
             <w:rPr/>
           </w:pPr>
-          <w:hyperlink w:anchor="__RefHeading___Toc5386_863242435">
+          <w:hyperlink w:anchor="__RefHeading___Toc5399_644927476">
             <w:r>
               <w:rPr>
                 <w:rStyle w:val="IndexLink"/>
@@ -2814,7 +2814,7 @@
             </w:tabs>
             <w:rPr/>
           </w:pPr>
-          <w:hyperlink w:anchor="__RefHeading___Toc5388_863242435">
+          <w:hyperlink w:anchor="__RefHeading___Toc5401_644927476">
             <w:r>
               <w:rPr>
                 <w:rStyle w:val="IndexLink"/>
@@ -2834,7 +2834,7 @@
             </w:tabs>
             <w:rPr/>
           </w:pPr>
-          <w:hyperlink w:anchor="__RefHeading___Toc5390_863242435">
+          <w:hyperlink w:anchor="__RefHeading___Toc5403_644927476">
             <w:r>
               <w:rPr>
                 <w:rStyle w:val="IndexLink"/>
@@ -2854,7 +2854,7 @@
             </w:tabs>
             <w:rPr/>
           </w:pPr>
-          <w:hyperlink w:anchor="__RefHeading___Toc5392_863242435">
+          <w:hyperlink w:anchor="__RefHeading___Toc5405_644927476">
             <w:r>
               <w:rPr>
                 <w:rStyle w:val="IndexLink"/>
@@ -2874,7 +2874,7 @@
             </w:tabs>
             <w:rPr/>
           </w:pPr>
-          <w:hyperlink w:anchor="__RefHeading___Toc5394_863242435">
+          <w:hyperlink w:anchor="__RefHeading___Toc5407_644927476">
             <w:r>
               <w:rPr>
                 <w:rStyle w:val="IndexLink"/>
@@ -2894,7 +2894,7 @@
             </w:tabs>
             <w:rPr/>
           </w:pPr>
-          <w:hyperlink w:anchor="__RefHeading___Toc5396_863242435">
+          <w:hyperlink w:anchor="__RefHeading___Toc5409_644927476">
             <w:r>
               <w:rPr>
                 <w:rStyle w:val="IndexLink"/>
@@ -2914,7 +2914,7 @@
             </w:tabs>
             <w:rPr/>
           </w:pPr>
-          <w:hyperlink w:anchor="__RefHeading___Toc5398_863242435">
+          <w:hyperlink w:anchor="__RefHeading___Toc5411_644927476">
             <w:r>
               <w:rPr>
                 <w:rStyle w:val="IndexLink"/>
@@ -2934,7 +2934,7 @@
             </w:tabs>
             <w:rPr/>
           </w:pPr>
-          <w:hyperlink w:anchor="__RefHeading___Toc5400_863242435">
+          <w:hyperlink w:anchor="__RefHeading___Toc5413_644927476">
             <w:r>
               <w:rPr>
                 <w:rStyle w:val="IndexLink"/>
@@ -2954,7 +2954,7 @@
             </w:tabs>
             <w:rPr/>
           </w:pPr>
-          <w:hyperlink w:anchor="__RefHeading___Toc5402_863242435">
+          <w:hyperlink w:anchor="__RefHeading___Toc5415_644927476">
             <w:r>
               <w:rPr>
                 <w:rStyle w:val="IndexLink"/>
@@ -2974,7 +2974,7 @@
             </w:tabs>
             <w:rPr/>
           </w:pPr>
-          <w:hyperlink w:anchor="__RefHeading___Toc5404_863242435">
+          <w:hyperlink w:anchor="__RefHeading___Toc5417_644927476">
             <w:r>
               <w:rPr>
                 <w:rStyle w:val="IndexLink"/>
@@ -2994,7 +2994,7 @@
             </w:tabs>
             <w:rPr/>
           </w:pPr>
-          <w:hyperlink w:anchor="__RefHeading___Toc5406_863242435">
+          <w:hyperlink w:anchor="__RefHeading___Toc5419_644927476">
             <w:r>
               <w:rPr>
                 <w:rStyle w:val="IndexLink"/>
@@ -3014,7 +3014,7 @@
             </w:tabs>
             <w:rPr/>
           </w:pPr>
-          <w:hyperlink w:anchor="__RefHeading___Toc5408_863242435">
+          <w:hyperlink w:anchor="__RefHeading___Toc5421_644927476">
             <w:r>
               <w:rPr>
                 <w:rStyle w:val="IndexLink"/>
@@ -3034,7 +3034,7 @@
             </w:tabs>
             <w:rPr/>
           </w:pPr>
-          <w:hyperlink w:anchor="__RefHeading___Toc5410_863242435">
+          <w:hyperlink w:anchor="__RefHeading___Toc5423_644927476">
             <w:r>
               <w:rPr>
                 <w:rStyle w:val="IndexLink"/>
@@ -3054,7 +3054,7 @@
             </w:tabs>
             <w:rPr/>
           </w:pPr>
-          <w:hyperlink w:anchor="__RefHeading___Toc5412_863242435">
+          <w:hyperlink w:anchor="__RefHeading___Toc5425_644927476">
             <w:r>
               <w:rPr>
                 <w:rStyle w:val="IndexLink"/>
@@ -3074,7 +3074,7 @@
             </w:tabs>
             <w:rPr/>
           </w:pPr>
-          <w:hyperlink w:anchor="__RefHeading___Toc5414_863242435">
+          <w:hyperlink w:anchor="__RefHeading___Toc5427_644927476">
             <w:r>
               <w:rPr>
                 <w:rStyle w:val="IndexLink"/>
@@ -3094,7 +3094,7 @@
             </w:tabs>
             <w:rPr/>
           </w:pPr>
-          <w:hyperlink w:anchor="__RefHeading___Toc5416_863242435">
+          <w:hyperlink w:anchor="__RefHeading___Toc5429_644927476">
             <w:r>
               <w:rPr>
                 <w:rStyle w:val="IndexLink"/>
@@ -3114,7 +3114,7 @@
             </w:tabs>
             <w:rPr/>
           </w:pPr>
-          <w:hyperlink w:anchor="__RefHeading___Toc5418_863242435">
+          <w:hyperlink w:anchor="__RefHeading___Toc5431_644927476">
             <w:r>
               <w:rPr>
                 <w:rStyle w:val="IndexLink"/>
@@ -3134,7 +3134,7 @@
             </w:tabs>
             <w:rPr/>
           </w:pPr>
-          <w:hyperlink w:anchor="__RefHeading___Toc5420_863242435">
+          <w:hyperlink w:anchor="__RefHeading___Toc5433_644927476">
             <w:r>
               <w:rPr>
                 <w:rStyle w:val="IndexLink"/>
@@ -3154,7 +3154,7 @@
             </w:tabs>
             <w:rPr/>
           </w:pPr>
-          <w:hyperlink w:anchor="__RefHeading___Toc5422_863242435">
+          <w:hyperlink w:anchor="__RefHeading___Toc5435_644927476">
             <w:r>
               <w:rPr>
                 <w:rStyle w:val="IndexLink"/>
@@ -3174,7 +3174,7 @@
             </w:tabs>
             <w:rPr/>
           </w:pPr>
-          <w:hyperlink w:anchor="__RefHeading___Toc5424_863242435">
+          <w:hyperlink w:anchor="__RefHeading___Toc5437_644927476">
             <w:r>
               <w:rPr>
                 <w:rStyle w:val="IndexLink"/>
@@ -3194,7 +3194,7 @@
             </w:tabs>
             <w:rPr/>
           </w:pPr>
-          <w:hyperlink w:anchor="__RefHeading___Toc5426_863242435">
+          <w:hyperlink w:anchor="__RefHeading___Toc5439_644927476">
             <w:r>
               <w:rPr>
                 <w:rStyle w:val="IndexLink"/>
@@ -3214,7 +3214,7 @@
             </w:tabs>
             <w:rPr/>
           </w:pPr>
-          <w:hyperlink w:anchor="__RefHeading___Toc5428_863242435">
+          <w:hyperlink w:anchor="__RefHeading___Toc5441_644927476">
             <w:r>
               <w:rPr>
                 <w:rStyle w:val="IndexLink"/>
@@ -3234,7 +3234,7 @@
             </w:tabs>
             <w:rPr/>
           </w:pPr>
-          <w:hyperlink w:anchor="__RefHeading___Toc5430_863242435">
+          <w:hyperlink w:anchor="__RefHeading___Toc5443_644927476">
             <w:r>
               <w:rPr>
                 <w:rStyle w:val="IndexLink"/>
@@ -3254,7 +3254,7 @@
             </w:tabs>
             <w:rPr/>
           </w:pPr>
-          <w:hyperlink w:anchor="__RefHeading___Toc5432_863242435">
+          <w:hyperlink w:anchor="__RefHeading___Toc5445_644927476">
             <w:r>
               <w:rPr>
                 <w:rStyle w:val="IndexLink"/>
@@ -3274,7 +3274,7 @@
             </w:tabs>
             <w:rPr/>
           </w:pPr>
-          <w:hyperlink w:anchor="__RefHeading___Toc5434_863242435">
+          <w:hyperlink w:anchor="__RefHeading___Toc5447_644927476">
             <w:r>
               <w:rPr>
                 <w:rStyle w:val="IndexLink"/>
@@ -3294,7 +3294,7 @@
             </w:tabs>
             <w:rPr/>
           </w:pPr>
-          <w:hyperlink w:anchor="__RefHeading___Toc5436_863242435">
+          <w:hyperlink w:anchor="__RefHeading___Toc5449_644927476">
             <w:r>
               <w:rPr>
                 <w:rStyle w:val="IndexLink"/>
@@ -3314,7 +3314,7 @@
             </w:tabs>
             <w:rPr/>
           </w:pPr>
-          <w:hyperlink w:anchor="__RefHeading___Toc5438_863242435">
+          <w:hyperlink w:anchor="__RefHeading___Toc5451_644927476">
             <w:r>
               <w:rPr>
                 <w:rStyle w:val="IndexLink"/>
@@ -3334,7 +3334,7 @@
             </w:tabs>
             <w:rPr/>
           </w:pPr>
-          <w:hyperlink w:anchor="__RefHeading___Toc5440_863242435">
+          <w:hyperlink w:anchor="__RefHeading___Toc5453_644927476">
             <w:r>
               <w:rPr>
                 <w:rStyle w:val="IndexLink"/>
@@ -3354,7 +3354,7 @@
             </w:tabs>
             <w:rPr/>
           </w:pPr>
-          <w:hyperlink w:anchor="__RefHeading___Toc5442_863242435">
+          <w:hyperlink w:anchor="__RefHeading___Toc5455_644927476">
             <w:r>
               <w:rPr>
                 <w:rStyle w:val="IndexLink"/>
@@ -3374,7 +3374,7 @@
             </w:tabs>
             <w:rPr/>
           </w:pPr>
-          <w:hyperlink w:anchor="__RefHeading___Toc5444_863242435">
+          <w:hyperlink w:anchor="__RefHeading___Toc5457_644927476">
             <w:r>
               <w:rPr>
                 <w:rStyle w:val="IndexLink"/>
@@ -3394,7 +3394,7 @@
             </w:tabs>
             <w:rPr/>
           </w:pPr>
-          <w:hyperlink w:anchor="__RefHeading___Toc5446_863242435">
+          <w:hyperlink w:anchor="__RefHeading___Toc5459_644927476">
             <w:r>
               <w:rPr>
                 <w:rStyle w:val="IndexLink"/>
@@ -3414,7 +3414,7 @@
             </w:tabs>
             <w:rPr/>
           </w:pPr>
-          <w:hyperlink w:anchor="__RefHeading___Toc5448_863242435">
+          <w:hyperlink w:anchor="__RefHeading___Toc5461_644927476">
             <w:r>
               <w:rPr>
                 <w:rStyle w:val="IndexLink"/>
@@ -3434,7 +3434,7 @@
             </w:tabs>
             <w:rPr/>
           </w:pPr>
-          <w:hyperlink w:anchor="__RefHeading___Toc5450_863242435">
+          <w:hyperlink w:anchor="__RefHeading___Toc5463_644927476">
             <w:r>
               <w:rPr>
                 <w:rStyle w:val="IndexLink"/>
@@ -3454,7 +3454,7 @@
             </w:tabs>
             <w:rPr/>
           </w:pPr>
-          <w:hyperlink w:anchor="__RefHeading___Toc5452_863242435">
+          <w:hyperlink w:anchor="__RefHeading___Toc5465_644927476">
             <w:r>
               <w:rPr>
                 <w:rStyle w:val="IndexLink"/>
@@ -3474,7 +3474,7 @@
             </w:tabs>
             <w:rPr/>
           </w:pPr>
-          <w:hyperlink w:anchor="__RefHeading___Toc5454_863242435">
+          <w:hyperlink w:anchor="__RefHeading___Toc5467_644927476">
             <w:r>
               <w:rPr>
                 <w:rStyle w:val="IndexLink"/>
@@ -6918,7 +6918,7 @@
         <w:pStyle w:val="Heading1"/>
         <w:rPr/>
       </w:pPr>
-      <w:bookmarkStart w:id="0" w:name="__RefHeading___Toc5146_863242435"/>
+      <w:bookmarkStart w:id="0" w:name="__RefHeading___Toc5159_644927476"/>
       <w:bookmarkEnd w:id="0"/>
       <w:r>
         <w:rPr/>
@@ -6930,7 +6930,7 @@
         <w:pStyle w:val="Heading2"/>
         <w:rPr/>
       </w:pPr>
-      <w:bookmarkStart w:id="1" w:name="__RefHeading___Toc5148_863242435"/>
+      <w:bookmarkStart w:id="1" w:name="__RefHeading___Toc5161_644927476"/>
       <w:bookmarkEnd w:id="1"/>
       <w:r>
         <w:rPr/>
@@ -6983,7 +6983,7 @@
         <w:pStyle w:val="Heading2"/>
         <w:rPr/>
       </w:pPr>
-      <w:bookmarkStart w:id="2" w:name="__RefHeading___Toc5150_863242435"/>
+      <w:bookmarkStart w:id="2" w:name="__RefHeading___Toc5163_644927476"/>
       <w:bookmarkEnd w:id="2"/>
       <w:r>
         <w:rPr/>
@@ -7022,7 +7022,7 @@
         <w:pStyle w:val="Heading2"/>
         <w:rPr/>
       </w:pPr>
-      <w:bookmarkStart w:id="3" w:name="__RefHeading___Toc5152_863242435"/>
+      <w:bookmarkStart w:id="3" w:name="__RefHeading___Toc5165_644927476"/>
       <w:bookmarkEnd w:id="3"/>
       <w:r>
         <w:rPr/>
@@ -7128,7 +7128,7 @@
         <w:pStyle w:val="Heading2"/>
         <w:rPr/>
       </w:pPr>
-      <w:bookmarkStart w:id="4" w:name="__RefHeading___Toc5154_863242435"/>
+      <w:bookmarkStart w:id="4" w:name="__RefHeading___Toc5167_644927476"/>
       <w:bookmarkEnd w:id="4"/>
       <w:r>
         <w:rPr/>
@@ -7586,7 +7586,7 @@
         <w:pStyle w:val="Heading2"/>
         <w:rPr/>
       </w:pPr>
-      <w:bookmarkStart w:id="5" w:name="__RefHeading___Toc5156_863242435"/>
+      <w:bookmarkStart w:id="5" w:name="__RefHeading___Toc5169_644927476"/>
       <w:bookmarkEnd w:id="5"/>
       <w:r>
         <w:rPr/>
@@ -7624,7 +7624,7 @@
       </w:pPr>
       <w:r>
         <w:rPr/>
-        <w:t>une plateforme fonctionnelle, conteneurisée et testée (99 fonctions de test, intégration continue), dont l'architecture place le contrôle d'accès et la provenance au cœur du modèle de données ;</w:t>
+        <w:t>une plateforme fonctionnelle, conteneurisée et testée (101 fonctions de test, intégration continue), dont l'architecture place le contrôle d'accès et la provenance au cœur du modèle de données ;</w:t>
       </w:r>
     </w:p>
     <w:p>
@@ -7684,7 +7684,7 @@
         <w:pStyle w:val="Heading2"/>
         <w:rPr/>
       </w:pPr>
-      <w:bookmarkStart w:id="6" w:name="__RefHeading___Toc5158_863242435"/>
+      <w:bookmarkStart w:id="6" w:name="__RefHeading___Toc5171_644927476"/>
       <w:bookmarkEnd w:id="6"/>
       <w:r>
         <w:rPr/>
@@ -7709,7 +7709,7 @@
         <w:pStyle w:val="Heading1"/>
         <w:rPr/>
       </w:pPr>
-      <w:bookmarkStart w:id="7" w:name="__RefHeading___Toc5160_863242435"/>
+      <w:bookmarkStart w:id="7" w:name="__RefHeading___Toc5173_644927476"/>
       <w:bookmarkEnd w:id="7"/>
       <w:r>
         <w:rPr/>
@@ -7731,7 +7731,7 @@
         <w:pStyle w:val="Heading2"/>
         <w:rPr/>
       </w:pPr>
-      <w:bookmarkStart w:id="8" w:name="__RefHeading___Toc5162_863242435"/>
+      <w:bookmarkStart w:id="8" w:name="__RefHeading___Toc5175_644927476"/>
       <w:bookmarkEnd w:id="8"/>
       <w:r>
         <w:rPr/>
@@ -7743,7 +7743,7 @@
         <w:pStyle w:val="Heading3"/>
         <w:rPr/>
       </w:pPr>
-      <w:bookmarkStart w:id="9" w:name="__RefHeading___Toc5164_863242435"/>
+      <w:bookmarkStart w:id="9" w:name="__RefHeading___Toc5177_644927476"/>
       <w:bookmarkEnd w:id="9"/>
       <w:r>
         <w:rPr/>
@@ -7775,7 +7775,7 @@
         <w:pStyle w:val="Heading3"/>
         <w:rPr/>
       </w:pPr>
-      <w:bookmarkStart w:id="10" w:name="__RefHeading___Toc5166_863242435"/>
+      <w:bookmarkStart w:id="10" w:name="__RefHeading___Toc5179_644927476"/>
       <w:bookmarkEnd w:id="10"/>
       <w:r>
         <w:rPr/>
@@ -7860,7 +7860,7 @@
         <w:pStyle w:val="Heading2"/>
         <w:rPr/>
       </w:pPr>
-      <w:bookmarkStart w:id="11" w:name="__RefHeading___Toc5168_863242435"/>
+      <w:bookmarkStart w:id="11" w:name="__RefHeading___Toc5181_644927476"/>
       <w:bookmarkEnd w:id="11"/>
       <w:r>
         <w:rPr/>
@@ -7984,7 +7984,7 @@
         <w:pStyle w:val="Heading2"/>
         <w:rPr/>
       </w:pPr>
-      <w:bookmarkStart w:id="12" w:name="__RefHeading___Toc5170_863242435"/>
+      <w:bookmarkStart w:id="12" w:name="__RefHeading___Toc5183_644927476"/>
       <w:bookmarkEnd w:id="12"/>
       <w:r>
         <w:rPr/>
@@ -8624,7 +8624,7 @@
         <w:pStyle w:val="Heading2"/>
         <w:rPr/>
       </w:pPr>
-      <w:bookmarkStart w:id="13" w:name="__RefHeading___Toc5172_863242435"/>
+      <w:bookmarkStart w:id="13" w:name="__RefHeading___Toc5185_644927476"/>
       <w:bookmarkEnd w:id="13"/>
       <w:r>
         <w:rPr/>
@@ -8636,7 +8636,7 @@
         <w:pStyle w:val="Heading3"/>
         <w:rPr/>
       </w:pPr>
-      <w:bookmarkStart w:id="14" w:name="__RefHeading___Toc5174_863242435"/>
+      <w:bookmarkStart w:id="14" w:name="__RefHeading___Toc5187_644927476"/>
       <w:bookmarkEnd w:id="14"/>
       <w:r>
         <w:rPr/>
@@ -8658,7 +8658,7 @@
         <w:pStyle w:val="Heading3"/>
         <w:rPr/>
       </w:pPr>
-      <w:bookmarkStart w:id="15" w:name="__RefHeading___Toc5176_863242435"/>
+      <w:bookmarkStart w:id="15" w:name="__RefHeading___Toc5189_644927476"/>
       <w:bookmarkEnd w:id="15"/>
       <w:r>
         <w:rPr/>
@@ -9238,7 +9238,7 @@
         <w:pStyle w:val="Heading2"/>
         <w:rPr/>
       </w:pPr>
-      <w:bookmarkStart w:id="16" w:name="__RefHeading___Toc5178_863242435"/>
+      <w:bookmarkStart w:id="16" w:name="__RefHeading___Toc5191_644927476"/>
       <w:bookmarkEnd w:id="16"/>
       <w:r>
         <w:rPr/>
@@ -9250,7 +9250,7 @@
         <w:pStyle w:val="Heading3"/>
         <w:rPr/>
       </w:pPr>
-      <w:bookmarkStart w:id="17" w:name="__RefHeading___Toc5180_863242435"/>
+      <w:bookmarkStart w:id="17" w:name="__RefHeading___Toc5193_644927476"/>
       <w:bookmarkEnd w:id="17"/>
       <w:r>
         <w:rPr/>
@@ -10064,7 +10064,7 @@
         <w:pStyle w:val="Heading3"/>
         <w:rPr/>
       </w:pPr>
-      <w:bookmarkStart w:id="18" w:name="__RefHeading___Toc5182_863242435"/>
+      <w:bookmarkStart w:id="18" w:name="__RefHeading___Toc5195_644927476"/>
       <w:bookmarkEnd w:id="18"/>
       <w:r>
         <w:rPr/>
@@ -10756,7 +10756,7 @@
         <w:pStyle w:val="Heading2"/>
         <w:rPr/>
       </w:pPr>
-      <w:bookmarkStart w:id="19" w:name="__RefHeading___Toc5184_863242435"/>
+      <w:bookmarkStart w:id="19" w:name="__RefHeading___Toc5197_644927476"/>
       <w:bookmarkEnd w:id="19"/>
       <w:r>
         <w:rPr/>
@@ -10829,7 +10829,7 @@
         <w:pStyle w:val="Heading2"/>
         <w:rPr/>
       </w:pPr>
-      <w:bookmarkStart w:id="20" w:name="__RefHeading___Toc5186_863242435"/>
+      <w:bookmarkStart w:id="20" w:name="__RefHeading___Toc5199_644927476"/>
       <w:bookmarkEnd w:id="20"/>
       <w:r>
         <w:rPr/>
@@ -11637,7 +11637,7 @@
         <w:pStyle w:val="Heading2"/>
         <w:rPr/>
       </w:pPr>
-      <w:bookmarkStart w:id="21" w:name="__RefHeading___Toc5188_863242435"/>
+      <w:bookmarkStart w:id="21" w:name="__RefHeading___Toc5201_644927476"/>
       <w:bookmarkEnd w:id="21"/>
       <w:r>
         <w:rPr/>
@@ -11672,7 +11672,7 @@
         <w:pStyle w:val="Heading1"/>
         <w:rPr/>
       </w:pPr>
-      <w:bookmarkStart w:id="22" w:name="__RefHeading___Toc5190_863242435"/>
+      <w:bookmarkStart w:id="22" w:name="__RefHeading___Toc5203_644927476"/>
       <w:bookmarkEnd w:id="22"/>
       <w:r>
         <w:rPr/>
@@ -11694,7 +11694,7 @@
         <w:pStyle w:val="Heading2"/>
         <w:rPr/>
       </w:pPr>
-      <w:bookmarkStart w:id="23" w:name="__RefHeading___Toc5192_863242435"/>
+      <w:bookmarkStart w:id="23" w:name="__RefHeading___Toc5205_644927476"/>
       <w:bookmarkEnd w:id="23"/>
       <w:r>
         <w:rPr/>
@@ -11801,7 +11801,7 @@
         <w:pStyle w:val="Heading2"/>
         <w:rPr/>
       </w:pPr>
-      <w:bookmarkStart w:id="24" w:name="__RefHeading___Toc5194_863242435"/>
+      <w:bookmarkStart w:id="24" w:name="__RefHeading___Toc5207_644927476"/>
       <w:bookmarkEnd w:id="24"/>
       <w:r>
         <w:rPr/>
@@ -11833,7 +11833,7 @@
         <w:pStyle w:val="Heading2"/>
         <w:rPr/>
       </w:pPr>
-      <w:bookmarkStart w:id="25" w:name="__RefHeading___Toc5196_863242435"/>
+      <w:bookmarkStart w:id="25" w:name="__RefHeading___Toc5209_644927476"/>
       <w:bookmarkEnd w:id="25"/>
       <w:r>
         <w:rPr/>
@@ -11876,7 +11876,7 @@
         <w:pStyle w:val="Heading2"/>
         <w:rPr/>
       </w:pPr>
-      <w:bookmarkStart w:id="26" w:name="__RefHeading___Toc5198_863242435"/>
+      <w:bookmarkStart w:id="26" w:name="__RefHeading___Toc5211_644927476"/>
       <w:bookmarkEnd w:id="26"/>
       <w:r>
         <w:rPr/>
@@ -11888,7 +11888,7 @@
         <w:pStyle w:val="Heading3"/>
         <w:rPr/>
       </w:pPr>
-      <w:bookmarkStart w:id="27" w:name="__RefHeading___Toc5200_863242435"/>
+      <w:bookmarkStart w:id="27" w:name="__RefHeading___Toc5213_644927476"/>
       <w:bookmarkEnd w:id="27"/>
       <w:r>
         <w:rPr/>
@@ -11930,7 +11930,7 @@
         <w:pStyle w:val="Heading3"/>
         <w:rPr/>
       </w:pPr>
-      <w:bookmarkStart w:id="28" w:name="__RefHeading___Toc5202_863242435"/>
+      <w:bookmarkStart w:id="28" w:name="__RefHeading___Toc5215_644927476"/>
       <w:bookmarkEnd w:id="28"/>
       <w:r>
         <w:rPr/>
@@ -11973,7 +11973,7 @@
         <w:pStyle w:val="Heading3"/>
         <w:rPr/>
       </w:pPr>
-      <w:bookmarkStart w:id="29" w:name="__RefHeading___Toc5204_863242435"/>
+      <w:bookmarkStart w:id="29" w:name="__RefHeading___Toc5217_644927476"/>
       <w:bookmarkEnd w:id="29"/>
       <w:r>
         <w:rPr/>
@@ -11995,7 +11995,7 @@
         <w:pStyle w:val="Heading2"/>
         <w:rPr/>
       </w:pPr>
-      <w:bookmarkStart w:id="30" w:name="__RefHeading___Toc5206_863242435"/>
+      <w:bookmarkStart w:id="30" w:name="__RefHeading___Toc5219_644927476"/>
       <w:bookmarkEnd w:id="30"/>
       <w:r>
         <w:rPr/>
@@ -12099,7 +12099,7 @@
         <w:pStyle w:val="Heading2"/>
         <w:rPr/>
       </w:pPr>
-      <w:bookmarkStart w:id="31" w:name="__RefHeading___Toc5208_863242435"/>
+      <w:bookmarkStart w:id="31" w:name="__RefHeading___Toc5221_644927476"/>
       <w:bookmarkEnd w:id="31"/>
       <w:r>
         <w:rPr/>
@@ -12131,7 +12131,7 @@
         <w:pStyle w:val="Heading2"/>
         <w:rPr/>
       </w:pPr>
-      <w:bookmarkStart w:id="32" w:name="__RefHeading___Toc5210_863242435"/>
+      <w:bookmarkStart w:id="32" w:name="__RefHeading___Toc5223_644927476"/>
       <w:bookmarkEnd w:id="32"/>
       <w:r>
         <w:rPr/>
@@ -12173,7 +12173,7 @@
         <w:pStyle w:val="Heading2"/>
         <w:rPr/>
       </w:pPr>
-      <w:bookmarkStart w:id="33" w:name="__RefHeading___Toc5212_863242435"/>
+      <w:bookmarkStart w:id="33" w:name="__RefHeading___Toc5225_644927476"/>
       <w:bookmarkEnd w:id="33"/>
       <w:r>
         <w:rPr/>
@@ -12205,7 +12205,7 @@
         <w:pStyle w:val="Heading2"/>
         <w:rPr/>
       </w:pPr>
-      <w:bookmarkStart w:id="34" w:name="__RefHeading___Toc5214_863242435"/>
+      <w:bookmarkStart w:id="34" w:name="__RefHeading___Toc5227_644927476"/>
       <w:bookmarkEnd w:id="34"/>
       <w:r>
         <w:rPr/>
@@ -12237,7 +12237,7 @@
         <w:pStyle w:val="Heading2"/>
         <w:rPr/>
       </w:pPr>
-      <w:bookmarkStart w:id="35" w:name="__RefHeading___Toc5216_863242435"/>
+      <w:bookmarkStart w:id="35" w:name="__RefHeading___Toc5229_644927476"/>
       <w:bookmarkEnd w:id="35"/>
       <w:r>
         <w:rPr/>
@@ -13414,7 +13414,7 @@
         <w:pStyle w:val="Heading1"/>
         <w:rPr/>
       </w:pPr>
-      <w:bookmarkStart w:id="36" w:name="__RefHeading___Toc5218_863242435"/>
+      <w:bookmarkStart w:id="36" w:name="__RefHeading___Toc5231_644927476"/>
       <w:bookmarkEnd w:id="36"/>
       <w:r>
         <w:rPr/>
@@ -13436,7 +13436,7 @@
         <w:pStyle w:val="Heading2"/>
         <w:rPr/>
       </w:pPr>
-      <w:bookmarkStart w:id="37" w:name="__RefHeading___Toc5220_863242435"/>
+      <w:bookmarkStart w:id="37" w:name="__RefHeading___Toc5233_644927476"/>
       <w:bookmarkEnd w:id="37"/>
       <w:r>
         <w:rPr/>
@@ -13531,7 +13531,7 @@
         <w:pStyle w:val="Heading2"/>
         <w:rPr/>
       </w:pPr>
-      <w:bookmarkStart w:id="38" w:name="__RefHeading___Toc5222_863242435"/>
+      <w:bookmarkStart w:id="38" w:name="__RefHeading___Toc5235_644927476"/>
       <w:bookmarkEnd w:id="38"/>
       <w:r>
         <w:rPr/>
@@ -13543,7 +13543,7 @@
         <w:pStyle w:val="Heading3"/>
         <w:rPr/>
       </w:pPr>
-      <w:bookmarkStart w:id="39" w:name="__RefHeading___Toc5224_863242435"/>
+      <w:bookmarkStart w:id="39" w:name="__RefHeading___Toc5237_644927476"/>
       <w:bookmarkEnd w:id="39"/>
       <w:r>
         <w:rPr/>
@@ -13586,7 +13586,7 @@
         <w:pStyle w:val="Heading3"/>
         <w:rPr/>
       </w:pPr>
-      <w:bookmarkStart w:id="40" w:name="__RefHeading___Toc5226_863242435"/>
+      <w:bookmarkStart w:id="40" w:name="__RefHeading___Toc5239_644927476"/>
       <w:bookmarkEnd w:id="40"/>
       <w:r>
         <w:rPr/>
@@ -13618,7 +13618,7 @@
         <w:pStyle w:val="Heading3"/>
         <w:rPr/>
       </w:pPr>
-      <w:bookmarkStart w:id="41" w:name="__RefHeading___Toc5228_863242435"/>
+      <w:bookmarkStart w:id="41" w:name="__RefHeading___Toc5241_644927476"/>
       <w:bookmarkEnd w:id="41"/>
       <w:r>
         <w:rPr/>
@@ -14604,7 +14604,7 @@
         <w:pStyle w:val="Heading2"/>
         <w:rPr/>
       </w:pPr>
-      <w:bookmarkStart w:id="42" w:name="__RefHeading___Toc5230_863242435"/>
+      <w:bookmarkStart w:id="42" w:name="__RefHeading___Toc5243_644927476"/>
       <w:bookmarkEnd w:id="42"/>
       <w:r>
         <w:rPr/>
@@ -14616,7 +14616,7 @@
         <w:pStyle w:val="Heading3"/>
         <w:rPr/>
       </w:pPr>
-      <w:bookmarkStart w:id="43" w:name="__RefHeading___Toc5232_863242435"/>
+      <w:bookmarkStart w:id="43" w:name="__RefHeading___Toc5245_644927476"/>
       <w:bookmarkEnd w:id="43"/>
       <w:r>
         <w:rPr/>
@@ -14638,7 +14638,7 @@
         <w:pStyle w:val="Heading3"/>
         <w:rPr/>
       </w:pPr>
-      <w:bookmarkStart w:id="44" w:name="__RefHeading___Toc5234_863242435"/>
+      <w:bookmarkStart w:id="44" w:name="__RefHeading___Toc5247_644927476"/>
       <w:bookmarkEnd w:id="44"/>
       <w:r>
         <w:rPr/>
@@ -15713,7 +15713,7 @@
         <w:pStyle w:val="Heading3"/>
         <w:rPr/>
       </w:pPr>
-      <w:bookmarkStart w:id="45" w:name="__RefHeading___Toc5236_863242435"/>
+      <w:bookmarkStart w:id="45" w:name="__RefHeading___Toc5249_644927476"/>
       <w:bookmarkEnd w:id="45"/>
       <w:r>
         <w:rPr/>
@@ -15735,7 +15735,7 @@
         <w:pStyle w:val="Heading2"/>
         <w:rPr/>
       </w:pPr>
-      <w:bookmarkStart w:id="46" w:name="__RefHeading___Toc5238_863242435"/>
+      <w:bookmarkStart w:id="46" w:name="__RefHeading___Toc5251_644927476"/>
       <w:bookmarkEnd w:id="46"/>
       <w:r>
         <w:rPr/>
@@ -15747,7 +15747,7 @@
         <w:pStyle w:val="Heading3"/>
         <w:rPr/>
       </w:pPr>
-      <w:bookmarkStart w:id="47" w:name="__RefHeading___Toc5240_863242435"/>
+      <w:bookmarkStart w:id="47" w:name="__RefHeading___Toc5253_644927476"/>
       <w:bookmarkEnd w:id="47"/>
       <w:r>
         <w:rPr/>
@@ -16215,7 +16215,7 @@
         <w:pStyle w:val="Heading3"/>
         <w:rPr/>
       </w:pPr>
-      <w:bookmarkStart w:id="48" w:name="__RefHeading___Toc5242_863242435"/>
+      <w:bookmarkStart w:id="48" w:name="__RefHeading___Toc5255_644927476"/>
       <w:bookmarkEnd w:id="48"/>
       <w:r>
         <w:rPr/>
@@ -16247,7 +16247,7 @@
         <w:pStyle w:val="Heading3"/>
         <w:rPr/>
       </w:pPr>
-      <w:bookmarkStart w:id="49" w:name="__RefHeading___Toc5244_863242435"/>
+      <w:bookmarkStart w:id="49" w:name="__RefHeading___Toc5257_644927476"/>
       <w:bookmarkEnd w:id="49"/>
       <w:r>
         <w:rPr/>
@@ -16280,7 +16280,7 @@
         <w:pStyle w:val="Heading2"/>
         <w:rPr/>
       </w:pPr>
-      <w:bookmarkStart w:id="50" w:name="__RefHeading___Toc5246_863242435"/>
+      <w:bookmarkStart w:id="50" w:name="__RefHeading___Toc5259_644927476"/>
       <w:bookmarkEnd w:id="50"/>
       <w:r>
         <w:rPr/>
@@ -16292,7 +16292,7 @@
         <w:pStyle w:val="Heading3"/>
         <w:rPr/>
       </w:pPr>
-      <w:bookmarkStart w:id="51" w:name="__RefHeading___Toc5248_863242435"/>
+      <w:bookmarkStart w:id="51" w:name="__RefHeading___Toc5261_644927476"/>
       <w:bookmarkEnd w:id="51"/>
       <w:r>
         <w:rPr/>
@@ -16419,7 +16419,7 @@
         <w:pStyle w:val="Heading3"/>
         <w:rPr/>
       </w:pPr>
-      <w:bookmarkStart w:id="52" w:name="__RefHeading___Toc5250_863242435"/>
+      <w:bookmarkStart w:id="52" w:name="__RefHeading___Toc5263_644927476"/>
       <w:bookmarkEnd w:id="52"/>
       <w:r>
         <w:rPr/>
@@ -16606,7 +16606,7 @@
         <w:pStyle w:val="Heading3"/>
         <w:rPr/>
       </w:pPr>
-      <w:bookmarkStart w:id="53" w:name="__RefHeading___Toc5252_863242435"/>
+      <w:bookmarkStart w:id="53" w:name="__RefHeading___Toc5265_644927476"/>
       <w:bookmarkEnd w:id="53"/>
       <w:r>
         <w:rPr/>
@@ -16628,7 +16628,7 @@
         <w:pStyle w:val="Heading3"/>
         <w:rPr/>
       </w:pPr>
-      <w:bookmarkStart w:id="54" w:name="__RefHeading___Toc5254_863242435"/>
+      <w:bookmarkStart w:id="54" w:name="__RefHeading___Toc5267_644927476"/>
       <w:bookmarkEnd w:id="54"/>
       <w:r>
         <w:rPr/>
@@ -16650,7 +16650,7 @@
         <w:pStyle w:val="Heading2"/>
         <w:rPr/>
       </w:pPr>
-      <w:bookmarkStart w:id="55" w:name="__RefHeading___Toc5256_863242435"/>
+      <w:bookmarkStart w:id="55" w:name="__RefHeading___Toc5269_644927476"/>
       <w:bookmarkEnd w:id="55"/>
       <w:r>
         <w:rPr/>
@@ -16682,7 +16682,7 @@
         <w:pStyle w:val="Heading2"/>
         <w:rPr/>
       </w:pPr>
-      <w:bookmarkStart w:id="56" w:name="__RefHeading___Toc5258_863242435"/>
+      <w:bookmarkStart w:id="56" w:name="__RefHeading___Toc5271_644927476"/>
       <w:bookmarkEnd w:id="56"/>
       <w:r>
         <w:rPr/>
@@ -16714,7 +16714,7 @@
         <w:pStyle w:val="Heading2"/>
         <w:rPr/>
       </w:pPr>
-      <w:bookmarkStart w:id="57" w:name="__RefHeading___Toc5260_863242435"/>
+      <w:bookmarkStart w:id="57" w:name="__RefHeading___Toc5273_644927476"/>
       <w:bookmarkEnd w:id="57"/>
       <w:r>
         <w:rPr/>
@@ -16749,7 +16749,7 @@
         <w:pStyle w:val="Heading1"/>
         <w:rPr/>
       </w:pPr>
-      <w:bookmarkStart w:id="58" w:name="__RefHeading___Toc5262_863242435"/>
+      <w:bookmarkStart w:id="58" w:name="__RefHeading___Toc5275_644927476"/>
       <w:bookmarkEnd w:id="58"/>
       <w:r>
         <w:rPr/>
@@ -16771,7 +16771,7 @@
         <w:pStyle w:val="Heading2"/>
         <w:rPr/>
       </w:pPr>
-      <w:bookmarkStart w:id="59" w:name="__RefHeading___Toc5264_863242435"/>
+      <w:bookmarkStart w:id="59" w:name="__RefHeading___Toc5277_644927476"/>
       <w:bookmarkEnd w:id="59"/>
       <w:r>
         <w:rPr/>
@@ -16938,7 +16938,7 @@
         <w:pStyle w:val="Heading2"/>
         <w:rPr/>
       </w:pPr>
-      <w:bookmarkStart w:id="60" w:name="__RefHeading___Toc5266_863242435"/>
+      <w:bookmarkStart w:id="60" w:name="__RefHeading___Toc5279_644927476"/>
       <w:bookmarkEnd w:id="60"/>
       <w:r>
         <w:rPr/>
@@ -16950,7 +16950,7 @@
         <w:pStyle w:val="Heading3"/>
         <w:rPr/>
       </w:pPr>
-      <w:bookmarkStart w:id="61" w:name="__RefHeading___Toc5268_863242435"/>
+      <w:bookmarkStart w:id="61" w:name="__RefHeading___Toc5281_644927476"/>
       <w:bookmarkEnd w:id="61"/>
       <w:r>
         <w:rPr/>
@@ -18698,7 +18698,7 @@
         <w:pStyle w:val="Heading3"/>
         <w:rPr/>
       </w:pPr>
-      <w:bookmarkStart w:id="62" w:name="__RefHeading___Toc5270_863242435"/>
+      <w:bookmarkStart w:id="62" w:name="__RefHeading___Toc5283_644927476"/>
       <w:bookmarkEnd w:id="62"/>
       <w:r>
         <w:rPr/>
@@ -18837,7 +18837,7 @@
         <w:pStyle w:val="Heading3"/>
         <w:rPr/>
       </w:pPr>
-      <w:bookmarkStart w:id="63" w:name="__RefHeading___Toc5272_863242435"/>
+      <w:bookmarkStart w:id="63" w:name="__RefHeading___Toc5285_644927476"/>
       <w:bookmarkEnd w:id="63"/>
       <w:r>
         <w:rPr/>
@@ -18869,7 +18869,7 @@
         <w:pStyle w:val="Heading2"/>
         <w:rPr/>
       </w:pPr>
-      <w:bookmarkStart w:id="64" w:name="__RefHeading___Toc5274_863242435"/>
+      <w:bookmarkStart w:id="64" w:name="__RefHeading___Toc5287_644927476"/>
       <w:bookmarkEnd w:id="64"/>
       <w:r>
         <w:rPr/>
@@ -19153,7 +19153,7 @@
         <w:pStyle w:val="Heading2"/>
         <w:rPr/>
       </w:pPr>
-      <w:bookmarkStart w:id="65" w:name="__RefHeading___Toc5276_863242435"/>
+      <w:bookmarkStart w:id="65" w:name="__RefHeading___Toc5289_644927476"/>
       <w:bookmarkEnd w:id="65"/>
       <w:r>
         <w:rPr/>
@@ -19165,7 +19165,7 @@
         <w:pStyle w:val="Heading3"/>
         <w:rPr/>
       </w:pPr>
-      <w:bookmarkStart w:id="66" w:name="__RefHeading___Toc5278_863242435"/>
+      <w:bookmarkStart w:id="66" w:name="__RefHeading___Toc5291_644927476"/>
       <w:bookmarkEnd w:id="66"/>
       <w:r>
         <w:rPr/>
@@ -19197,7 +19197,7 @@
         <w:pStyle w:val="Heading3"/>
         <w:rPr/>
       </w:pPr>
-      <w:bookmarkStart w:id="67" w:name="__RefHeading___Toc5280_863242435"/>
+      <w:bookmarkStart w:id="67" w:name="__RefHeading___Toc5293_644927476"/>
       <w:bookmarkEnd w:id="67"/>
       <w:r>
         <w:rPr/>
@@ -19219,7 +19219,7 @@
         <w:pStyle w:val="Heading3"/>
         <w:rPr/>
       </w:pPr>
-      <w:bookmarkStart w:id="68" w:name="__RefHeading___Toc5282_863242435"/>
+      <w:bookmarkStart w:id="68" w:name="__RefHeading___Toc5295_644927476"/>
       <w:bookmarkEnd w:id="68"/>
       <w:r>
         <w:rPr/>
@@ -19241,7 +19241,7 @@
         <w:pStyle w:val="Heading2"/>
         <w:rPr/>
       </w:pPr>
-      <w:bookmarkStart w:id="69" w:name="__RefHeading___Toc5284_863242435"/>
+      <w:bookmarkStart w:id="69" w:name="__RefHeading___Toc5297_644927476"/>
       <w:bookmarkEnd w:id="69"/>
       <w:r>
         <w:rPr/>
@@ -19253,7 +19253,7 @@
         <w:pStyle w:val="Heading3"/>
         <w:rPr/>
       </w:pPr>
-      <w:bookmarkStart w:id="70" w:name="__RefHeading___Toc5286_863242435"/>
+      <w:bookmarkStart w:id="70" w:name="__RefHeading___Toc5299_644927476"/>
       <w:bookmarkEnd w:id="70"/>
       <w:r>
         <w:rPr/>
@@ -19350,7 +19350,7 @@
         <w:pStyle w:val="Heading3"/>
         <w:rPr/>
       </w:pPr>
-      <w:bookmarkStart w:id="71" w:name="__RefHeading___Toc5288_863242435"/>
+      <w:bookmarkStart w:id="71" w:name="__RefHeading___Toc5301_644927476"/>
       <w:bookmarkEnd w:id="71"/>
       <w:r>
         <w:rPr/>
@@ -20162,7 +20162,7 @@
         <w:pStyle w:val="Heading2"/>
         <w:rPr/>
       </w:pPr>
-      <w:bookmarkStart w:id="72" w:name="__RefHeading___Toc5290_863242435"/>
+      <w:bookmarkStart w:id="72" w:name="__RefHeading___Toc5303_644927476"/>
       <w:bookmarkEnd w:id="72"/>
       <w:r>
         <w:rPr/>
@@ -20370,7 +20370,7 @@
         <w:pStyle w:val="Heading2"/>
         <w:rPr/>
       </w:pPr>
-      <w:bookmarkStart w:id="73" w:name="__RefHeading___Toc5292_863242435"/>
+      <w:bookmarkStart w:id="73" w:name="__RefHeading___Toc5305_644927476"/>
       <w:bookmarkEnd w:id="73"/>
       <w:r>
         <w:rPr/>
@@ -20382,7 +20382,7 @@
         <w:pStyle w:val="Heading3"/>
         <w:rPr/>
       </w:pPr>
-      <w:bookmarkStart w:id="74" w:name="__RefHeading___Toc5294_863242435"/>
+      <w:bookmarkStart w:id="74" w:name="__RefHeading___Toc5307_644927476"/>
       <w:bookmarkEnd w:id="74"/>
       <w:r>
         <w:rPr/>
@@ -20404,7 +20404,7 @@
         <w:pStyle w:val="Heading3"/>
         <w:rPr/>
       </w:pPr>
-      <w:bookmarkStart w:id="75" w:name="__RefHeading___Toc5296_863242435"/>
+      <w:bookmarkStart w:id="75" w:name="__RefHeading___Toc5309_644927476"/>
       <w:bookmarkEnd w:id="75"/>
       <w:r>
         <w:rPr/>
@@ -20426,7 +20426,7 @@
         <w:pStyle w:val="Heading2"/>
         <w:rPr/>
       </w:pPr>
-      <w:bookmarkStart w:id="76" w:name="__RefHeading___Toc5298_863242435"/>
+      <w:bookmarkStart w:id="76" w:name="__RefHeading___Toc5311_644927476"/>
       <w:bookmarkEnd w:id="76"/>
       <w:r>
         <w:rPr/>
@@ -21077,7 +21077,7 @@
         <w:pStyle w:val="Heading2"/>
         <w:rPr/>
       </w:pPr>
-      <w:bookmarkStart w:id="77" w:name="__RefHeading___Toc5300_863242435"/>
+      <w:bookmarkStart w:id="77" w:name="__RefHeading___Toc5313_644927476"/>
       <w:bookmarkEnd w:id="77"/>
       <w:r>
         <w:rPr/>
@@ -22243,7 +22243,7 @@
         <w:pStyle w:val="Heading1"/>
         <w:rPr/>
       </w:pPr>
-      <w:bookmarkStart w:id="78" w:name="__RefHeading___Toc5302_863242435"/>
+      <w:bookmarkStart w:id="78" w:name="__RefHeading___Toc5315_644927476"/>
       <w:bookmarkEnd w:id="78"/>
       <w:r>
         <w:rPr/>
@@ -22265,7 +22265,7 @@
         <w:pStyle w:val="Heading2"/>
         <w:rPr/>
       </w:pPr>
-      <w:bookmarkStart w:id="79" w:name="__RefHeading___Toc5304_863242435"/>
+      <w:bookmarkStart w:id="79" w:name="__RefHeading___Toc5317_644927476"/>
       <w:bookmarkEnd w:id="79"/>
       <w:r>
         <w:rPr/>
@@ -22987,7 +22987,7 @@
         <w:pStyle w:val="Heading2"/>
         <w:rPr/>
       </w:pPr>
-      <w:bookmarkStart w:id="80" w:name="__RefHeading___Toc5306_863242435"/>
+      <w:bookmarkStart w:id="80" w:name="__RefHeading___Toc5319_644927476"/>
       <w:bookmarkEnd w:id="80"/>
       <w:r>
         <w:rPr/>
@@ -22999,7 +22999,7 @@
         <w:pStyle w:val="Heading3"/>
         <w:rPr/>
       </w:pPr>
-      <w:bookmarkStart w:id="81" w:name="__RefHeading___Toc5308_863242435"/>
+      <w:bookmarkStart w:id="81" w:name="__RefHeading___Toc5321_644927476"/>
       <w:bookmarkEnd w:id="81"/>
       <w:r>
         <w:rPr/>
@@ -23021,7 +23021,7 @@
         <w:pStyle w:val="Heading3"/>
         <w:rPr/>
       </w:pPr>
-      <w:bookmarkStart w:id="82" w:name="__RefHeading___Toc5310_863242435"/>
+      <w:bookmarkStart w:id="82" w:name="__RefHeading___Toc5323_644927476"/>
       <w:bookmarkEnd w:id="82"/>
       <w:r>
         <w:rPr/>
@@ -23063,7 +23063,7 @@
         <w:pStyle w:val="Heading3"/>
         <w:rPr/>
       </w:pPr>
-      <w:bookmarkStart w:id="83" w:name="__RefHeading___Toc5312_863242435"/>
+      <w:bookmarkStart w:id="83" w:name="__RefHeading___Toc5325_644927476"/>
       <w:bookmarkEnd w:id="83"/>
       <w:r>
         <w:rPr/>
@@ -23085,7 +23085,7 @@
         <w:pStyle w:val="Heading2"/>
         <w:rPr/>
       </w:pPr>
-      <w:bookmarkStart w:id="84" w:name="__RefHeading___Toc5314_863242435"/>
+      <w:bookmarkStart w:id="84" w:name="__RefHeading___Toc5327_644927476"/>
       <w:bookmarkEnd w:id="84"/>
       <w:r>
         <w:rPr/>
@@ -23097,7 +23097,7 @@
         <w:pStyle w:val="Heading3"/>
         <w:rPr/>
       </w:pPr>
-      <w:bookmarkStart w:id="85" w:name="__RefHeading___Toc5316_863242435"/>
+      <w:bookmarkStart w:id="85" w:name="__RefHeading___Toc5329_644927476"/>
       <w:bookmarkEnd w:id="85"/>
       <w:r>
         <w:rPr/>
@@ -23131,7 +23131,7 @@
         <w:pStyle w:val="Heading3"/>
         <w:rPr/>
       </w:pPr>
-      <w:bookmarkStart w:id="86" w:name="__RefHeading___Toc5318_863242435"/>
+      <w:bookmarkStart w:id="86" w:name="__RefHeading___Toc5331_644927476"/>
       <w:bookmarkEnd w:id="86"/>
       <w:r>
         <w:rPr/>
@@ -23153,7 +23153,7 @@
         <w:pStyle w:val="Heading3"/>
         <w:rPr/>
       </w:pPr>
-      <w:bookmarkStart w:id="87" w:name="__RefHeading___Toc5320_863242435"/>
+      <w:bookmarkStart w:id="87" w:name="__RefHeading___Toc5333_644927476"/>
       <w:bookmarkEnd w:id="87"/>
       <w:r>
         <w:rPr/>
@@ -23185,7 +23185,7 @@
         <w:pStyle w:val="Heading2"/>
         <w:rPr/>
       </w:pPr>
-      <w:bookmarkStart w:id="88" w:name="__RefHeading___Toc5322_863242435"/>
+      <w:bookmarkStart w:id="88" w:name="__RefHeading___Toc5335_644927476"/>
       <w:bookmarkEnd w:id="88"/>
       <w:r>
         <w:rPr/>
@@ -23197,7 +23197,7 @@
         <w:pStyle w:val="Heading3"/>
         <w:rPr/>
       </w:pPr>
-      <w:bookmarkStart w:id="89" w:name="__RefHeading___Toc5324_863242435"/>
+      <w:bookmarkStart w:id="89" w:name="__RefHeading___Toc5337_644927476"/>
       <w:bookmarkEnd w:id="89"/>
       <w:r>
         <w:rPr/>
@@ -23229,7 +23229,7 @@
         <w:pStyle w:val="Heading3"/>
         <w:rPr/>
       </w:pPr>
-      <w:bookmarkStart w:id="90" w:name="__RefHeading___Toc5326_863242435"/>
+      <w:bookmarkStart w:id="90" w:name="__RefHeading___Toc5339_644927476"/>
       <w:bookmarkEnd w:id="90"/>
       <w:r>
         <w:rPr/>
@@ -23251,7 +23251,7 @@
         <w:pStyle w:val="Heading2"/>
         <w:rPr/>
       </w:pPr>
-      <w:bookmarkStart w:id="91" w:name="__RefHeading___Toc5328_863242435"/>
+      <w:bookmarkStart w:id="91" w:name="__RefHeading___Toc5341_644927476"/>
       <w:bookmarkEnd w:id="91"/>
       <w:r>
         <w:rPr/>
@@ -23283,7 +23283,7 @@
         <w:pStyle w:val="Heading2"/>
         <w:rPr/>
       </w:pPr>
-      <w:bookmarkStart w:id="92" w:name="__RefHeading___Toc5330_863242435"/>
+      <w:bookmarkStart w:id="92" w:name="__RefHeading___Toc5343_644927476"/>
       <w:bookmarkEnd w:id="92"/>
       <w:r>
         <w:rPr/>
@@ -24101,7 +24101,7 @@
         <w:pStyle w:val="Heading2"/>
         <w:rPr/>
       </w:pPr>
-      <w:bookmarkStart w:id="93" w:name="__RefHeading___Toc5332_863242435"/>
+      <w:bookmarkStart w:id="93" w:name="__RefHeading___Toc5345_644927476"/>
       <w:bookmarkEnd w:id="93"/>
       <w:r>
         <w:rPr/>
@@ -24227,7 +24227,7 @@
         <w:pStyle w:val="Heading2"/>
         <w:rPr/>
       </w:pPr>
-      <w:bookmarkStart w:id="94" w:name="__RefHeading___Toc5334_863242435"/>
+      <w:bookmarkStart w:id="94" w:name="__RefHeading___Toc5347_644927476"/>
       <w:bookmarkEnd w:id="94"/>
       <w:r>
         <w:rPr/>
@@ -24241,7 +24241,7 @@
       </w:pPr>
       <w:r>
         <w:rPr/>
-        <w:t>La suite compte 103 cas de test. Les 67 tests unitaires n'ont besoin ni de base de données, ni de réseau, ni de clé d'API : ils couvrent le nettoyage, les métadonnées, le découpage, la validation des fichiers, la détection d'injection, MinHash, l'extraction, la résolution d'entités, la fusion, le PageRank personnalisé, la classification, la suffisance, les conflits, la génération, la vérification, la sécurité et les clients LLM, ces derniers à l'aide de réponses simulées. Les 36 tests d'intégration s'exécutent sur une base Neo4j dédiée, vidée à chaque exécution : ingestion réelle du corpus, idempotence, cycle de vie d'un document, versions, contrôle d'accès dans la recherche, le graphe et l'API, comportement du workflow (réponse, abstention, contradiction, LLM simulé qui invente une citation ou ne cite rien, panne du fournisseur), experts et recommandations.</w:t>
+        <w:t>La suite compte 106 cas de test. Les 69 tests unitaires n'ont besoin ni de base de données, ni de réseau, ni de clé d'API : ils couvrent le nettoyage, les métadonnées, le découpage, la validation des fichiers, la détection d'injection, MinHash, l'extraction, la résolution d'entités, la fusion, le PageRank personnalisé, la classification, la suffisance, les conflits, la génération, la vérification, la sécurité et les clients LLM, ces derniers à l'aide de réponses simulées. Les 37 tests d'intégration s'exécutent sur une base Neo4j dédiée, vidée à chaque exécution : ingestion réelle du corpus, idempotence, cycle de vie d'un document, versions, contrôle d'accès dans la recherche, le graphe et l'API, comportement du workflow (réponse, abstention, contradiction, LLM simulé qui invente une citation ou ne cite rien, panne du fournisseur), experts et recommandations.</w:t>
       </w:r>
     </w:p>
     <w:p>
@@ -24249,7 +24249,7 @@
         <w:pStyle w:val="Heading2"/>
         <w:rPr/>
       </w:pPr>
-      <w:bookmarkStart w:id="95" w:name="__RefHeading___Toc5336_863242435"/>
+      <w:bookmarkStart w:id="95" w:name="__RefHeading___Toc5349_644927476"/>
       <w:bookmarkEnd w:id="95"/>
       <w:r>
         <w:rPr/>
@@ -25278,7 +25278,7 @@
         <w:pStyle w:val="Heading1"/>
         <w:rPr/>
       </w:pPr>
-      <w:bookmarkStart w:id="96" w:name="__RefHeading___Toc5338_863242435"/>
+      <w:bookmarkStart w:id="96" w:name="__RefHeading___Toc5351_644927476"/>
       <w:bookmarkEnd w:id="96"/>
       <w:r>
         <w:rPr/>
@@ -25300,7 +25300,7 @@
         <w:pStyle w:val="Heading2"/>
         <w:rPr/>
       </w:pPr>
-      <w:bookmarkStart w:id="97" w:name="__RefHeading___Toc5340_863242435"/>
+      <w:bookmarkStart w:id="97" w:name="__RefHeading___Toc5353_644927476"/>
       <w:bookmarkEnd w:id="97"/>
       <w:r>
         <w:rPr/>
@@ -25416,7 +25416,7 @@
         <w:pStyle w:val="Heading2"/>
         <w:rPr/>
       </w:pPr>
-      <w:bookmarkStart w:id="98" w:name="__RefHeading___Toc5342_863242435"/>
+      <w:bookmarkStart w:id="98" w:name="__RefHeading___Toc5355_644927476"/>
       <w:bookmarkEnd w:id="98"/>
       <w:r>
         <w:rPr/>
@@ -25799,7 +25799,7 @@
         <w:pStyle w:val="Heading2"/>
         <w:rPr/>
       </w:pPr>
-      <w:bookmarkStart w:id="99" w:name="__RefHeading___Toc5344_863242435"/>
+      <w:bookmarkStart w:id="99" w:name="__RefHeading___Toc5357_644927476"/>
       <w:bookmarkEnd w:id="99"/>
       <w:r>
         <w:rPr/>
@@ -25811,7 +25811,7 @@
         <w:pStyle w:val="Heading3"/>
         <w:rPr/>
       </w:pPr>
-      <w:bookmarkStart w:id="100" w:name="__RefHeading___Toc5346_863242435"/>
+      <w:bookmarkStart w:id="100" w:name="__RefHeading___Toc5359_644927476"/>
       <w:bookmarkEnd w:id="100"/>
       <w:r>
         <w:rPr/>
@@ -27150,7 +27150,7 @@
         <w:pStyle w:val="Heading3"/>
         <w:rPr/>
       </w:pPr>
-      <w:bookmarkStart w:id="101" w:name="__RefHeading___Toc5348_863242435"/>
+      <w:bookmarkStart w:id="101" w:name="__RefHeading___Toc5361_644927476"/>
       <w:bookmarkEnd w:id="101"/>
       <w:r>
         <w:rPr/>
@@ -27266,7 +27266,7 @@
         <w:pStyle w:val="Heading3"/>
         <w:rPr/>
       </w:pPr>
-      <w:bookmarkStart w:id="102" w:name="__RefHeading___Toc5350_863242435"/>
+      <w:bookmarkStart w:id="102" w:name="__RefHeading___Toc5363_644927476"/>
       <w:bookmarkEnd w:id="102"/>
       <w:r>
         <w:rPr/>
@@ -27382,7 +27382,7 @@
         <w:pStyle w:val="Heading2"/>
         <w:rPr/>
       </w:pPr>
-      <w:bookmarkStart w:id="103" w:name="__RefHeading___Toc5352_863242435"/>
+      <w:bookmarkStart w:id="103" w:name="__RefHeading___Toc5365_644927476"/>
       <w:bookmarkEnd w:id="103"/>
       <w:r>
         <w:rPr/>
@@ -27394,7 +27394,7 @@
         <w:pStyle w:val="Heading3"/>
         <w:rPr/>
       </w:pPr>
-      <w:bookmarkStart w:id="104" w:name="__RefHeading___Toc5354_863242435"/>
+      <w:bookmarkStart w:id="104" w:name="__RefHeading___Toc5367_644927476"/>
       <w:bookmarkEnd w:id="104"/>
       <w:r>
         <w:rPr/>
@@ -28504,7 +28504,7 @@
         <w:pStyle w:val="Heading3"/>
         <w:rPr/>
       </w:pPr>
-      <w:bookmarkStart w:id="105" w:name="__RefHeading___Toc5356_863242435"/>
+      <w:bookmarkStart w:id="105" w:name="__RefHeading___Toc5369_644927476"/>
       <w:bookmarkEnd w:id="105"/>
       <w:r>
         <w:rPr/>
@@ -28528,6 +28528,16 @@
       </w:pPr>
       <w:r>
         <w:rPr/>
+        <w:t>Cette dernière mesure appelle une réserve : dans la campagne principale, 62 des 66 questions sont posées avec le compte administrateur, qui voit tous les documents. Nous avons donc conduit un audit complémentaire, qui rejoue les 66 questions avec trois comptes restreints (diffusion générale seule, Conformité, DSI) et pour les cinq architectures, soit 990 réponses. Aucune ne contient de passage, de fait du graphe ou de preuve d'expertise issu d'un document non autorisé.</w:t>
+      </w:r>
+    </w:p>
+    <w:p>
+      <w:pPr>
+        <w:pStyle w:val="BodyText"/>
+        <w:rPr/>
+      </w:pPr>
+      <w:r>
+        <w:rPr/>
         <w:t>Pour l'architecture finale, 93 % des phrases des réponses sont appuyées par les sources qu'elles citent, et 96 % des réponses citent au moins un document indispensable. La précision des citations, part des documents cités qui font partie des documents de référence, est plus modeste (0,59) : les réponses citent aussi des documents connexes, pertinents pour le lecteur mais absents de nos annotations.</w:t>
       </w:r>
     </w:p>
@@ -28536,7 +28546,7 @@
         <w:pStyle w:val="Heading3"/>
         <w:rPr/>
       </w:pPr>
-      <w:bookmarkStart w:id="106" w:name="__RefHeading___Toc5358_863242435"/>
+      <w:bookmarkStart w:id="106" w:name="__RefHeading___Toc5371_644927476"/>
       <w:bookmarkEnd w:id="106"/>
       <w:r>
         <w:rPr/>
@@ -28568,7 +28578,7 @@
         <w:pStyle w:val="Heading2"/>
         <w:rPr/>
       </w:pPr>
-      <w:bookmarkStart w:id="107" w:name="__RefHeading___Toc5360_863242435"/>
+      <w:bookmarkStart w:id="107" w:name="__RefHeading___Toc5373_644927476"/>
       <w:bookmarkEnd w:id="107"/>
       <w:r>
         <w:rPr/>
@@ -28580,7 +28590,7 @@
         <w:pStyle w:val="Heading3"/>
         <w:rPr/>
       </w:pPr>
-      <w:bookmarkStart w:id="108" w:name="__RefHeading___Toc5362_863242435"/>
+      <w:bookmarkStart w:id="108" w:name="__RefHeading___Toc5375_644927476"/>
       <w:bookmarkEnd w:id="108"/>
       <w:r>
         <w:rPr/>
@@ -28696,7 +28706,7 @@
         <w:pStyle w:val="Heading3"/>
         <w:rPr/>
       </w:pPr>
-      <w:bookmarkStart w:id="109" w:name="__RefHeading___Toc5364_863242435"/>
+      <w:bookmarkStart w:id="109" w:name="__RefHeading___Toc5377_644927476"/>
       <w:bookmarkEnd w:id="109"/>
       <w:r>
         <w:rPr/>
@@ -28718,7 +28728,7 @@
         <w:pStyle w:val="Heading2"/>
         <w:rPr/>
       </w:pPr>
-      <w:bookmarkStart w:id="110" w:name="__RefHeading___Toc5366_863242435"/>
+      <w:bookmarkStart w:id="110" w:name="__RefHeading___Toc5379_644927476"/>
       <w:bookmarkEnd w:id="110"/>
       <w:r>
         <w:rPr/>
@@ -29341,7 +29351,7 @@
         <w:pStyle w:val="Heading2"/>
         <w:rPr/>
       </w:pPr>
-      <w:bookmarkStart w:id="111" w:name="__RefHeading___Toc5368_863242435"/>
+      <w:bookmarkStart w:id="111" w:name="__RefHeading___Toc5381_644927476"/>
       <w:bookmarkEnd w:id="111"/>
       <w:r>
         <w:rPr/>
@@ -30109,7 +30119,7 @@
         <w:pStyle w:val="Heading2"/>
         <w:rPr/>
       </w:pPr>
-      <w:bookmarkStart w:id="112" w:name="__RefHeading___Toc5370_863242435"/>
+      <w:bookmarkStart w:id="112" w:name="__RefHeading___Toc5383_644927476"/>
       <w:bookmarkEnd w:id="112"/>
       <w:r>
         <w:rPr/>
@@ -30199,7 +30209,7 @@
         <w:pStyle w:val="Heading2"/>
         <w:rPr/>
       </w:pPr>
-      <w:bookmarkStart w:id="113" w:name="__RefHeading___Toc5372_863242435"/>
+      <w:bookmarkStart w:id="113" w:name="__RefHeading___Toc5385_644927476"/>
       <w:bookmarkEnd w:id="113"/>
       <w:r>
         <w:rPr/>
@@ -30928,7 +30938,7 @@
         <w:pStyle w:val="Heading2"/>
         <w:rPr/>
       </w:pPr>
-      <w:bookmarkStart w:id="114" w:name="__RefHeading___Toc5374_863242435"/>
+      <w:bookmarkStart w:id="114" w:name="__RefHeading___Toc5387_644927476"/>
       <w:bookmarkEnd w:id="114"/>
       <w:r>
         <w:rPr/>
@@ -31025,7 +31035,7 @@
         <w:pStyle w:val="Heading2"/>
         <w:rPr/>
       </w:pPr>
-      <w:bookmarkStart w:id="115" w:name="__RefHeading___Toc5376_863242435"/>
+      <w:bookmarkStart w:id="115" w:name="__RefHeading___Toc5389_644927476"/>
       <w:bookmarkEnd w:id="115"/>
       <w:r>
         <w:rPr/>
@@ -31108,7 +31118,7 @@
         <w:pStyle w:val="Heading1"/>
         <w:rPr/>
       </w:pPr>
-      <w:bookmarkStart w:id="116" w:name="__RefHeading___Toc5378_863242435"/>
+      <w:bookmarkStart w:id="116" w:name="__RefHeading___Toc5391_644927476"/>
       <w:bookmarkEnd w:id="116"/>
       <w:r>
         <w:rPr/>
@@ -31141,7 +31151,7 @@
         <w:pStyle w:val="Heading2"/>
         <w:rPr/>
       </w:pPr>
-      <w:bookmarkStart w:id="117" w:name="__RefHeading___Toc5380_863242435"/>
+      <w:bookmarkStart w:id="117" w:name="__RefHeading___Toc5393_644927476"/>
       <w:bookmarkEnd w:id="117"/>
       <w:r>
         <w:rPr/>
@@ -31153,7 +31163,7 @@
         <w:pStyle w:val="Heading3"/>
         <w:rPr/>
       </w:pPr>
-      <w:bookmarkStart w:id="118" w:name="__RefHeading___Toc5382_863242435"/>
+      <w:bookmarkStart w:id="118" w:name="__RefHeading___Toc5395_644927476"/>
       <w:bookmarkEnd w:id="118"/>
       <w:r>
         <w:rPr/>
@@ -31259,7 +31269,7 @@
         <w:pStyle w:val="Heading3"/>
         <w:rPr/>
       </w:pPr>
-      <w:bookmarkStart w:id="119" w:name="__RefHeading___Toc5384_863242435"/>
+      <w:bookmarkStart w:id="119" w:name="__RefHeading___Toc5397_644927476"/>
       <w:bookmarkEnd w:id="119"/>
       <w:r>
         <w:rPr/>
@@ -31999,7 +32009,7 @@
         <w:pStyle w:val="Heading3"/>
         <w:rPr/>
       </w:pPr>
-      <w:bookmarkStart w:id="120" w:name="__RefHeading___Toc5386_863242435"/>
+      <w:bookmarkStart w:id="120" w:name="__RefHeading___Toc5399_644927476"/>
       <w:bookmarkEnd w:id="120"/>
       <w:r>
         <w:rPr/>
@@ -33674,7 +33684,7 @@
         <w:pStyle w:val="Heading2"/>
         <w:rPr/>
       </w:pPr>
-      <w:bookmarkStart w:id="121" w:name="__RefHeading___Toc5388_863242435"/>
+      <w:bookmarkStart w:id="121" w:name="__RefHeading___Toc5401_644927476"/>
       <w:bookmarkEnd w:id="121"/>
       <w:r>
         <w:rPr/>
@@ -34166,7 +34176,7 @@
                 <w:sz w:val="19"/>
                 <w:szCs w:val="19"/>
               </w:rPr>
-              <w:t>document illisible ou sans contenu exploitable</w:t>
+              <w:t>document illisible, sans contenu exploitable ou sans diffusion déclarée</w:t>
             </w:r>
           </w:p>
         </w:tc>
@@ -34440,7 +34450,7 @@
         <w:pStyle w:val="Heading2"/>
         <w:rPr/>
       </w:pPr>
-      <w:bookmarkStart w:id="122" w:name="__RefHeading___Toc5390_863242435"/>
+      <w:bookmarkStart w:id="122" w:name="__RefHeading___Toc5403_644927476"/>
       <w:bookmarkEnd w:id="122"/>
       <w:r>
         <w:rPr/>
@@ -34507,10 +34517,10 @@
         </w:tblCellMar>
       </w:tblPr>
       <w:tblGrid>
-        <w:gridCol w:w="1820"/>
-        <w:gridCol w:w="1929"/>
-        <w:gridCol w:w="2464"/>
-        <w:gridCol w:w="2573"/>
+        <w:gridCol w:w="1798"/>
+        <w:gridCol w:w="1905"/>
+        <w:gridCol w:w="2541"/>
+        <w:gridCol w:w="2542"/>
       </w:tblGrid>
       <w:tr>
         <w:trPr>
@@ -34518,7 +34528,7 @@
         </w:trPr>
         <w:tc>
           <w:tcPr>
-            <w:tcW w:w="1820" w:type="dxa"/>
+            <w:tcW w:w="1798" w:type="dxa"/>
             <w:tcBorders>
               <w:top w:val="single" w:sz="4" w:space="0" w:color="A6A6A6"/>
               <w:left w:val="single" w:sz="4" w:space="0" w:color="A6A6A6"/>
@@ -34549,7 +34559,7 @@
         </w:tc>
         <w:tc>
           <w:tcPr>
-            <w:tcW w:w="1929" w:type="dxa"/>
+            <w:tcW w:w="1905" w:type="dxa"/>
             <w:tcBorders>
               <w:top w:val="single" w:sz="4" w:space="0" w:color="A6A6A6"/>
               <w:left w:val="single" w:sz="4" w:space="0" w:color="A6A6A6"/>
@@ -34580,7 +34590,7 @@
         </w:tc>
         <w:tc>
           <w:tcPr>
-            <w:tcW w:w="2464" w:type="dxa"/>
+            <w:tcW w:w="2541" w:type="dxa"/>
             <w:tcBorders>
               <w:top w:val="single" w:sz="4" w:space="0" w:color="A6A6A6"/>
               <w:left w:val="single" w:sz="4" w:space="0" w:color="A6A6A6"/>
@@ -34611,7 +34621,7 @@
         </w:tc>
         <w:tc>
           <w:tcPr>
-            <w:tcW w:w="2573" w:type="dxa"/>
+            <w:tcW w:w="2542" w:type="dxa"/>
             <w:tcBorders>
               <w:top w:val="single" w:sz="4" w:space="0" w:color="A6A6A6"/>
               <w:left w:val="single" w:sz="4" w:space="0" w:color="A6A6A6"/>
@@ -34647,7 +34657,7 @@
         </w:trPr>
         <w:tc>
           <w:tcPr>
-            <w:tcW w:w="1820" w:type="dxa"/>
+            <w:tcW w:w="1798" w:type="dxa"/>
             <w:tcBorders>
               <w:top w:val="single" w:sz="4" w:space="0" w:color="A6A6A6"/>
               <w:left w:val="single" w:sz="4" w:space="0" w:color="A6A6A6"/>
@@ -34675,7 +34685,7 @@
         </w:tc>
         <w:tc>
           <w:tcPr>
-            <w:tcW w:w="1929" w:type="dxa"/>
+            <w:tcW w:w="1905" w:type="dxa"/>
             <w:tcBorders>
               <w:top w:val="single" w:sz="4" w:space="0" w:color="A6A6A6"/>
               <w:left w:val="single" w:sz="4" w:space="0" w:color="A6A6A6"/>
@@ -34703,7 +34713,7 @@
         </w:tc>
         <w:tc>
           <w:tcPr>
-            <w:tcW w:w="2464" w:type="dxa"/>
+            <w:tcW w:w="2541" w:type="dxa"/>
             <w:tcBorders>
               <w:top w:val="single" w:sz="4" w:space="0" w:color="A6A6A6"/>
               <w:left w:val="single" w:sz="4" w:space="0" w:color="A6A6A6"/>
@@ -34731,7 +34741,7 @@
         </w:tc>
         <w:tc>
           <w:tcPr>
-            <w:tcW w:w="2573" w:type="dxa"/>
+            <w:tcW w:w="2542" w:type="dxa"/>
             <w:tcBorders>
               <w:top w:val="single" w:sz="4" w:space="0" w:color="A6A6A6"/>
               <w:left w:val="single" w:sz="4" w:space="0" w:color="A6A6A6"/>
@@ -34764,7 +34774,7 @@
         </w:trPr>
         <w:tc>
           <w:tcPr>
-            <w:tcW w:w="1820" w:type="dxa"/>
+            <w:tcW w:w="1798" w:type="dxa"/>
             <w:tcBorders>
               <w:top w:val="single" w:sz="4" w:space="0" w:color="A6A6A6"/>
               <w:left w:val="single" w:sz="4" w:space="0" w:color="A6A6A6"/>
@@ -34792,7 +34802,7 @@
         </w:tc>
         <w:tc>
           <w:tcPr>
-            <w:tcW w:w="1929" w:type="dxa"/>
+            <w:tcW w:w="1905" w:type="dxa"/>
             <w:tcBorders>
               <w:top w:val="single" w:sz="4" w:space="0" w:color="A6A6A6"/>
               <w:left w:val="single" w:sz="4" w:space="0" w:color="A6A6A6"/>
@@ -34820,35 +34830,35 @@
         </w:tc>
         <w:tc>
           <w:tcPr>
-            <w:tcW w:w="2464" w:type="dxa"/>
-            <w:tcBorders>
-              <w:top w:val="single" w:sz="4" w:space="0" w:color="A6A6A6"/>
-              <w:left w:val="single" w:sz="4" w:space="0" w:color="A6A6A6"/>
-              <w:bottom w:val="single" w:sz="4" w:space="0" w:color="A6A6A6"/>
-              <w:right w:val="single" w:sz="4" w:space="0" w:color="A6A6A6"/>
-            </w:tcBorders>
-            <w:vAlign w:val="center"/>
-          </w:tcPr>
-          <w:p>
-            <w:pPr>
-              <w:pStyle w:val="Normal"/>
-              <w:spacing w:lineRule="auto" w:line="240" w:before="0" w:after="0"/>
-              <w:jc w:val="left"/>
-              <w:rPr/>
-            </w:pPr>
-            <w:r>
-              <w:rPr>
-                <w:rFonts w:eastAsia="Times New Roman" w:cs="Times New Roman"/>
-                <w:sz w:val="19"/>
-                <w:szCs w:val="19"/>
-              </w:rPr>
-              <w:t>filtrage avant recherche, tests d'accès</w:t>
-            </w:r>
-          </w:p>
-        </w:tc>
-        <w:tc>
-          <w:tcPr>
-            <w:tcW w:w="2573" w:type="dxa"/>
+            <w:tcW w:w="2541" w:type="dxa"/>
+            <w:tcBorders>
+              <w:top w:val="single" w:sz="4" w:space="0" w:color="A6A6A6"/>
+              <w:left w:val="single" w:sz="4" w:space="0" w:color="A6A6A6"/>
+              <w:bottom w:val="single" w:sz="4" w:space="0" w:color="A6A6A6"/>
+              <w:right w:val="single" w:sz="4" w:space="0" w:color="A6A6A6"/>
+            </w:tcBorders>
+            <w:vAlign w:val="center"/>
+          </w:tcPr>
+          <w:p>
+            <w:pPr>
+              <w:pStyle w:val="Normal"/>
+              <w:spacing w:lineRule="auto" w:line="240" w:before="0" w:after="0"/>
+              <w:jc w:val="left"/>
+              <w:rPr/>
+            </w:pPr>
+            <w:r>
+              <w:rPr>
+                <w:rFonts w:eastAsia="Times New Roman" w:cs="Times New Roman"/>
+                <w:sz w:val="19"/>
+                <w:szCs w:val="19"/>
+              </w:rPr>
+              <w:t>filtrage avant recherche, refus par défaut sans diffusion déclarée, audit d'accès</w:t>
+            </w:r>
+          </w:p>
+        </w:tc>
+        <w:tc>
+          <w:tcPr>
+            <w:tcW w:w="2542" w:type="dxa"/>
             <w:tcBorders>
               <w:top w:val="single" w:sz="4" w:space="0" w:color="A6A6A6"/>
               <w:left w:val="single" w:sz="4" w:space="0" w:color="A6A6A6"/>
@@ -34881,7 +34891,7 @@
         </w:trPr>
         <w:tc>
           <w:tcPr>
-            <w:tcW w:w="1820" w:type="dxa"/>
+            <w:tcW w:w="1798" w:type="dxa"/>
             <w:tcBorders>
               <w:top w:val="single" w:sz="4" w:space="0" w:color="A6A6A6"/>
               <w:left w:val="single" w:sz="4" w:space="0" w:color="A6A6A6"/>
@@ -34909,7 +34919,7 @@
         </w:tc>
         <w:tc>
           <w:tcPr>
-            <w:tcW w:w="1929" w:type="dxa"/>
+            <w:tcW w:w="1905" w:type="dxa"/>
             <w:tcBorders>
               <w:top w:val="single" w:sz="4" w:space="0" w:color="A6A6A6"/>
               <w:left w:val="single" w:sz="4" w:space="0" w:color="A6A6A6"/>
@@ -34937,7 +34947,7 @@
         </w:tc>
         <w:tc>
           <w:tcPr>
-            <w:tcW w:w="2464" w:type="dxa"/>
+            <w:tcW w:w="2541" w:type="dxa"/>
             <w:tcBorders>
               <w:top w:val="single" w:sz="4" w:space="0" w:color="A6A6A6"/>
               <w:left w:val="single" w:sz="4" w:space="0" w:color="A6A6A6"/>
@@ -34965,7 +34975,7 @@
         </w:tc>
         <w:tc>
           <w:tcPr>
-            <w:tcW w:w="2573" w:type="dxa"/>
+            <w:tcW w:w="2542" w:type="dxa"/>
             <w:tcBorders>
               <w:top w:val="single" w:sz="4" w:space="0" w:color="A6A6A6"/>
               <w:left w:val="single" w:sz="4" w:space="0" w:color="A6A6A6"/>
@@ -34998,7 +35008,7 @@
         </w:trPr>
         <w:tc>
           <w:tcPr>
-            <w:tcW w:w="1820" w:type="dxa"/>
+            <w:tcW w:w="1798" w:type="dxa"/>
             <w:tcBorders>
               <w:top w:val="single" w:sz="4" w:space="0" w:color="A6A6A6"/>
               <w:left w:val="single" w:sz="4" w:space="0" w:color="A6A6A6"/>
@@ -35026,7 +35036,7 @@
         </w:tc>
         <w:tc>
           <w:tcPr>
-            <w:tcW w:w="1929" w:type="dxa"/>
+            <w:tcW w:w="1905" w:type="dxa"/>
             <w:tcBorders>
               <w:top w:val="single" w:sz="4" w:space="0" w:color="A6A6A6"/>
               <w:left w:val="single" w:sz="4" w:space="0" w:color="A6A6A6"/>
@@ -35054,7 +35064,7 @@
         </w:tc>
         <w:tc>
           <w:tcPr>
-            <w:tcW w:w="2464" w:type="dxa"/>
+            <w:tcW w:w="2541" w:type="dxa"/>
             <w:tcBorders>
               <w:top w:val="single" w:sz="4" w:space="0" w:color="A6A6A6"/>
               <w:left w:val="single" w:sz="4" w:space="0" w:color="A6A6A6"/>
@@ -35082,7 +35092,7 @@
         </w:tc>
         <w:tc>
           <w:tcPr>
-            <w:tcW w:w="2573" w:type="dxa"/>
+            <w:tcW w:w="2542" w:type="dxa"/>
             <w:tcBorders>
               <w:top w:val="single" w:sz="4" w:space="0" w:color="A6A6A6"/>
               <w:left w:val="single" w:sz="4" w:space="0" w:color="A6A6A6"/>
@@ -35115,7 +35125,7 @@
         </w:trPr>
         <w:tc>
           <w:tcPr>
-            <w:tcW w:w="1820" w:type="dxa"/>
+            <w:tcW w:w="1798" w:type="dxa"/>
             <w:tcBorders>
               <w:top w:val="single" w:sz="4" w:space="0" w:color="A6A6A6"/>
               <w:left w:val="single" w:sz="4" w:space="0" w:color="A6A6A6"/>
@@ -35143,7 +35153,7 @@
         </w:tc>
         <w:tc>
           <w:tcPr>
-            <w:tcW w:w="1929" w:type="dxa"/>
+            <w:tcW w:w="1905" w:type="dxa"/>
             <w:tcBorders>
               <w:top w:val="single" w:sz="4" w:space="0" w:color="A6A6A6"/>
               <w:left w:val="single" w:sz="4" w:space="0" w:color="A6A6A6"/>
@@ -35171,7 +35181,7 @@
         </w:tc>
         <w:tc>
           <w:tcPr>
-            <w:tcW w:w="2464" w:type="dxa"/>
+            <w:tcW w:w="2541" w:type="dxa"/>
             <w:tcBorders>
               <w:top w:val="single" w:sz="4" w:space="0" w:color="A6A6A6"/>
               <w:left w:val="single" w:sz="4" w:space="0" w:color="A6A6A6"/>
@@ -35199,7 +35209,7 @@
         </w:tc>
         <w:tc>
           <w:tcPr>
-            <w:tcW w:w="2573" w:type="dxa"/>
+            <w:tcW w:w="2542" w:type="dxa"/>
             <w:tcBorders>
               <w:top w:val="single" w:sz="4" w:space="0" w:color="A6A6A6"/>
               <w:left w:val="single" w:sz="4" w:space="0" w:color="A6A6A6"/>
@@ -35232,7 +35242,7 @@
         </w:trPr>
         <w:tc>
           <w:tcPr>
-            <w:tcW w:w="1820" w:type="dxa"/>
+            <w:tcW w:w="1798" w:type="dxa"/>
             <w:tcBorders>
               <w:top w:val="single" w:sz="4" w:space="0" w:color="A6A6A6"/>
               <w:left w:val="single" w:sz="4" w:space="0" w:color="A6A6A6"/>
@@ -35260,7 +35270,7 @@
         </w:tc>
         <w:tc>
           <w:tcPr>
-            <w:tcW w:w="1929" w:type="dxa"/>
+            <w:tcW w:w="1905" w:type="dxa"/>
             <w:tcBorders>
               <w:top w:val="single" w:sz="4" w:space="0" w:color="A6A6A6"/>
               <w:left w:val="single" w:sz="4" w:space="0" w:color="A6A6A6"/>
@@ -35288,7 +35298,7 @@
         </w:tc>
         <w:tc>
           <w:tcPr>
-            <w:tcW w:w="2464" w:type="dxa"/>
+            <w:tcW w:w="2541" w:type="dxa"/>
             <w:tcBorders>
               <w:top w:val="single" w:sz="4" w:space="0" w:color="A6A6A6"/>
               <w:left w:val="single" w:sz="4" w:space="0" w:color="A6A6A6"/>
@@ -35316,7 +35326,7 @@
         </w:tc>
         <w:tc>
           <w:tcPr>
-            <w:tcW w:w="2573" w:type="dxa"/>
+            <w:tcW w:w="2542" w:type="dxa"/>
             <w:tcBorders>
               <w:top w:val="single" w:sz="4" w:space="0" w:color="A6A6A6"/>
               <w:left w:val="single" w:sz="4" w:space="0" w:color="A6A6A6"/>
@@ -35349,7 +35359,7 @@
         </w:trPr>
         <w:tc>
           <w:tcPr>
-            <w:tcW w:w="1820" w:type="dxa"/>
+            <w:tcW w:w="1798" w:type="dxa"/>
             <w:tcBorders>
               <w:top w:val="single" w:sz="4" w:space="0" w:color="A6A6A6"/>
               <w:left w:val="single" w:sz="4" w:space="0" w:color="A6A6A6"/>
@@ -35377,7 +35387,7 @@
         </w:tc>
         <w:tc>
           <w:tcPr>
-            <w:tcW w:w="1929" w:type="dxa"/>
+            <w:tcW w:w="1905" w:type="dxa"/>
             <w:tcBorders>
               <w:top w:val="single" w:sz="4" w:space="0" w:color="A6A6A6"/>
               <w:left w:val="single" w:sz="4" w:space="0" w:color="A6A6A6"/>
@@ -35405,7 +35415,7 @@
         </w:tc>
         <w:tc>
           <w:tcPr>
-            <w:tcW w:w="2464" w:type="dxa"/>
+            <w:tcW w:w="2541" w:type="dxa"/>
             <w:tcBorders>
               <w:top w:val="single" w:sz="4" w:space="0" w:color="A6A6A6"/>
               <w:left w:val="single" w:sz="4" w:space="0" w:color="A6A6A6"/>
@@ -35433,7 +35443,7 @@
         </w:tc>
         <w:tc>
           <w:tcPr>
-            <w:tcW w:w="2573" w:type="dxa"/>
+            <w:tcW w:w="2542" w:type="dxa"/>
             <w:tcBorders>
               <w:top w:val="single" w:sz="4" w:space="0" w:color="A6A6A6"/>
               <w:left w:val="single" w:sz="4" w:space="0" w:color="A6A6A6"/>
@@ -35466,7 +35476,7 @@
         </w:trPr>
         <w:tc>
           <w:tcPr>
-            <w:tcW w:w="1820" w:type="dxa"/>
+            <w:tcW w:w="1798" w:type="dxa"/>
             <w:tcBorders>
               <w:top w:val="single" w:sz="4" w:space="0" w:color="A6A6A6"/>
               <w:left w:val="single" w:sz="4" w:space="0" w:color="A6A6A6"/>
@@ -35494,7 +35504,7 @@
         </w:tc>
         <w:tc>
           <w:tcPr>
-            <w:tcW w:w="1929" w:type="dxa"/>
+            <w:tcW w:w="1905" w:type="dxa"/>
             <w:tcBorders>
               <w:top w:val="single" w:sz="4" w:space="0" w:color="A6A6A6"/>
               <w:left w:val="single" w:sz="4" w:space="0" w:color="A6A6A6"/>
@@ -35522,7 +35532,7 @@
         </w:tc>
         <w:tc>
           <w:tcPr>
-            <w:tcW w:w="2464" w:type="dxa"/>
+            <w:tcW w:w="2541" w:type="dxa"/>
             <w:tcBorders>
               <w:top w:val="single" w:sz="4" w:space="0" w:color="A6A6A6"/>
               <w:left w:val="single" w:sz="4" w:space="0" w:color="A6A6A6"/>
@@ -35550,7 +35560,7 @@
         </w:tc>
         <w:tc>
           <w:tcPr>
-            <w:tcW w:w="2573" w:type="dxa"/>
+            <w:tcW w:w="2542" w:type="dxa"/>
             <w:tcBorders>
               <w:top w:val="single" w:sz="4" w:space="0" w:color="A6A6A6"/>
               <w:left w:val="single" w:sz="4" w:space="0" w:color="A6A6A6"/>
@@ -35664,7 +35674,7 @@
         <w:pStyle w:val="Heading2"/>
         <w:rPr/>
       </w:pPr>
-      <w:bookmarkStart w:id="123" w:name="__RefHeading___Toc5392_863242435"/>
+      <w:bookmarkStart w:id="123" w:name="__RefHeading___Toc5405_644927476"/>
       <w:bookmarkEnd w:id="123"/>
       <w:r>
         <w:rPr/>
@@ -35676,7 +35686,7 @@
         <w:pStyle w:val="Heading3"/>
         <w:rPr/>
       </w:pPr>
-      <w:bookmarkStart w:id="124" w:name="__RefHeading___Toc5394_863242435"/>
+      <w:bookmarkStart w:id="124" w:name="__RefHeading___Toc5407_644927476"/>
       <w:bookmarkEnd w:id="124"/>
       <w:r>
         <w:rPr/>
@@ -36371,7 +36381,7 @@
         <w:pStyle w:val="Heading3"/>
         <w:rPr/>
       </w:pPr>
-      <w:bookmarkStart w:id="125" w:name="__RefHeading___Toc5396_863242435"/>
+      <w:bookmarkStart w:id="125" w:name="__RefHeading___Toc5409_644927476"/>
       <w:bookmarkEnd w:id="125"/>
       <w:r>
         <w:rPr/>
@@ -36519,7 +36529,7 @@
         <w:pStyle w:val="Heading3"/>
         <w:rPr/>
       </w:pPr>
-      <w:bookmarkStart w:id="126" w:name="__RefHeading___Toc5398_863242435"/>
+      <w:bookmarkStart w:id="126" w:name="__RefHeading___Toc5411_644927476"/>
       <w:bookmarkEnd w:id="126"/>
       <w:r>
         <w:rPr/>
@@ -37214,7 +37224,7 @@
         <w:pStyle w:val="Heading3"/>
         <w:rPr/>
       </w:pPr>
-      <w:bookmarkStart w:id="127" w:name="__RefHeading___Toc5400_863242435"/>
+      <w:bookmarkStart w:id="127" w:name="__RefHeading___Toc5413_644927476"/>
       <w:bookmarkEnd w:id="127"/>
       <w:r>
         <w:rPr/>
@@ -37341,7 +37351,7 @@
         <w:pStyle w:val="Heading2"/>
         <w:rPr/>
       </w:pPr>
-      <w:bookmarkStart w:id="128" w:name="__RefHeading___Toc5402_863242435"/>
+      <w:bookmarkStart w:id="128" w:name="__RefHeading___Toc5415_644927476"/>
       <w:bookmarkEnd w:id="128"/>
       <w:r>
         <w:rPr/>
@@ -38621,7 +38631,7 @@
         <w:pStyle w:val="Heading2"/>
         <w:rPr/>
       </w:pPr>
-      <w:bookmarkStart w:id="129" w:name="__RefHeading___Toc5404_863242435"/>
+      <w:bookmarkStart w:id="129" w:name="__RefHeading___Toc5417_644927476"/>
       <w:bookmarkEnd w:id="129"/>
       <w:r>
         <w:rPr/>
@@ -39271,7 +39281,7 @@
         <w:pStyle w:val="Heading2"/>
         <w:rPr/>
       </w:pPr>
-      <w:bookmarkStart w:id="130" w:name="__RefHeading___Toc5406_863242435"/>
+      <w:bookmarkStart w:id="130" w:name="__RefHeading___Toc5419_644927476"/>
       <w:bookmarkEnd w:id="130"/>
       <w:r>
         <w:rPr/>
@@ -39296,7 +39306,7 @@
         <w:pStyle w:val="Heading1"/>
         <w:rPr/>
       </w:pPr>
-      <w:bookmarkStart w:id="131" w:name="__RefHeading___Toc5408_863242435"/>
+      <w:bookmarkStart w:id="131" w:name="__RefHeading___Toc5421_644927476"/>
       <w:bookmarkEnd w:id="131"/>
       <w:r>
         <w:rPr/>
@@ -39308,7 +39318,7 @@
         <w:pStyle w:val="Heading2"/>
         <w:rPr/>
       </w:pPr>
-      <w:bookmarkStart w:id="132" w:name="__RefHeading___Toc5410_863242435"/>
+      <w:bookmarkStart w:id="132" w:name="__RefHeading___Toc5423_644927476"/>
       <w:bookmarkEnd w:id="132"/>
       <w:r>
         <w:rPr/>
@@ -39350,7 +39360,7 @@
         <w:pStyle w:val="Heading2"/>
         <w:rPr/>
       </w:pPr>
-      <w:bookmarkStart w:id="133" w:name="__RefHeading___Toc5412_863242435"/>
+      <w:bookmarkStart w:id="133" w:name="__RefHeading___Toc5425_644927476"/>
       <w:bookmarkEnd w:id="133"/>
       <w:r>
         <w:rPr/>
@@ -39457,7 +39467,7 @@
         <w:pStyle w:val="Heading2"/>
         <w:rPr/>
       </w:pPr>
-      <w:bookmarkStart w:id="134" w:name="__RefHeading___Toc5414_863242435"/>
+      <w:bookmarkStart w:id="134" w:name="__RefHeading___Toc5427_644927476"/>
       <w:bookmarkEnd w:id="134"/>
       <w:r>
         <w:rPr/>
@@ -39479,7 +39489,7 @@
         <w:pStyle w:val="Heading2"/>
         <w:rPr/>
       </w:pPr>
-      <w:bookmarkStart w:id="135" w:name="__RefHeading___Toc5416_863242435"/>
+      <w:bookmarkStart w:id="135" w:name="__RefHeading___Toc5429_644927476"/>
       <w:bookmarkEnd w:id="135"/>
       <w:r>
         <w:rPr/>
@@ -39501,7 +39511,7 @@
         <w:pStyle w:val="Heading2"/>
         <w:rPr/>
       </w:pPr>
-      <w:bookmarkStart w:id="136" w:name="__RefHeading___Toc5418_863242435"/>
+      <w:bookmarkStart w:id="136" w:name="__RefHeading___Toc5431_644927476"/>
       <w:bookmarkEnd w:id="136"/>
       <w:r>
         <w:rPr/>
@@ -39662,7 +39672,7 @@
         <w:pStyle w:val="Heading1"/>
         <w:rPr/>
       </w:pPr>
-      <w:bookmarkStart w:id="137" w:name="__RefHeading___Toc5420_863242435"/>
+      <w:bookmarkStart w:id="137" w:name="__RefHeading___Toc5433_644927476"/>
       <w:bookmarkEnd w:id="137"/>
       <w:r>
         <w:rPr/>
@@ -39684,7 +39694,7 @@
         <w:pStyle w:val="Heading2"/>
         <w:rPr/>
       </w:pPr>
-      <w:bookmarkStart w:id="138" w:name="__RefHeading___Toc5422_863242435"/>
+      <w:bookmarkStart w:id="138" w:name="__RefHeading___Toc5435_644927476"/>
       <w:bookmarkEnd w:id="138"/>
       <w:r>
         <w:rPr/>
@@ -40700,7 +40710,7 @@
         <w:pStyle w:val="Heading2"/>
         <w:rPr/>
       </w:pPr>
-      <w:bookmarkStart w:id="139" w:name="__RefHeading___Toc5424_863242435"/>
+      <w:bookmarkStart w:id="139" w:name="__RefHeading___Toc5437_644927476"/>
       <w:bookmarkEnd w:id="139"/>
       <w:r>
         <w:rPr/>
@@ -40851,7 +40861,7 @@
         <w:pStyle w:val="Heading1"/>
         <w:rPr/>
       </w:pPr>
-      <w:bookmarkStart w:id="140" w:name="__RefHeading___Toc5426_863242435"/>
+      <w:bookmarkStart w:id="140" w:name="__RefHeading___Toc5439_644927476"/>
       <w:bookmarkEnd w:id="140"/>
       <w:r>
         <w:rPr/>
@@ -40885,7 +40895,7 @@
         <w:pStyle w:val="Heading2"/>
         <w:rPr/>
       </w:pPr>
-      <w:bookmarkStart w:id="141" w:name="__RefHeading___Toc5428_863242435"/>
+      <w:bookmarkStart w:id="141" w:name="__RefHeading___Toc5441_644927476"/>
       <w:bookmarkEnd w:id="141"/>
       <w:r>
         <w:rPr/>
@@ -41683,7 +41693,7 @@
         <w:pStyle w:val="Heading2"/>
         <w:rPr/>
       </w:pPr>
-      <w:bookmarkStart w:id="142" w:name="__RefHeading___Toc5430_863242435"/>
+      <w:bookmarkStart w:id="142" w:name="__RefHeading___Toc5443_644927476"/>
       <w:bookmarkEnd w:id="142"/>
       <w:r>
         <w:rPr/>
@@ -43829,7 +43839,7 @@
         <w:pStyle w:val="Heading2"/>
         <w:rPr/>
       </w:pPr>
-      <w:bookmarkStart w:id="143" w:name="__RefHeading___Toc5432_863242435"/>
+      <w:bookmarkStart w:id="143" w:name="__RefHeading___Toc5445_644927476"/>
       <w:bookmarkEnd w:id="143"/>
       <w:r>
         <w:rPr/>
@@ -44032,7 +44042,7 @@
         <w:pStyle w:val="Heading1"/>
         <w:rPr/>
       </w:pPr>
-      <w:bookmarkStart w:id="144" w:name="__RefHeading___Toc5434_863242435"/>
+      <w:bookmarkStart w:id="144" w:name="__RefHeading___Toc5447_644927476"/>
       <w:bookmarkEnd w:id="144"/>
       <w:r>
         <w:rPr/>
@@ -50383,7 +50393,7 @@
         <w:pStyle w:val="Heading1"/>
         <w:rPr/>
       </w:pPr>
-      <w:bookmarkStart w:id="145" w:name="__RefHeading___Toc5436_863242435"/>
+      <w:bookmarkStart w:id="145" w:name="__RefHeading___Toc5449_644927476"/>
       <w:bookmarkEnd w:id="145"/>
       <w:r>
         <w:rPr/>
@@ -51795,7 +51805,7 @@
         <w:pStyle w:val="Heading1"/>
         <w:rPr/>
       </w:pPr>
-      <w:bookmarkStart w:id="146" w:name="__RefHeading___Toc5438_863242435"/>
+      <w:bookmarkStart w:id="146" w:name="__RefHeading___Toc5451_644927476"/>
       <w:bookmarkEnd w:id="146"/>
       <w:r>
         <w:rPr/>
@@ -51817,7 +51827,7 @@
         <w:pStyle w:val="Heading2"/>
         <w:rPr/>
       </w:pPr>
-      <w:bookmarkStart w:id="147" w:name="__RefHeading___Toc5440_863242435"/>
+      <w:bookmarkStart w:id="147" w:name="__RefHeading___Toc5453_644927476"/>
       <w:bookmarkEnd w:id="147"/>
       <w:r>
         <w:rPr/>
@@ -51866,7 +51876,7 @@
         <w:pStyle w:val="Heading2"/>
         <w:rPr/>
       </w:pPr>
-      <w:bookmarkStart w:id="148" w:name="__RefHeading___Toc5442_863242435"/>
+      <w:bookmarkStart w:id="148" w:name="__RefHeading___Toc5455_644927476"/>
       <w:bookmarkEnd w:id="148"/>
       <w:r>
         <w:rPr/>
@@ -51915,7 +51925,7 @@
         <w:pStyle w:val="Heading2"/>
         <w:rPr/>
       </w:pPr>
-      <w:bookmarkStart w:id="149" w:name="__RefHeading___Toc5444_863242435"/>
+      <w:bookmarkStart w:id="149" w:name="__RefHeading___Toc5457_644927476"/>
       <w:bookmarkEnd w:id="149"/>
       <w:r>
         <w:rPr/>
@@ -51964,7 +51974,7 @@
         <w:pStyle w:val="Heading2"/>
         <w:rPr/>
       </w:pPr>
-      <w:bookmarkStart w:id="150" w:name="__RefHeading___Toc5446_863242435"/>
+      <w:bookmarkStart w:id="150" w:name="__RefHeading___Toc5459_644927476"/>
       <w:bookmarkEnd w:id="150"/>
       <w:r>
         <w:rPr/>
@@ -52037,7 +52047,7 @@
         <w:pStyle w:val="Heading2"/>
         <w:rPr/>
       </w:pPr>
-      <w:bookmarkStart w:id="151" w:name="__RefHeading___Toc5448_863242435"/>
+      <w:bookmarkStart w:id="151" w:name="__RefHeading___Toc5461_644927476"/>
       <w:bookmarkEnd w:id="151"/>
       <w:r>
         <w:rPr/>
@@ -52086,7 +52096,7 @@
         <w:pStyle w:val="Heading2"/>
         <w:rPr/>
       </w:pPr>
-      <w:bookmarkStart w:id="152" w:name="__RefHeading___Toc5450_863242435"/>
+      <w:bookmarkStart w:id="152" w:name="__RefHeading___Toc5463_644927476"/>
       <w:bookmarkEnd w:id="152"/>
       <w:r>
         <w:rPr/>
@@ -52138,7 +52148,7 @@
         <w:pStyle w:val="Heading1"/>
         <w:rPr/>
       </w:pPr>
-      <w:bookmarkStart w:id="153" w:name="__RefHeading___Toc5452_863242435"/>
+      <w:bookmarkStart w:id="153" w:name="__RefHeading___Toc5465_644927476"/>
       <w:bookmarkEnd w:id="153"/>
       <w:r>
         <w:rPr/>
@@ -53630,7 +53640,7 @@
         <w:pStyle w:val="Heading1"/>
         <w:rPr/>
       </w:pPr>
-      <w:bookmarkStart w:id="154" w:name="__RefHeading___Toc5454_863242435"/>
+      <w:bookmarkStart w:id="154" w:name="__RefHeading___Toc5467_644927476"/>
       <w:bookmarkEnd w:id="154"/>
       <w:r>
         <w:rPr/>
@@ -53710,9 +53720,9 @@
       </w:tblPr>
       <w:tblGrid>
         <w:gridCol w:w="1020"/>
-        <w:gridCol w:w="1708"/>
-        <w:gridCol w:w="3727"/>
-        <w:gridCol w:w="2331"/>
+        <w:gridCol w:w="1538"/>
+        <w:gridCol w:w="3359"/>
+        <w:gridCol w:w="2869"/>
       </w:tblGrid>
       <w:tr>
         <w:trPr>
@@ -53751,7 +53761,7 @@
         </w:tc>
         <w:tc>
           <w:tcPr>
-            <w:tcW w:w="1708" w:type="dxa"/>
+            <w:tcW w:w="1538" w:type="dxa"/>
             <w:tcBorders>
               <w:top w:val="single" w:sz="4" w:space="0" w:color="A6A6A6"/>
               <w:left w:val="single" w:sz="4" w:space="0" w:color="A6A6A6"/>
@@ -53782,7 +53792,7 @@
         </w:tc>
         <w:tc>
           <w:tcPr>
-            <w:tcW w:w="3727" w:type="dxa"/>
+            <w:tcW w:w="3359" w:type="dxa"/>
             <w:tcBorders>
               <w:top w:val="single" w:sz="4" w:space="0" w:color="A6A6A6"/>
               <w:left w:val="single" w:sz="4" w:space="0" w:color="A6A6A6"/>
@@ -53813,7 +53823,7 @@
         </w:tc>
         <w:tc>
           <w:tcPr>
-            <w:tcW w:w="2331" w:type="dxa"/>
+            <w:tcW w:w="2869" w:type="dxa"/>
             <w:tcBorders>
               <w:top w:val="single" w:sz="4" w:space="0" w:color="A6A6A6"/>
               <w:left w:val="single" w:sz="4" w:space="0" w:color="A6A6A6"/>
@@ -53877,7 +53887,7 @@
         </w:tc>
         <w:tc>
           <w:tcPr>
-            <w:tcW w:w="1708" w:type="dxa"/>
+            <w:tcW w:w="1538" w:type="dxa"/>
             <w:tcBorders>
               <w:top w:val="single" w:sz="4" w:space="0" w:color="A6A6A6"/>
               <w:left w:val="single" w:sz="4" w:space="0" w:color="A6A6A6"/>
@@ -53905,7 +53915,7 @@
         </w:tc>
         <w:tc>
           <w:tcPr>
-            <w:tcW w:w="3727" w:type="dxa"/>
+            <w:tcW w:w="3359" w:type="dxa"/>
             <w:tcBorders>
               <w:top w:val="single" w:sz="4" w:space="0" w:color="A6A6A6"/>
               <w:left w:val="single" w:sz="4" w:space="0" w:color="A6A6A6"/>
@@ -53933,7 +53943,7 @@
         </w:tc>
         <w:tc>
           <w:tcPr>
-            <w:tcW w:w="2331" w:type="dxa"/>
+            <w:tcW w:w="2869" w:type="dxa"/>
             <w:tcBorders>
               <w:top w:val="single" w:sz="4" w:space="0" w:color="A6A6A6"/>
               <w:left w:val="single" w:sz="4" w:space="0" w:color="A6A6A6"/>
@@ -53994,7 +54004,7 @@
         </w:tc>
         <w:tc>
           <w:tcPr>
-            <w:tcW w:w="1708" w:type="dxa"/>
+            <w:tcW w:w="1538" w:type="dxa"/>
             <w:tcBorders>
               <w:top w:val="single" w:sz="4" w:space="0" w:color="A6A6A6"/>
               <w:left w:val="single" w:sz="4" w:space="0" w:color="A6A6A6"/>
@@ -54022,7 +54032,7 @@
         </w:tc>
         <w:tc>
           <w:tcPr>
-            <w:tcW w:w="3727" w:type="dxa"/>
+            <w:tcW w:w="3359" w:type="dxa"/>
             <w:tcBorders>
               <w:top w:val="single" w:sz="4" w:space="0" w:color="A6A6A6"/>
               <w:left w:val="single" w:sz="4" w:space="0" w:color="A6A6A6"/>
@@ -54050,7 +54060,7 @@
         </w:tc>
         <w:tc>
           <w:tcPr>
-            <w:tcW w:w="2331" w:type="dxa"/>
+            <w:tcW w:w="2869" w:type="dxa"/>
             <w:tcBorders>
               <w:top w:val="single" w:sz="4" w:space="0" w:color="A6A6A6"/>
               <w:left w:val="single" w:sz="4" w:space="0" w:color="A6A6A6"/>
@@ -54111,7 +54121,7 @@
         </w:tc>
         <w:tc>
           <w:tcPr>
-            <w:tcW w:w="1708" w:type="dxa"/>
+            <w:tcW w:w="1538" w:type="dxa"/>
             <w:tcBorders>
               <w:top w:val="single" w:sz="4" w:space="0" w:color="A6A6A6"/>
               <w:left w:val="single" w:sz="4" w:space="0" w:color="A6A6A6"/>
@@ -54139,7 +54149,7 @@
         </w:tc>
         <w:tc>
           <w:tcPr>
-            <w:tcW w:w="3727" w:type="dxa"/>
+            <w:tcW w:w="3359" w:type="dxa"/>
             <w:tcBorders>
               <w:top w:val="single" w:sz="4" w:space="0" w:color="A6A6A6"/>
               <w:left w:val="single" w:sz="4" w:space="0" w:color="A6A6A6"/>
@@ -54167,7 +54177,7 @@
         </w:tc>
         <w:tc>
           <w:tcPr>
-            <w:tcW w:w="2331" w:type="dxa"/>
+            <w:tcW w:w="2869" w:type="dxa"/>
             <w:tcBorders>
               <w:top w:val="single" w:sz="4" w:space="0" w:color="A6A6A6"/>
               <w:left w:val="single" w:sz="4" w:space="0" w:color="A6A6A6"/>
@@ -54228,7 +54238,7 @@
         </w:tc>
         <w:tc>
           <w:tcPr>
-            <w:tcW w:w="1708" w:type="dxa"/>
+            <w:tcW w:w="1538" w:type="dxa"/>
             <w:tcBorders>
               <w:top w:val="single" w:sz="4" w:space="0" w:color="A6A6A6"/>
               <w:left w:val="single" w:sz="4" w:space="0" w:color="A6A6A6"/>
@@ -54256,7 +54266,7 @@
         </w:tc>
         <w:tc>
           <w:tcPr>
-            <w:tcW w:w="3727" w:type="dxa"/>
+            <w:tcW w:w="3359" w:type="dxa"/>
             <w:tcBorders>
               <w:top w:val="single" w:sz="4" w:space="0" w:color="A6A6A6"/>
               <w:left w:val="single" w:sz="4" w:space="0" w:color="A6A6A6"/>
@@ -54284,7 +54294,7 @@
         </w:tc>
         <w:tc>
           <w:tcPr>
-            <w:tcW w:w="2331" w:type="dxa"/>
+            <w:tcW w:w="2869" w:type="dxa"/>
             <w:tcBorders>
               <w:top w:val="single" w:sz="4" w:space="0" w:color="A6A6A6"/>
               <w:left w:val="single" w:sz="4" w:space="0" w:color="A6A6A6"/>
@@ -54345,7 +54355,7 @@
         </w:tc>
         <w:tc>
           <w:tcPr>
-            <w:tcW w:w="1708" w:type="dxa"/>
+            <w:tcW w:w="1538" w:type="dxa"/>
             <w:tcBorders>
               <w:top w:val="single" w:sz="4" w:space="0" w:color="A6A6A6"/>
               <w:left w:val="single" w:sz="4" w:space="0" w:color="A6A6A6"/>
@@ -54373,7 +54383,7 @@
         </w:tc>
         <w:tc>
           <w:tcPr>
-            <w:tcW w:w="3727" w:type="dxa"/>
+            <w:tcW w:w="3359" w:type="dxa"/>
             <w:tcBorders>
               <w:top w:val="single" w:sz="4" w:space="0" w:color="A6A6A6"/>
               <w:left w:val="single" w:sz="4" w:space="0" w:color="A6A6A6"/>
@@ -54401,7 +54411,7 @@
         </w:tc>
         <w:tc>
           <w:tcPr>
-            <w:tcW w:w="2331" w:type="dxa"/>
+            <w:tcW w:w="2869" w:type="dxa"/>
             <w:tcBorders>
               <w:top w:val="single" w:sz="4" w:space="0" w:color="A6A6A6"/>
               <w:left w:val="single" w:sz="4" w:space="0" w:color="A6A6A6"/>
@@ -54462,7 +54472,124 @@
         </w:tc>
         <w:tc>
           <w:tcPr>
-            <w:tcW w:w="1708" w:type="dxa"/>
+            <w:tcW w:w="1538" w:type="dxa"/>
+            <w:tcBorders>
+              <w:top w:val="single" w:sz="4" w:space="0" w:color="A6A6A6"/>
+              <w:left w:val="single" w:sz="4" w:space="0" w:color="A6A6A6"/>
+              <w:bottom w:val="single" w:sz="4" w:space="0" w:color="A6A6A6"/>
+              <w:right w:val="single" w:sz="4" w:space="0" w:color="A6A6A6"/>
+            </w:tcBorders>
+            <w:vAlign w:val="center"/>
+          </w:tcPr>
+          <w:p>
+            <w:pPr>
+              <w:pStyle w:val="Normal"/>
+              <w:spacing w:lineRule="auto" w:line="240" w:before="0" w:after="0"/>
+              <w:jc w:val="left"/>
+              <w:rPr/>
+            </w:pPr>
+            <w:r>
+              <w:rPr>
+                <w:rFonts w:eastAsia="Times New Roman" w:cs="Times New Roman"/>
+                <w:sz w:val="19"/>
+                <w:szCs w:val="19"/>
+              </w:rPr>
+              <w:t>sécurité</w:t>
+            </w:r>
+          </w:p>
+        </w:tc>
+        <w:tc>
+          <w:tcPr>
+            <w:tcW w:w="3359" w:type="dxa"/>
+            <w:tcBorders>
+              <w:top w:val="single" w:sz="4" w:space="0" w:color="A6A6A6"/>
+              <w:left w:val="single" w:sz="4" w:space="0" w:color="A6A6A6"/>
+              <w:bottom w:val="single" w:sz="4" w:space="0" w:color="A6A6A6"/>
+              <w:right w:val="single" w:sz="4" w:space="0" w:color="A6A6A6"/>
+            </w:tcBorders>
+            <w:vAlign w:val="center"/>
+          </w:tcPr>
+          <w:p>
+            <w:pPr>
+              <w:pStyle w:val="Normal"/>
+              <w:spacing w:lineRule="auto" w:line="240" w:before="0" w:after="0"/>
+              <w:jc w:val="left"/>
+              <w:rPr/>
+            </w:pPr>
+            <w:r>
+              <w:rPr>
+                <w:rFonts w:eastAsia="Times New Roman" w:cs="Times New Roman"/>
+                <w:sz w:val="19"/>
+                <w:szCs w:val="19"/>
+              </w:rPr>
+              <w:t>refus par défaut sans diffusion déclarée ; classement d'experts réservé aux managers dans l'assistant</w:t>
+            </w:r>
+          </w:p>
+        </w:tc>
+        <w:tc>
+          <w:tcPr>
+            <w:tcW w:w="2869" w:type="dxa"/>
+            <w:tcBorders>
+              <w:top w:val="single" w:sz="4" w:space="0" w:color="A6A6A6"/>
+              <w:left w:val="single" w:sz="4" w:space="0" w:color="A6A6A6"/>
+              <w:bottom w:val="single" w:sz="4" w:space="0" w:color="A6A6A6"/>
+              <w:right w:val="single" w:sz="4" w:space="0" w:color="A6A6A6"/>
+            </w:tcBorders>
+            <w:vAlign w:val="center"/>
+          </w:tcPr>
+          <w:p>
+            <w:pPr>
+              <w:pStyle w:val="Normal"/>
+              <w:spacing w:lineRule="auto" w:line="240" w:before="0" w:after="0"/>
+              <w:jc w:val="left"/>
+              <w:rPr/>
+            </w:pPr>
+            <w:r>
+              <w:rPr>
+                <w:rFonts w:eastAsia="Times New Roman" w:cs="Times New Roman"/>
+                <w:sz w:val="19"/>
+                <w:szCs w:val="19"/>
+              </w:rPr>
+              <w:t>revue de code, sans effet sur les mesures</w:t>
+            </w:r>
+          </w:p>
+        </w:tc>
+      </w:tr>
+      <w:tr>
+        <w:trPr>
+          <w:cantSplit w:val="true"/>
+        </w:trPr>
+        <w:tc>
+          <w:tcPr>
+            <w:tcW w:w="1020" w:type="dxa"/>
+            <w:tcBorders>
+              <w:top w:val="single" w:sz="4" w:space="0" w:color="A6A6A6"/>
+              <w:left w:val="single" w:sz="4" w:space="0" w:color="A6A6A6"/>
+              <w:bottom w:val="single" w:sz="4" w:space="0" w:color="A6A6A6"/>
+              <w:right w:val="single" w:sz="4" w:space="0" w:color="A6A6A6"/>
+            </w:tcBorders>
+            <w:vAlign w:val="center"/>
+          </w:tcPr>
+          <w:p>
+            <w:pPr>
+              <w:pStyle w:val="Normal"/>
+              <w:spacing w:lineRule="auto" w:line="240" w:before="0" w:after="0"/>
+              <w:jc w:val="left"/>
+              <w:rPr/>
+            </w:pPr>
+            <w:r>
+              <w:rPr>
+                <w:rFonts w:eastAsia="Times New Roman" w:cs="Times New Roman"/>
+                <w:sz w:val="19"/>
+                <w:szCs w:val="19"/>
+              </w:rPr>
+              <w:t>post-gel</w:t>
+            </w:r>
+          </w:p>
+        </w:tc>
+        <w:tc>
+          <w:tcPr>
+            <w:tcW w:w="1538" w:type="dxa"/>
             <w:tcBorders>
               <w:top w:val="single" w:sz="4" w:space="0" w:color="A6A6A6"/>
               <w:left w:val="single" w:sz="4" w:space="0" w:color="A6A6A6"/>
@@ -54490,7 +54617,7 @@
         </w:tc>
         <w:tc>
           <w:tcPr>
-            <w:tcW w:w="3727" w:type="dxa"/>
+            <w:tcW w:w="3359" w:type="dxa"/>
             <w:tcBorders>
               <w:top w:val="single" w:sz="4" w:space="0" w:color="A6A6A6"/>
               <w:left w:val="single" w:sz="4" w:space="0" w:color="A6A6A6"/>
@@ -54518,7 +54645,7 @@
         </w:tc>
         <w:tc>
           <w:tcPr>
-            <w:tcW w:w="2331" w:type="dxa"/>
+            <w:tcW w:w="2869" w:type="dxa"/>
             <w:tcBorders>
               <w:top w:val="single" w:sz="4" w:space="0" w:color="A6A6A6"/>
               <w:left w:val="single" w:sz="4" w:space="0" w:color="A6A6A6"/>

</xml_diff>